<commit_message>
docs: add complete docx user guides with screenshots and annotations for both works
</commit_message>
<xml_diff>
--- a/lab/lab-maya/perakitan-komputer/SIAP KIRIM/PANDUAN_PENGGUNAAN_DAN_DESKRIPSI_TEKNIS.docx
+++ b/lab/lab-maya/perakitan-komputer/SIAP KIRIM/PANDUAN_PENGGUNAAN_DAN_DESKRIPSI_TEKNIS.docx
@@ -2,55 +2,91 @@
 <file path=word/document.xml><?xml version="1.0" encoding="utf-8"?>
 <w:document xmlns:wpc="http://schemas.microsoft.com/office/word/2010/wordprocessingCanvas" xmlns:mo="http://schemas.microsoft.com/office/mac/office/2008/main" xmlns:mc="http://schemas.openxmlformats.org/markup-compatibility/2006" xmlns:mv="urn:schemas-microsoft-com:mac:vml" xmlns:o="urn:schemas-microsoft-com:office:office" xmlns:r="http://schemas.openxmlformats.org/officeDocument/2006/relationships" xmlns:m="http://schemas.openxmlformats.org/officeDocument/2006/math" xmlns:v="urn:schemas-microsoft-com:vml" xmlns:wp14="http://schemas.microsoft.com/office/word/2010/wordprocessingDrawing" xmlns:wp="http://schemas.openxmlformats.org/drawingml/2006/wordprocessingDrawing" xmlns:w10="urn:schemas-microsoft-com:office:word" xmlns:w="http://schemas.openxmlformats.org/wordprocessingml/2006/main" xmlns:w14="http://schemas.microsoft.com/office/word/2010/wordml" xmlns:wpg="http://schemas.microsoft.com/office/word/2010/wordprocessingGroup" xmlns:wpi="http://schemas.microsoft.com/office/word/2010/wordprocessingInk" xmlns:wne="http://schemas.microsoft.com/office/word/2006/wordml" xmlns:wps="http://schemas.microsoft.com/office/word/2010/wordprocessingShape" mc:Ignorable="w14 wp14">
   <w:body>
+    <w:tbl>
+      <w:tblPr>
+        <w:tblW w:type="auto" w:w="0"/>
+        <w:jc w:val="center"/>
+        <w:tblLook w:firstColumn="1" w:firstRow="1" w:lastColumn="0" w:lastRow="0" w:noHBand="0" w:noVBand="1" w:val="04A0"/>
+      </w:tblPr>
+      <w:tblGrid>
+        <w:gridCol w:w="9360"/>
+      </w:tblGrid>
+      <w:tr>
+        <w:tc>
+          <w:tcPr>
+            <w:tcW w:type="dxa" w:w="9360"/>
+            <w:shd w:fill="0F2744"/>
+            <w:tcMar>
+              <w:top w:w="240" w:type="dxa"/>
+              <w:bottom w:w="240" w:type="dxa"/>
+              <w:left w:w="240" w:type="dxa"/>
+              <w:right w:w="240" w:type="dxa"/>
+            </w:tcMar>
+          </w:tcPr>
+          <w:p>
+            <w:pPr>
+              <w:jc w:val="center"/>
+            </w:pPr>
+            <w:r>
+              <w:rPr>
+                <w:rFonts w:ascii="Arial" w:hAnsi="Arial"/>
+                <w:b/>
+                <w:color w:val="38BDF8"/>
+                <w:sz w:val="20"/>
+              </w:rPr>
+              <w:t>★ KATEGORI SAYEMBARA: LAB MAYA (FESTIVAL BIRU PUTIH 2026) ★</w:t>
+              <w:br/>
+            </w:r>
+            <w:r>
+              <w:rPr>
+                <w:rFonts w:ascii="Arial" w:hAnsi="Arial"/>
+                <w:b/>
+                <w:color w:val="FFFFFF"/>
+                <w:sz w:val="36"/>
+              </w:rPr>
+              <w:t>BUKU PANDUAN PENGGUNAAN &amp; DESKRIPSI TEKNIS</w:t>
+              <w:br/>
+              <w:t>(USER GUIDE)</w:t>
+              <w:br/>
+            </w:r>
+            <w:r>
+              <w:rPr>
+                <w:rFonts w:ascii="Arial" w:hAnsi="Arial"/>
+                <w:i/>
+                <w:color w:val="E2E8F0"/>
+                <w:sz w:val="22"/>
+              </w:rPr>
+              <w:t>LABORATORIUM MAYA SISTEM KOMPUTER:</w:t>
+              <w:br/>
+              <w:t>SIMULASI PERAKITAN PC, DIAGNOSTIK HARDWARE &amp; LOGIKA DIGITAL</w:t>
+            </w:r>
+          </w:p>
+        </w:tc>
+      </w:tr>
+    </w:tbl>
     <w:p>
       <w:pPr>
-        <w:jc w:val="center"/>
+        <w:spacing w:after="160"/>
+      </w:pPr>
+    </w:p>
+    <w:p>
+      <w:pPr>
+        <w:spacing w:after="80"/>
       </w:pPr>
       <w:r>
         <w:rPr>
           <w:rFonts w:ascii="Arial" w:hAnsi="Arial"/>
           <w:b/>
-          <w:color w:val="0284C7"/>
-          <w:sz w:val="19"/>
+          <w:color w:val="0F2744"/>
+          <w:sz w:val="22"/>
         </w:rPr>
-        <w:t>FESTIVAL BIRU PUTIH 2026 — DIREKTORAT SMP</w:t>
-        <w:br/>
-        <w:t>KEMENTERIAN PENDIDIKAN DASAR DAN MENENGAH</w:t>
-        <w:br/>
+        <w:t>IDENTITAS PENGEMBANG &amp; KARYA</w:t>
       </w:r>
-      <w:r>
-        <w:rPr>
-          <w:rFonts w:ascii="Arial" w:hAnsi="Arial"/>
-          <w:b/>
-          <w:color w:val="1E3A8A"/>
-          <w:sz w:val="28"/>
-        </w:rPr>
-        <w:t>PANDUAN PENGGUNAAN &amp; DESKRIPSI TEKNIS LABORATORIUM MAYA</w:t>
-        <w:br/>
-      </w:r>
-      <w:r>
-        <w:rPr>
-          <w:rFonts w:ascii="Arial" w:hAnsi="Arial"/>
-          <w:i/>
-          <w:color w:val="64748B"/>
-          <w:sz w:val="20"/>
-        </w:rPr>
-        <w:t>User Guide &amp; Technical Documentation — Festival Biru Putih 2026 (Juknis Bab V Hal. 24)</w:t>
-      </w:r>
-    </w:p>
-    <w:p>
-      <w:pPr>
-        <w:spacing w:after="240"/>
-        <w:pBdr>
-          <w:bottom w:val="single" w:sz="18" w:space="4" w:color="0F172A"/>
-        </w:pBdr>
-      </w:pPr>
     </w:p>
     <w:tbl>
       <w:tblPr>
         <w:tblW w:type="auto" w:w="0"/>
         <w:jc w:val="center"/>
-        <w:tblLayout w:type="fixed"/>
         <w:tblLook w:firstColumn="1" w:firstRow="1" w:lastColumn="0" w:lastRow="0" w:noHBand="0" w:noVBand="1" w:val="04A0"/>
       </w:tblPr>
       <w:tblGrid>
@@ -61,136 +97,48 @@
         <w:tc>
           <w:tcPr>
             <w:tcW w:type="dxa" w:w="3168"/>
-            <w:shd w:fill="F8FAFC"/>
             <w:tcMar>
-              <w:top w:w="80" w:type="dxa"/>
-              <w:bottom w:w="80" w:type="dxa"/>
-              <w:left w:w="120" w:type="dxa"/>
-              <w:right w:w="120" w:type="dxa"/>
+              <w:top w:w="60" w:type="dxa"/>
+              <w:bottom w:w="60" w:type="dxa"/>
+              <w:left w:w="100" w:type="dxa"/>
+              <w:right w:w="100" w:type="dxa"/>
             </w:tcMar>
+            <w:shd w:fill="F1F5F9"/>
           </w:tcPr>
           <w:p>
+            <w:pPr>
+              <w:spacing w:after="40" w:before="40"/>
+            </w:pPr>
             <w:r>
               <w:rPr>
                 <w:rFonts w:ascii="Arial" w:hAnsi="Arial"/>
                 <w:b/>
-                <w:color w:val="0F172A"/>
+                <w:color w:val="1E293B"/>
                 <w:sz w:val="19"/>
               </w:rPr>
-              <w:t>Judul Karya</w:t>
+              <w:t>Nama Lengkap</w:t>
             </w:r>
           </w:p>
         </w:tc>
         <w:tc>
           <w:tcPr>
-            <w:tcW w:type="dxa" w:w="6480"/>
-            <w:shd w:fill="FFFFFF"/>
+            <w:tcW w:type="dxa" w:w="6192"/>
             <w:tcMar>
-              <w:top w:w="80" w:type="dxa"/>
-              <w:bottom w:w="80" w:type="dxa"/>
-              <w:left w:w="120" w:type="dxa"/>
-              <w:right w:w="120" w:type="dxa"/>
+              <w:top w:w="60" w:type="dxa"/>
+              <w:bottom w:w="60" w:type="dxa"/>
+              <w:left w:w="100" w:type="dxa"/>
+              <w:right w:w="100" w:type="dxa"/>
             </w:tcMar>
+            <w:shd w:fill="F1F5F9"/>
           </w:tcPr>
           <w:p>
+            <w:pPr>
+              <w:spacing w:after="40" w:before="40"/>
+            </w:pPr>
             <w:r>
               <w:rPr>
                 <w:rFonts w:ascii="Arial" w:hAnsi="Arial"/>
-                <w:color w:val="0F172A"/>
-                <w:sz w:val="19"/>
-              </w:rPr>
-              <w:t>Lab Maya Sistem Komputer: Perakitan PC &amp; Logika Digital</w:t>
-            </w:r>
-          </w:p>
-        </w:tc>
-      </w:tr>
-      <w:tr>
-        <w:tc>
-          <w:tcPr>
-            <w:tcW w:type="dxa" w:w="3168"/>
-            <w:shd w:fill="F8FAFC"/>
-            <w:tcMar>
-              <w:top w:w="80" w:type="dxa"/>
-              <w:bottom w:w="80" w:type="dxa"/>
-              <w:left w:w="120" w:type="dxa"/>
-              <w:right w:w="120" w:type="dxa"/>
-            </w:tcMar>
-          </w:tcPr>
-          <w:p>
-            <w:r>
-              <w:rPr>
-                <w:rFonts w:ascii="Arial" w:hAnsi="Arial"/>
-                <w:b/>
-                <w:color w:val="0F172A"/>
-                <w:sz w:val="19"/>
-              </w:rPr>
-              <w:t>Kategori Sayembara</w:t>
-            </w:r>
-          </w:p>
-        </w:tc>
-        <w:tc>
-          <w:tcPr>
-            <w:tcW w:type="dxa" w:w="6480"/>
-            <w:shd w:fill="FAFAFA"/>
-            <w:tcMar>
-              <w:top w:w="80" w:type="dxa"/>
-              <w:bottom w:w="80" w:type="dxa"/>
-              <w:left w:w="120" w:type="dxa"/>
-              <w:right w:w="120" w:type="dxa"/>
-            </w:tcMar>
-          </w:tcPr>
-          <w:p>
-            <w:r>
-              <w:rPr>
-                <w:rFonts w:ascii="Arial" w:hAnsi="Arial"/>
-                <w:color w:val="0F172A"/>
-                <w:sz w:val="19"/>
-              </w:rPr>
-              <w:t>Lab Maya (Bab V Juknis Festival Biru Putih 2026)</w:t>
-            </w:r>
-          </w:p>
-        </w:tc>
-      </w:tr>
-      <w:tr>
-        <w:tc>
-          <w:tcPr>
-            <w:tcW w:type="dxa" w:w="3168"/>
-            <w:shd w:fill="F8FAFC"/>
-            <w:tcMar>
-              <w:top w:w="80" w:type="dxa"/>
-              <w:bottom w:w="80" w:type="dxa"/>
-              <w:left w:w="120" w:type="dxa"/>
-              <w:right w:w="120" w:type="dxa"/>
-            </w:tcMar>
-          </w:tcPr>
-          <w:p>
-            <w:r>
-              <w:rPr>
-                <w:rFonts w:ascii="Arial" w:hAnsi="Arial"/>
-                <w:b/>
-                <w:color w:val="0F172A"/>
-                <w:sz w:val="19"/>
-              </w:rPr>
-              <w:t>Nama Pengembang</w:t>
-            </w:r>
-          </w:p>
-        </w:tc>
-        <w:tc>
-          <w:tcPr>
-            <w:tcW w:type="dxa" w:w="6480"/>
-            <w:shd w:fill="FFFFFF"/>
-            <w:tcMar>
-              <w:top w:w="80" w:type="dxa"/>
-              <w:bottom w:w="80" w:type="dxa"/>
-              <w:left w:w="120" w:type="dxa"/>
-              <w:right w:w="120" w:type="dxa"/>
-            </w:tcMar>
-          </w:tcPr>
-          <w:p>
-            <w:r>
-              <w:rPr>
-                <w:rFonts w:ascii="Arial" w:hAnsi="Arial"/>
-                <w:color w:val="0F172A"/>
+                <w:color w:val="334155"/>
                 <w:sz w:val="19"/>
               </w:rPr>
               <w:t>Ach. Chanifuddin Fanani, S.Pd.</w:t>
@@ -202,45 +150,51 @@
         <w:tc>
           <w:tcPr>
             <w:tcW w:type="dxa" w:w="3168"/>
-            <w:shd w:fill="F8FAFC"/>
             <w:tcMar>
-              <w:top w:w="80" w:type="dxa"/>
-              <w:bottom w:w="80" w:type="dxa"/>
-              <w:left w:w="120" w:type="dxa"/>
-              <w:right w:w="120" w:type="dxa"/>
+              <w:top w:w="60" w:type="dxa"/>
+              <w:bottom w:w="60" w:type="dxa"/>
+              <w:left w:w="100" w:type="dxa"/>
+              <w:right w:w="100" w:type="dxa"/>
             </w:tcMar>
+            <w:shd w:fill="FFFFFF"/>
           </w:tcPr>
           <w:p>
+            <w:pPr>
+              <w:spacing w:after="40" w:before="40"/>
+            </w:pPr>
             <w:r>
               <w:rPr>
                 <w:rFonts w:ascii="Arial" w:hAnsi="Arial"/>
                 <w:b/>
-                <w:color w:val="0F172A"/>
+                <w:color w:val="1E293B"/>
                 <w:sz w:val="19"/>
               </w:rPr>
-              <w:t>Unit Kerja</w:t>
+              <w:t>NIP</w:t>
             </w:r>
           </w:p>
         </w:tc>
         <w:tc>
           <w:tcPr>
-            <w:tcW w:type="dxa" w:w="6480"/>
-            <w:shd w:fill="FAFAFA"/>
+            <w:tcW w:type="dxa" w:w="6192"/>
             <w:tcMar>
-              <w:top w:w="80" w:type="dxa"/>
-              <w:bottom w:w="80" w:type="dxa"/>
-              <w:left w:w="120" w:type="dxa"/>
-              <w:right w:w="120" w:type="dxa"/>
+              <w:top w:w="60" w:type="dxa"/>
+              <w:bottom w:w="60" w:type="dxa"/>
+              <w:left w:w="100" w:type="dxa"/>
+              <w:right w:w="100" w:type="dxa"/>
             </w:tcMar>
+            <w:shd w:fill="FFFFFF"/>
           </w:tcPr>
           <w:p>
+            <w:pPr>
+              <w:spacing w:after="40" w:before="40"/>
+            </w:pPr>
             <w:r>
               <w:rPr>
                 <w:rFonts w:ascii="Arial" w:hAnsi="Arial"/>
-                <w:color w:val="0F172A"/>
+                <w:color w:val="334155"/>
                 <w:sz w:val="19"/>
               </w:rPr>
-              <w:t>SMP Negeri 2 Lamongan, Jawa Timur</w:t>
+              <w:t>199108262020121007</w:t>
             </w:r>
           </w:p>
         </w:tc>
@@ -249,45 +203,51 @@
         <w:tc>
           <w:tcPr>
             <w:tcW w:type="dxa" w:w="3168"/>
-            <w:shd w:fill="F8FAFC"/>
             <w:tcMar>
-              <w:top w:w="80" w:type="dxa"/>
-              <w:bottom w:w="80" w:type="dxa"/>
-              <w:left w:w="120" w:type="dxa"/>
-              <w:right w:w="120" w:type="dxa"/>
+              <w:top w:w="60" w:type="dxa"/>
+              <w:bottom w:w="60" w:type="dxa"/>
+              <w:left w:w="100" w:type="dxa"/>
+              <w:right w:w="100" w:type="dxa"/>
             </w:tcMar>
+            <w:shd w:fill="F1F5F9"/>
           </w:tcPr>
           <w:p>
+            <w:pPr>
+              <w:spacing w:after="40" w:before="40"/>
+            </w:pPr>
             <w:r>
               <w:rPr>
                 <w:rFonts w:ascii="Arial" w:hAnsi="Arial"/>
                 <w:b/>
-                <w:color w:val="0F172A"/>
+                <w:color w:val="1E293B"/>
                 <w:sz w:val="19"/>
               </w:rPr>
-              <w:t>Sasaran Peserta Didik</w:t>
+              <w:t>NUPTK</w:t>
             </w:r>
           </w:p>
         </w:tc>
         <w:tc>
           <w:tcPr>
-            <w:tcW w:type="dxa" w:w="6480"/>
-            <w:shd w:fill="FFFFFF"/>
+            <w:tcW w:type="dxa" w:w="6192"/>
             <w:tcMar>
-              <w:top w:w="80" w:type="dxa"/>
-              <w:bottom w:w="80" w:type="dxa"/>
-              <w:left w:w="120" w:type="dxa"/>
-              <w:right w:w="120" w:type="dxa"/>
+              <w:top w:w="60" w:type="dxa"/>
+              <w:bottom w:w="60" w:type="dxa"/>
+              <w:left w:w="100" w:type="dxa"/>
+              <w:right w:w="100" w:type="dxa"/>
             </w:tcMar>
+            <w:shd w:fill="F1F5F9"/>
           </w:tcPr>
           <w:p>
+            <w:pPr>
+              <w:spacing w:after="40" w:before="40"/>
+            </w:pPr>
             <w:r>
               <w:rPr>
                 <w:rFonts w:ascii="Arial" w:hAnsi="Arial"/>
-                <w:color w:val="0F172A"/>
+                <w:color w:val="334155"/>
                 <w:sz w:val="19"/>
               </w:rPr>
-              <w:t>Mata Pelajaran Informatika Jenjang SMP — Fase D (Kelas VII/VIII/IX)</w:t>
+              <w:t>9158769670130183</w:t>
             </w:r>
           </w:p>
         </w:tc>
@@ -296,45 +256,51 @@
         <w:tc>
           <w:tcPr>
             <w:tcW w:type="dxa" w:w="3168"/>
-            <w:shd w:fill="F8FAFC"/>
             <w:tcMar>
-              <w:top w:w="80" w:type="dxa"/>
-              <w:bottom w:w="80" w:type="dxa"/>
-              <w:left w:w="120" w:type="dxa"/>
-              <w:right w:w="120" w:type="dxa"/>
+              <w:top w:w="60" w:type="dxa"/>
+              <w:bottom w:w="60" w:type="dxa"/>
+              <w:left w:w="100" w:type="dxa"/>
+              <w:right w:w="100" w:type="dxa"/>
             </w:tcMar>
+            <w:shd w:fill="FFFFFF"/>
           </w:tcPr>
           <w:p>
+            <w:pPr>
+              <w:spacing w:after="40" w:before="40"/>
+            </w:pPr>
             <w:r>
               <w:rPr>
                 <w:rFonts w:ascii="Arial" w:hAnsi="Arial"/>
                 <w:b/>
-                <w:color w:val="0F172A"/>
+                <w:color w:val="1E293B"/>
                 <w:sz w:val="19"/>
               </w:rPr>
-              <w:t>Tautan Akses Online</w:t>
+              <w:t>NIK</w:t>
             </w:r>
           </w:p>
         </w:tc>
         <w:tc>
           <w:tcPr>
-            <w:tcW w:type="dxa" w:w="6480"/>
-            <w:shd w:fill="FAFAFA"/>
+            <w:tcW w:type="dxa" w:w="6192"/>
             <w:tcMar>
-              <w:top w:w="80" w:type="dxa"/>
-              <w:bottom w:w="80" w:type="dxa"/>
-              <w:left w:w="120" w:type="dxa"/>
-              <w:right w:w="120" w:type="dxa"/>
+              <w:top w:w="60" w:type="dxa"/>
+              <w:bottom w:w="60" w:type="dxa"/>
+              <w:left w:w="100" w:type="dxa"/>
+              <w:right w:w="100" w:type="dxa"/>
             </w:tcMar>
+            <w:shd w:fill="FFFFFF"/>
           </w:tcPr>
           <w:p>
+            <w:pPr>
+              <w:spacing w:after="40" w:before="40"/>
+            </w:pPr>
             <w:r>
               <w:rPr>
                 <w:rFonts w:ascii="Arial" w:hAnsi="Arial"/>
-                <w:color w:val="0F172A"/>
+                <w:color w:val="334155"/>
                 <w:sz w:val="19"/>
               </w:rPr>
-              <w:t>https://fanani.my.id/lab/lab-maya/perakitan-komputer/index.html</w:t>
+              <w:t>3524162608910001</w:t>
             </w:r>
           </w:p>
         </w:tc>
@@ -343,12 +309,1014 @@
         <w:tc>
           <w:tcPr>
             <w:tcW w:type="dxa" w:w="3168"/>
-            <w:shd w:fill="F8FAFC"/>
             <w:tcMar>
-              <w:top w:w="80" w:type="dxa"/>
-              <w:bottom w:w="80" w:type="dxa"/>
-              <w:left w:w="120" w:type="dxa"/>
-              <w:right w:w="120" w:type="dxa"/>
+              <w:top w:w="60" w:type="dxa"/>
+              <w:bottom w:w="60" w:type="dxa"/>
+              <w:left w:w="100" w:type="dxa"/>
+              <w:right w:w="100" w:type="dxa"/>
+            </w:tcMar>
+            <w:shd w:fill="F1F5F9"/>
+          </w:tcPr>
+          <w:p>
+            <w:pPr>
+              <w:spacing w:after="40" w:before="40"/>
+            </w:pPr>
+            <w:r>
+              <w:rPr>
+                <w:rFonts w:ascii="Arial" w:hAnsi="Arial"/>
+                <w:b/>
+                <w:color w:val="1E293B"/>
+                <w:sz w:val="19"/>
+              </w:rPr>
+              <w:t>Instansi / Unit Kerja</w:t>
+            </w:r>
+          </w:p>
+        </w:tc>
+        <w:tc>
+          <w:tcPr>
+            <w:tcW w:type="dxa" w:w="6192"/>
+            <w:tcMar>
+              <w:top w:w="60" w:type="dxa"/>
+              <w:bottom w:w="60" w:type="dxa"/>
+              <w:left w:w="100" w:type="dxa"/>
+              <w:right w:w="100" w:type="dxa"/>
+            </w:tcMar>
+            <w:shd w:fill="F1F5F9"/>
+          </w:tcPr>
+          <w:p>
+            <w:pPr>
+              <w:spacing w:after="40" w:before="40"/>
+            </w:pPr>
+            <w:r>
+              <w:rPr>
+                <w:rFonts w:ascii="Arial" w:hAnsi="Arial"/>
+                <w:color w:val="334155"/>
+                <w:sz w:val="19"/>
+              </w:rPr>
+              <w:t>SMP Negeri 2 Lamongan</w:t>
+            </w:r>
+          </w:p>
+        </w:tc>
+      </w:tr>
+      <w:tr>
+        <w:tc>
+          <w:tcPr>
+            <w:tcW w:type="dxa" w:w="3168"/>
+            <w:tcMar>
+              <w:top w:w="60" w:type="dxa"/>
+              <w:bottom w:w="60" w:type="dxa"/>
+              <w:left w:w="100" w:type="dxa"/>
+              <w:right w:w="100" w:type="dxa"/>
+            </w:tcMar>
+            <w:shd w:fill="FFFFFF"/>
+          </w:tcPr>
+          <w:p>
+            <w:pPr>
+              <w:spacing w:after="40" w:before="40"/>
+            </w:pPr>
+            <w:r>
+              <w:rPr>
+                <w:rFonts w:ascii="Arial" w:hAnsi="Arial"/>
+                <w:b/>
+                <w:color w:val="1E293B"/>
+                <w:sz w:val="19"/>
+              </w:rPr>
+              <w:t>Kabupaten / Provinsi</w:t>
+            </w:r>
+          </w:p>
+        </w:tc>
+        <w:tc>
+          <w:tcPr>
+            <w:tcW w:type="dxa" w:w="6192"/>
+            <w:tcMar>
+              <w:top w:w="60" w:type="dxa"/>
+              <w:bottom w:w="60" w:type="dxa"/>
+              <w:left w:w="100" w:type="dxa"/>
+              <w:right w:w="100" w:type="dxa"/>
+            </w:tcMar>
+            <w:shd w:fill="FFFFFF"/>
+          </w:tcPr>
+          <w:p>
+            <w:pPr>
+              <w:spacing w:after="40" w:before="40"/>
+            </w:pPr>
+            <w:r>
+              <w:rPr>
+                <w:rFonts w:ascii="Arial" w:hAnsi="Arial"/>
+                <w:color w:val="334155"/>
+                <w:sz w:val="19"/>
+              </w:rPr>
+              <w:t>Kabupaten Lamongan, Jawa Timur</w:t>
+            </w:r>
+          </w:p>
+        </w:tc>
+      </w:tr>
+      <w:tr>
+        <w:tc>
+          <w:tcPr>
+            <w:tcW w:type="dxa" w:w="3168"/>
+            <w:tcMar>
+              <w:top w:w="60" w:type="dxa"/>
+              <w:bottom w:w="60" w:type="dxa"/>
+              <w:left w:w="100" w:type="dxa"/>
+              <w:right w:w="100" w:type="dxa"/>
+            </w:tcMar>
+            <w:shd w:fill="F1F5F9"/>
+          </w:tcPr>
+          <w:p>
+            <w:pPr>
+              <w:spacing w:after="40" w:before="40"/>
+            </w:pPr>
+            <w:r>
+              <w:rPr>
+                <w:rFonts w:ascii="Arial" w:hAnsi="Arial"/>
+                <w:b/>
+                <w:color w:val="1E293B"/>
+                <w:sz w:val="19"/>
+              </w:rPr>
+              <w:t>No. Telepon / WhatsApp</w:t>
+            </w:r>
+          </w:p>
+        </w:tc>
+        <w:tc>
+          <w:tcPr>
+            <w:tcW w:type="dxa" w:w="6192"/>
+            <w:tcMar>
+              <w:top w:w="60" w:type="dxa"/>
+              <w:bottom w:w="60" w:type="dxa"/>
+              <w:left w:w="100" w:type="dxa"/>
+              <w:right w:w="100" w:type="dxa"/>
+            </w:tcMar>
+            <w:shd w:fill="F1F5F9"/>
+          </w:tcPr>
+          <w:p>
+            <w:pPr>
+              <w:spacing w:after="40" w:before="40"/>
+            </w:pPr>
+            <w:r>
+              <w:rPr>
+                <w:rFonts w:ascii="Arial" w:hAnsi="Arial"/>
+                <w:color w:val="334155"/>
+                <w:sz w:val="19"/>
+              </w:rPr>
+              <w:t>08158885508</w:t>
+            </w:r>
+          </w:p>
+        </w:tc>
+      </w:tr>
+      <w:tr>
+        <w:tc>
+          <w:tcPr>
+            <w:tcW w:type="dxa" w:w="3168"/>
+            <w:tcMar>
+              <w:top w:w="60" w:type="dxa"/>
+              <w:bottom w:w="60" w:type="dxa"/>
+              <w:left w:w="100" w:type="dxa"/>
+              <w:right w:w="100" w:type="dxa"/>
+            </w:tcMar>
+            <w:shd w:fill="FFFFFF"/>
+          </w:tcPr>
+          <w:p>
+            <w:pPr>
+              <w:spacing w:after="40" w:before="40"/>
+            </w:pPr>
+            <w:r>
+              <w:rPr>
+                <w:rFonts w:ascii="Arial" w:hAnsi="Arial"/>
+                <w:b/>
+                <w:color w:val="1E293B"/>
+                <w:sz w:val="19"/>
+              </w:rPr>
+              <w:t>Alamat Surel (Email)</w:t>
+            </w:r>
+          </w:p>
+        </w:tc>
+        <w:tc>
+          <w:tcPr>
+            <w:tcW w:type="dxa" w:w="6192"/>
+            <w:tcMar>
+              <w:top w:w="60" w:type="dxa"/>
+              <w:bottom w:w="60" w:type="dxa"/>
+              <w:left w:w="100" w:type="dxa"/>
+              <w:right w:w="100" w:type="dxa"/>
+            </w:tcMar>
+            <w:shd w:fill="FFFFFF"/>
+          </w:tcPr>
+          <w:p>
+            <w:pPr>
+              <w:spacing w:after="40" w:before="40"/>
+            </w:pPr>
+            <w:r>
+              <w:rPr>
+                <w:rFonts w:ascii="Arial" w:hAnsi="Arial"/>
+                <w:color w:val="334155"/>
+                <w:sz w:val="19"/>
+              </w:rPr>
+              <w:t>chanifuddin@gmail.com</w:t>
+            </w:r>
+          </w:p>
+        </w:tc>
+      </w:tr>
+      <w:tr>
+        <w:tc>
+          <w:tcPr>
+            <w:tcW w:type="dxa" w:w="3168"/>
+            <w:tcMar>
+              <w:top w:w="60" w:type="dxa"/>
+              <w:bottom w:w="60" w:type="dxa"/>
+              <w:left w:w="100" w:type="dxa"/>
+              <w:right w:w="100" w:type="dxa"/>
+            </w:tcMar>
+            <w:shd w:fill="F1F5F9"/>
+          </w:tcPr>
+          <w:p>
+            <w:pPr>
+              <w:spacing w:after="40" w:before="40"/>
+            </w:pPr>
+            <w:r>
+              <w:rPr>
+                <w:rFonts w:ascii="Arial" w:hAnsi="Arial"/>
+                <w:b/>
+                <w:color w:val="1E293B"/>
+                <w:sz w:val="19"/>
+              </w:rPr>
+              <w:t>Portofolio Web</w:t>
+            </w:r>
+          </w:p>
+        </w:tc>
+        <w:tc>
+          <w:tcPr>
+            <w:tcW w:type="dxa" w:w="6192"/>
+            <w:tcMar>
+              <w:top w:w="60" w:type="dxa"/>
+              <w:bottom w:w="60" w:type="dxa"/>
+              <w:left w:w="100" w:type="dxa"/>
+              <w:right w:w="100" w:type="dxa"/>
+            </w:tcMar>
+            <w:shd w:fill="F1F5F9"/>
+          </w:tcPr>
+          <w:p>
+            <w:pPr>
+              <w:spacing w:after="40" w:before="40"/>
+            </w:pPr>
+            <w:r>
+              <w:rPr>
+                <w:rFonts w:ascii="Arial" w:hAnsi="Arial"/>
+                <w:color w:val="334155"/>
+                <w:sz w:val="19"/>
+              </w:rPr>
+              <w:t>https://fanani.my.id</w:t>
+            </w:r>
+          </w:p>
+        </w:tc>
+      </w:tr>
+      <w:tr>
+        <w:tc>
+          <w:tcPr>
+            <w:tcW w:type="dxa" w:w="3168"/>
+            <w:tcMar>
+              <w:top w:w="60" w:type="dxa"/>
+              <w:bottom w:w="60" w:type="dxa"/>
+              <w:left w:w="100" w:type="dxa"/>
+              <w:right w:w="100" w:type="dxa"/>
+            </w:tcMar>
+            <w:shd w:fill="FFFFFF"/>
+          </w:tcPr>
+          <w:p>
+            <w:pPr>
+              <w:spacing w:after="40" w:before="40"/>
+            </w:pPr>
+            <w:r>
+              <w:rPr>
+                <w:rFonts w:ascii="Arial" w:hAnsi="Arial"/>
+                <w:b/>
+                <w:color w:val="1E293B"/>
+                <w:sz w:val="19"/>
+              </w:rPr>
+              <w:t>Sasaran Pengguna</w:t>
+            </w:r>
+          </w:p>
+        </w:tc>
+        <w:tc>
+          <w:tcPr>
+            <w:tcW w:type="dxa" w:w="6192"/>
+            <w:tcMar>
+              <w:top w:w="60" w:type="dxa"/>
+              <w:bottom w:w="60" w:type="dxa"/>
+              <w:left w:w="100" w:type="dxa"/>
+              <w:right w:w="100" w:type="dxa"/>
+            </w:tcMar>
+            <w:shd w:fill="FFFFFF"/>
+          </w:tcPr>
+          <w:p>
+            <w:pPr>
+              <w:spacing w:after="40" w:before="40"/>
+            </w:pPr>
+            <w:r>
+              <w:rPr>
+                <w:rFonts w:ascii="Arial" w:hAnsi="Arial"/>
+                <w:color w:val="334155"/>
+                <w:sz w:val="19"/>
+              </w:rPr>
+              <w:t>Peserta Didik SMP Fase D (Kelas VII/VIII/IX)</w:t>
+            </w:r>
+          </w:p>
+        </w:tc>
+      </w:tr>
+    </w:tbl>
+    <w:p>
+      <w:pPr>
+        <w:spacing w:after="240"/>
+      </w:pPr>
+    </w:p>
+    <w:p>
+      <w:pPr>
+        <w:keepNext/>
+        <w:spacing w:before="280" w:after="80"/>
+      </w:pPr>
+      <w:r>
+        <w:rPr>
+          <w:rFonts w:ascii="Arial" w:hAnsi="Arial"/>
+          <w:b/>
+          <w:color w:val="0F2744"/>
+          <w:sz w:val="26"/>
+        </w:rPr>
+        <w:t>BAB I. LATAR BELAKANG &amp; RASIONAL INOVASI</w:t>
+      </w:r>
+    </w:p>
+    <w:p>
+      <w:pPr>
+        <w:spacing w:after="80" w:line="276" w:lineRule="auto"/>
+      </w:pPr>
+      <w:r>
+        <w:rPr>
+          <w:rFonts w:ascii="Arial" w:hAnsi="Arial"/>
+          <w:b/>
+          <w:color w:val="0F2744"/>
+          <w:sz w:val="19"/>
+        </w:rPr>
+        <w:t xml:space="preserve">1.1 Latar Belakang Masalah: </w:t>
+      </w:r>
+      <w:r>
+        <w:rPr>
+          <w:rFonts w:ascii="Arial" w:hAnsi="Arial"/>
+          <w:color w:val="1E293B"/>
+          <w:sz w:val="19"/>
+        </w:rPr>
+        <w:t>Pembelajaran Informatika pada jenjang Sekolah Menengah Pertama (SMP), khususnya pada elemen Sistem Komputer (SK), sering kali dihadapkan pada kendala mendasar terkait ketersediaan dan keamanan sarana praktikum. Perangkat keras komputer fisik (hardware) merupakan aset laboratorium yang mahal dan sangat rentan terhadap kerusakan fisik elektro-mekanik. Komponen sensitif seperti pin soket prosesor LGA, kepingan memori RAM DDR4 yang rentan terhadap lucutan elektrostatik (Electrostatic Discharge / ESD), serta risiko hubungan arus pendek daya (short circuit) menyebabkan guru enggan atau tidak mengizinkan peserta didik untuk membongkar-pasang unit komputer fisik yang berfungsi.</w:t>
+      </w:r>
+    </w:p>
+    <w:p>
+      <w:pPr>
+        <w:spacing w:after="80" w:line="276" w:lineRule="auto"/>
+      </w:pPr>
+      <w:r>
+        <w:rPr>
+          <w:rFonts w:ascii="Arial" w:hAnsi="Arial"/>
+          <w:color w:val="1E293B"/>
+          <w:sz w:val="19"/>
+        </w:rPr>
+        <w:t>Dampaknya, pembelajaran materi perakitan komputer dan arsitektur sistem kerap tereduksi menjadi sekadar ceramah teoritis satu arah atau penayangan video pasif. Peserta didik kehilangan kesempatan emas untuk merasakan pengalaman langsung (hands-on experience), mengasah keterampilan pemecahan masalah (troubleshooting), serta membangun intuisi logis mengenai kompatibilitas perangkat keras dan sistem booting komputer.</w:t>
+      </w:r>
+    </w:p>
+    <w:p>
+      <w:pPr>
+        <w:spacing w:after="80" w:line="276" w:lineRule="auto"/>
+      </w:pPr>
+      <w:r>
+        <w:rPr>
+          <w:rFonts w:ascii="Arial" w:hAnsi="Arial"/>
+          <w:b/>
+          <w:color w:val="0F2744"/>
+          <w:sz w:val="19"/>
+        </w:rPr>
+        <w:t xml:space="preserve">1.2 Solusi Inovasi Berbasis Lab Maya: </w:t>
+      </w:r>
+      <w:r>
+        <w:rPr>
+          <w:rFonts w:ascii="Arial" w:hAnsi="Arial"/>
+          <w:color w:val="1E293B"/>
+          <w:sz w:val="19"/>
+        </w:rPr>
+        <w:t>Menjawab tantangan tersebut, dikembangkan karya 'Lab Maya Sistem Komputer: Perakitan PC, Diagnostik Hardware &amp; Logika Digital'. Media ini dirancang sebagai laboratorium virtual berbasis peramban (Single Page Application) yang menyediakan representasi interaktif, presisi, dan aman dari arsitektur komputer modern. Peserta didik dapat bereksperimen membongkar dan merakit PC secara virtual, menguji skenario inkompatibilitas komponen tanpa risiko kerusakan fisik, menyaksikan proses booting BIOS dan Power-On Self-Test (POST) secara visual-auditori, hingga menjelajahi logika digital abstrak (bit biner, pencampuran warna RGB 24-bit, dan gerbang logika).</w:t>
+      </w:r>
+    </w:p>
+    <w:tbl>
+      <w:tblPr>
+        <w:tblW w:type="auto" w:w="0"/>
+        <w:jc w:val="center"/>
+        <w:tblLook w:firstColumn="1" w:firstRow="1" w:lastColumn="0" w:lastRow="0" w:noHBand="0" w:noVBand="1" w:val="04A0"/>
+      </w:tblPr>
+      <w:tblGrid>
+        <w:gridCol w:w="9360"/>
+      </w:tblGrid>
+      <w:tr>
+        <w:tc>
+          <w:tcPr>
+            <w:tcW w:type="dxa" w:w="9360"/>
+            <w:shd w:fill="F0F9FF"/>
+            <w:tcMar>
+              <w:top w:w="100" w:type="dxa"/>
+              <w:bottom w:w="100" w:type="dxa"/>
+              <w:left w:w="150" w:type="dxa"/>
+              <w:right w:w="150" w:type="dxa"/>
+            </w:tcMar>
+          </w:tcPr>
+          <w:p>
+            <w:pPr>
+              <w:spacing w:after="40" w:line="276" w:lineRule="auto"/>
+            </w:pPr>
+            <w:r>
+              <w:rPr>
+                <w:rFonts w:ascii="Arial" w:hAnsi="Arial"/>
+                <w:b/>
+                <w:color w:val="0369A1"/>
+                <w:sz w:val="19"/>
+              </w:rPr>
+              <w:t xml:space="preserve">📌 VISI PEMBELAJARAN: </w:t>
+            </w:r>
+            <w:r>
+              <w:rPr>
+                <w:rFonts w:ascii="Arial" w:hAnsi="Arial"/>
+                <w:color w:val="0C4A6E"/>
+                <w:sz w:val="19"/>
+              </w:rPr>
+              <w:t>Lab Maya ini hadir sebagai jembatan pemerataan mutu pendidikan digital, memungkinkan setiap sekolah di seluruh pelosok Indonesia menyelenggarakan praktikum perakitan komputer standar industri secara gratis, aman, dan 100% luring (offline).</w:t>
+            </w:r>
+          </w:p>
+        </w:tc>
+      </w:tr>
+    </w:tbl>
+    <w:p>
+      <w:pPr>
+        <w:spacing w:after="80"/>
+      </w:pPr>
+    </w:p>
+    <w:p>
+      <w:pPr>
+        <w:keepNext/>
+        <w:spacing w:before="280" w:after="80"/>
+      </w:pPr>
+      <w:r>
+        <w:rPr>
+          <w:rFonts w:ascii="Arial" w:hAnsi="Arial"/>
+          <w:b/>
+          <w:color w:val="0F2744"/>
+          <w:sz w:val="26"/>
+        </w:rPr>
+        <w:t>BAB II. PEMETAAN KURIKULUM &amp; CAPAIAN PEMBELAJARAN</w:t>
+      </w:r>
+    </w:p>
+    <w:p>
+      <w:pPr>
+        <w:spacing w:after="80" w:line="276" w:lineRule="auto"/>
+      </w:pPr>
+      <w:r>
+        <w:rPr>
+          <w:rFonts w:ascii="Arial" w:hAnsi="Arial"/>
+          <w:color w:val="1E293B"/>
+          <w:sz w:val="19"/>
+        </w:rPr>
+        <w:t>Karya ini dikembangkan dengan rujukan ketat pada Keputusan Kepala BSKAP Kemendikbudristek No. 032/H/KR/2024 tentang Capaian Pembelajaran pada Pendidikan Anak Usia Dini, Jenjang Pendidikan Dasar, dan Jenjang Pendidikan Menengah.</w:t>
+      </w:r>
+    </w:p>
+    <w:p>
+      <w:pPr>
+        <w:keepNext/>
+        <w:spacing w:before="200" w:after="60"/>
+      </w:pPr>
+      <w:r>
+        <w:rPr>
+          <w:rFonts w:ascii="Arial" w:hAnsi="Arial"/>
+          <w:b/>
+          <w:color w:val="0284C7"/>
+          <w:sz w:val="22"/>
+        </w:rPr>
+        <w:t>2.1 Capaian Pembelajaran (Fase D — Elemen Sistem Komputer)</w:t>
+      </w:r>
+    </w:p>
+    <w:p>
+      <w:pPr>
+        <w:spacing w:after="80" w:line="276" w:lineRule="auto"/>
+      </w:pPr>
+      <w:r>
+        <w:rPr>
+          <w:rFonts w:ascii="Arial" w:hAnsi="Arial"/>
+          <w:color w:val="1E293B"/>
+          <w:sz w:val="19"/>
+        </w:rPr>
+        <w:t>“Pada akhir fase D, peserta didik mampu mendeskripsikan komponen, fungsi, dan cara kerja komputer yang membentuk sebuah sistem komputasi, serta menjelaskan proses dan penggunaan kodifikasi data (biner, warna RGB) dalam sistem komputer.”</w:t>
+      </w:r>
+    </w:p>
+    <w:p>
+      <w:pPr>
+        <w:keepNext/>
+        <w:spacing w:before="200" w:after="60"/>
+      </w:pPr>
+      <w:r>
+        <w:rPr>
+          <w:rFonts w:ascii="Arial" w:hAnsi="Arial"/>
+          <w:b/>
+          <w:color w:val="0284C7"/>
+          <w:sz w:val="22"/>
+        </w:rPr>
+        <w:t>2.2 Tujuan Pembelajaran (TP) &amp; Alur Ketercapaian</w:t>
+      </w:r>
+    </w:p>
+    <w:p>
+      <w:pPr>
+        <w:pStyle w:val="ListBullet"/>
+        <w:spacing w:after="60" w:line="276" w:lineRule="auto"/>
+      </w:pPr>
+      <w:r>
+        <w:rPr>
+          <w:rFonts w:ascii="Arial" w:hAnsi="Arial"/>
+          <w:b/>
+          <w:color w:val="0F2744"/>
+          <w:sz w:val="19"/>
+        </w:rPr>
+        <w:t xml:space="preserve">TP-01 (Identifikasi Hardware): </w:t>
+      </w:r>
+      <w:r>
+        <w:rPr>
+          <w:rFonts w:ascii="Arial" w:hAnsi="Arial"/>
+          <w:color w:val="1E293B"/>
+          <w:sz w:val="19"/>
+        </w:rPr>
+        <w:t>Peserta didik mampu mengidentifikasi dan membedakan komponen penyusun unit pemrosesan komputer (CPU, Motherboard, RAM, SSD NVMe, GPU, PSU) beserta karakteristik dan spesifikasi fisiknya.</w:t>
+      </w:r>
+    </w:p>
+    <w:p>
+      <w:pPr>
+        <w:pStyle w:val="ListBullet"/>
+        <w:spacing w:after="60" w:line="276" w:lineRule="auto"/>
+      </w:pPr>
+      <w:r>
+        <w:rPr>
+          <w:rFonts w:ascii="Arial" w:hAnsi="Arial"/>
+          <w:b/>
+          <w:color w:val="0F2744"/>
+          <w:sz w:val="19"/>
+        </w:rPr>
+        <w:t xml:space="preserve">TP-02 (Prosedur Perakitan): </w:t>
+      </w:r>
+      <w:r>
+        <w:rPr>
+          <w:rFonts w:ascii="Arial" w:hAnsi="Arial"/>
+          <w:color w:val="1E293B"/>
+          <w:sz w:val="19"/>
+        </w:rPr>
+        <w:t>Peserta didik mampu menyimulasikan prosedur perakitan komputer secara runtut, presisi, dan sesuai standar keselamatan kerja perakitan (K3 elektronika).</w:t>
+      </w:r>
+    </w:p>
+    <w:p>
+      <w:pPr>
+        <w:pStyle w:val="ListBullet"/>
+        <w:spacing w:after="60" w:line="276" w:lineRule="auto"/>
+      </w:pPr>
+      <w:r>
+        <w:rPr>
+          <w:rFonts w:ascii="Arial" w:hAnsi="Arial"/>
+          <w:b/>
+          <w:color w:val="0F2744"/>
+          <w:sz w:val="19"/>
+        </w:rPr>
+        <w:t xml:space="preserve">TP-03 (Diagnostik &amp; Troubleshooting): </w:t>
+      </w:r>
+      <w:r>
+        <w:rPr>
+          <w:rFonts w:ascii="Arial" w:hAnsi="Arial"/>
+          <w:color w:val="1E293B"/>
+          <w:sz w:val="19"/>
+        </w:rPr>
+        <w:t>Peserta didik mampu menganalisis kegagalan perakitan, mendeteksi inkompatibilitas komponen (distraktor soket/arsitektur), dan membaca kode diagnostik LED POST BIOS.</w:t>
+      </w:r>
+    </w:p>
+    <w:p>
+      <w:pPr>
+        <w:pStyle w:val="ListBullet"/>
+        <w:spacing w:after="60" w:line="276" w:lineRule="auto"/>
+      </w:pPr>
+      <w:r>
+        <w:rPr>
+          <w:rFonts w:ascii="Arial" w:hAnsi="Arial"/>
+          <w:b/>
+          <w:color w:val="0F2744"/>
+          <w:sz w:val="19"/>
+        </w:rPr>
+        <w:t xml:space="preserve">TP-04 (Logika Digital &amp; Kodifikasi): </w:t>
+      </w:r>
+      <w:r>
+        <w:rPr>
+          <w:rFonts w:ascii="Arial" w:hAnsi="Arial"/>
+          <w:color w:val="1E293B"/>
+          <w:sz w:val="19"/>
+        </w:rPr>
+        <w:t>Peserta didik mampu membuktikan secara empiris konsep representasi data biner 8-bit, pencampuran warna piksel monitor 24-bit RGB, serta operasi tabel kebenaran gerbang logika dasar.</w:t>
+      </w:r>
+    </w:p>
+    <w:p>
+      <w:pPr>
+        <w:keepNext/>
+        <w:spacing w:before="200" w:after="60"/>
+      </w:pPr>
+      <w:r>
+        <w:rPr>
+          <w:rFonts w:ascii="Arial" w:hAnsi="Arial"/>
+          <w:b/>
+          <w:color w:val="0284C7"/>
+          <w:sz w:val="22"/>
+        </w:rPr>
+        <w:t>2.3 Penguatan Profil Pelajar Pancasila</w:t>
+      </w:r>
+    </w:p>
+    <w:p>
+      <w:pPr>
+        <w:pStyle w:val="ListBullet"/>
+        <w:spacing w:after="60" w:line="276" w:lineRule="auto"/>
+      </w:pPr>
+      <w:r>
+        <w:rPr>
+          <w:rFonts w:ascii="Arial" w:hAnsi="Arial"/>
+          <w:b/>
+          <w:color w:val="0F2744"/>
+          <w:sz w:val="19"/>
+        </w:rPr>
+        <w:t xml:space="preserve">• Bernalar Kritis: </w:t>
+      </w:r>
+      <w:r>
+        <w:rPr>
+          <w:rFonts w:ascii="Arial" w:hAnsi="Arial"/>
+          <w:color w:val="1E293B"/>
+          <w:sz w:val="19"/>
+        </w:rPr>
+        <w:t>Mengidentifikasi kesalahan pemasangan komponen, menganalisis gejala kegagalan boot, dan memecahkan teka-teki logika digital.</w:t>
+      </w:r>
+    </w:p>
+    <w:p>
+      <w:pPr>
+        <w:pStyle w:val="ListBullet"/>
+        <w:spacing w:after="60" w:line="276" w:lineRule="auto"/>
+      </w:pPr>
+      <w:r>
+        <w:rPr>
+          <w:rFonts w:ascii="Arial" w:hAnsi="Arial"/>
+          <w:b/>
+          <w:color w:val="0F2744"/>
+          <w:sz w:val="19"/>
+        </w:rPr>
+        <w:t xml:space="preserve">• Mandiri: </w:t>
+      </w:r>
+      <w:r>
+        <w:rPr>
+          <w:rFonts w:ascii="Arial" w:hAnsi="Arial"/>
+          <w:color w:val="1E293B"/>
+          <w:sz w:val="19"/>
+        </w:rPr>
+        <w:t>Melakukan eksplorasi mandiri di laboratorium virtual dengan tempo belajar yang disesuaikan dengan kebutuhan individu peserta didik.</w:t>
+      </w:r>
+    </w:p>
+    <w:p>
+      <w:pPr>
+        <w:pStyle w:val="ListBullet"/>
+        <w:spacing w:after="60" w:line="276" w:lineRule="auto"/>
+      </w:pPr>
+      <w:r>
+        <w:rPr>
+          <w:rFonts w:ascii="Arial" w:hAnsi="Arial"/>
+          <w:b/>
+          <w:color w:val="0F2744"/>
+          <w:sz w:val="19"/>
+        </w:rPr>
+        <w:t xml:space="preserve">• Kreatif: </w:t>
+      </w:r>
+      <w:r>
+        <w:rPr>
+          <w:rFonts w:ascii="Arial" w:hAnsi="Arial"/>
+          <w:color w:val="1E293B"/>
+          <w:sz w:val="19"/>
+        </w:rPr>
+        <w:t>Mengombinasikan kombinasi warna RGB dan merancang alur logika input gerbang logika.</w:t>
+      </w:r>
+    </w:p>
+    <w:p>
+      <w:pPr>
+        <w:keepNext/>
+        <w:spacing w:before="280" w:after="80"/>
+      </w:pPr>
+      <w:r>
+        <w:rPr>
+          <w:rFonts w:ascii="Arial" w:hAnsi="Arial"/>
+          <w:b/>
+          <w:color w:val="0F2744"/>
+          <w:sz w:val="26"/>
+        </w:rPr>
+        <w:t>BAB III. PERSYARATAN SISTEM &amp; PETUNJUK OPERASIONAL</w:t>
+      </w:r>
+    </w:p>
+    <w:p>
+      <w:pPr>
+        <w:keepNext/>
+        <w:spacing w:before="200" w:after="60"/>
+      </w:pPr>
+      <w:r>
+        <w:rPr>
+          <w:rFonts w:ascii="Arial" w:hAnsi="Arial"/>
+          <w:b/>
+          <w:color w:val="0284C7"/>
+          <w:sz w:val="22"/>
+        </w:rPr>
+        <w:t>3.1 Persyaratan Perangkat Keras &amp; Lunak</w:t>
+      </w:r>
+    </w:p>
+    <w:p>
+      <w:pPr>
+        <w:pStyle w:val="ListBullet"/>
+        <w:spacing w:after="60" w:line="276" w:lineRule="auto"/>
+      </w:pPr>
+      <w:r>
+        <w:rPr>
+          <w:rFonts w:ascii="Arial" w:hAnsi="Arial"/>
+          <w:b/>
+          <w:color w:val="0F2744"/>
+          <w:sz w:val="19"/>
+        </w:rPr>
+        <w:t xml:space="preserve">Perangkat Keras (Hardware): </w:t>
+      </w:r>
+      <w:r>
+        <w:rPr>
+          <w:rFonts w:ascii="Arial" w:hAnsi="Arial"/>
+          <w:color w:val="1E293B"/>
+          <w:sz w:val="19"/>
+        </w:rPr>
+        <w:t>PC / Laptop dengan prosesor dual-core (minimal 1.5 GHz), RAM 2 GB, monitor resolusi 1280x720 (atau rasio 16:9 lainnya), mouse / touchpad, dan speaker / headphone aktif.</w:t>
+      </w:r>
+    </w:p>
+    <w:p>
+      <w:pPr>
+        <w:pStyle w:val="ListBullet"/>
+        <w:spacing w:after="60" w:line="276" w:lineRule="auto"/>
+      </w:pPr>
+      <w:r>
+        <w:rPr>
+          <w:rFonts w:ascii="Arial" w:hAnsi="Arial"/>
+          <w:b/>
+          <w:color w:val="0F2744"/>
+          <w:sz w:val="19"/>
+        </w:rPr>
+        <w:t xml:space="preserve">Perangkat Lunak (Software): </w:t>
+      </w:r>
+      <w:r>
+        <w:rPr>
+          <w:rFonts w:ascii="Arial" w:hAnsi="Arial"/>
+          <w:color w:val="1E293B"/>
+          <w:sz w:val="19"/>
+        </w:rPr>
+        <w:t>Sistem Operasi Windows 7/8/10/11, macOS, Linux, atau ChromeOS. Peramban web modern (Google Chrome, Microsoft Edge, Mozilla Firefox, atau Opera) dengan dukungan HTML5 Canvas dan Web Audio API.</w:t>
+      </w:r>
+    </w:p>
+    <w:p>
+      <w:pPr>
+        <w:pStyle w:val="ListBullet"/>
+        <w:spacing w:after="60" w:line="276" w:lineRule="auto"/>
+      </w:pPr>
+      <w:r>
+        <w:rPr>
+          <w:rFonts w:ascii="Arial" w:hAnsi="Arial"/>
+          <w:b/>
+          <w:color w:val="0F2744"/>
+          <w:sz w:val="19"/>
+        </w:rPr>
+        <w:t xml:space="preserve">Konektivitas Jaringan: </w:t>
+      </w:r>
+      <w:r>
+        <w:rPr>
+          <w:rFonts w:ascii="Arial" w:hAnsi="Arial"/>
+          <w:color w:val="1E293B"/>
+          <w:sz w:val="19"/>
+        </w:rPr>
+        <w:t>Aplikasi bersifat 100% mandiri (stand-alone) luring. Tidak memerlukan sambungan internet, instalasi server lokal (XAMPP/Node.js), maupun plugin tambahan.</w:t>
+      </w:r>
+    </w:p>
+    <w:p>
+      <w:pPr>
+        <w:keepNext/>
+        <w:spacing w:before="200" w:after="60"/>
+      </w:pPr>
+      <w:r>
+        <w:rPr>
+          <w:rFonts w:ascii="Arial" w:hAnsi="Arial"/>
+          <w:b/>
+          <w:color w:val="0284C7"/>
+          <w:sz w:val="22"/>
+        </w:rPr>
+        <w:t>3.2 Langkah Menjalankan Media</w:t>
+      </w:r>
+    </w:p>
+    <w:p>
+      <w:pPr>
+        <w:pStyle w:val="ListBullet"/>
+        <w:spacing w:after="60" w:line="276" w:lineRule="auto"/>
+      </w:pPr>
+      <w:r>
+        <w:rPr>
+          <w:rFonts w:ascii="Arial" w:hAnsi="Arial"/>
+          <w:b/>
+          <w:color w:val="0F2744"/>
+          <w:sz w:val="19"/>
+        </w:rPr>
+        <w:t xml:space="preserve">Langkah 1: </w:t>
+      </w:r>
+      <w:r>
+        <w:rPr>
+          <w:rFonts w:ascii="Arial" w:hAnsi="Arial"/>
+          <w:color w:val="1E293B"/>
+          <w:sz w:val="19"/>
+        </w:rPr>
+        <w:t>Ekstrak folder karya jika berada dalam arsip ZIP.</w:t>
+      </w:r>
+    </w:p>
+    <w:p>
+      <w:pPr>
+        <w:pStyle w:val="ListBullet"/>
+        <w:spacing w:after="60" w:line="276" w:lineRule="auto"/>
+      </w:pPr>
+      <w:r>
+        <w:rPr>
+          <w:rFonts w:ascii="Arial" w:hAnsi="Arial"/>
+          <w:b/>
+          <w:color w:val="0F2744"/>
+          <w:sz w:val="19"/>
+        </w:rPr>
+        <w:t xml:space="preserve">Langkah 2: </w:t>
+      </w:r>
+      <w:r>
+        <w:rPr>
+          <w:rFonts w:ascii="Arial" w:hAnsi="Arial"/>
+          <w:color w:val="1E293B"/>
+          <w:sz w:val="19"/>
+        </w:rPr>
+        <w:t>Buka folder dan temukan berkas utama bernama 'index.html'.</w:t>
+      </w:r>
+    </w:p>
+    <w:p>
+      <w:pPr>
+        <w:pStyle w:val="ListBullet"/>
+        <w:spacing w:after="60" w:line="276" w:lineRule="auto"/>
+      </w:pPr>
+      <w:r>
+        <w:rPr>
+          <w:rFonts w:ascii="Arial" w:hAnsi="Arial"/>
+          <w:b/>
+          <w:color w:val="0F2744"/>
+          <w:sz w:val="19"/>
+        </w:rPr>
+        <w:t xml:space="preserve">Langkah 3: </w:t>
+      </w:r>
+      <w:r>
+        <w:rPr>
+          <w:rFonts w:ascii="Arial" w:hAnsi="Arial"/>
+          <w:color w:val="1E293B"/>
+          <w:sz w:val="19"/>
+        </w:rPr>
+        <w:t>Klik ganda berkas 'index.html' atau klik kanan lalu pilih 'Open with Google Chrome / Microsoft Edge'.</w:t>
+      </w:r>
+    </w:p>
+    <w:p>
+      <w:pPr>
+        <w:pStyle w:val="ListBullet"/>
+        <w:spacing w:after="60" w:line="276" w:lineRule="auto"/>
+      </w:pPr>
+      <w:r>
+        <w:rPr>
+          <w:rFonts w:ascii="Arial" w:hAnsi="Arial"/>
+          <w:b/>
+          <w:color w:val="0F2744"/>
+          <w:sz w:val="19"/>
+        </w:rPr>
+        <w:t xml:space="preserve">Langkah 4: </w:t>
+      </w:r>
+      <w:r>
+        <w:rPr>
+          <w:rFonts w:ascii="Arial" w:hAnsi="Arial"/>
+          <w:color w:val="1E293B"/>
+          <w:sz w:val="19"/>
+        </w:rPr>
+        <w:t>Aplikasi akan langsung terbuka dalam waktu kurang dari 1 detik dan siap digunakan.</w:t>
+      </w:r>
+    </w:p>
+    <w:p>
+      <w:pPr>
+        <w:keepNext/>
+        <w:spacing w:before="280" w:after="80"/>
+      </w:pPr>
+      <w:r>
+        <w:rPr>
+          <w:rFonts w:ascii="Arial" w:hAnsi="Arial"/>
+          <w:b/>
+          <w:color w:val="0F2744"/>
+          <w:sz w:val="26"/>
+        </w:rPr>
+        <w:t>BAB IV. PANDUAN PENGGUNAAN FITUR &amp; TANGKAPAN LAYAR</w:t>
+      </w:r>
+    </w:p>
+    <w:p>
+      <w:pPr>
+        <w:spacing w:after="80" w:line="276" w:lineRule="auto"/>
+      </w:pPr>
+      <w:r>
+        <w:rPr>
+          <w:rFonts w:ascii="Arial" w:hAnsi="Arial"/>
+          <w:color w:val="1E293B"/>
+          <w:sz w:val="19"/>
+        </w:rPr>
+        <w:t>Berikut merupakan panduan operasional komprehensif untuk setiap modul antarmuka yang dilengkapi dengan tangkapan layar berpenanda serta uraian interaksi pengguna:</w:t>
+      </w:r>
+    </w:p>
+    <w:p>
+      <w:pPr>
+        <w:spacing w:before="160" w:after="60"/>
+        <w:jc w:val="center"/>
+      </w:pPr>
+      <w:r>
+        <w:drawing>
+          <wp:inline xmlns:a="http://schemas.openxmlformats.org/drawingml/2006/main" xmlns:pic="http://schemas.openxmlformats.org/drawingml/2006/picture">
+            <wp:extent cx="5303520" cy="2983230"/>
+            <wp:docPr id="1" name="Picture 1"/>
+            <wp:cNvGraphicFramePr>
+              <a:graphicFrameLocks noChangeAspect="1"/>
+            </wp:cNvGraphicFramePr>
+            <a:graphic>
+              <a:graphicData uri="http://schemas.openxmlformats.org/drawingml/2006/picture">
+                <pic:pic>
+                  <pic:nvPicPr>
+                    <pic:cNvPr id="0" name="1_welcome_screen.png"/>
+                    <pic:cNvPicPr/>
+                  </pic:nvPicPr>
+                  <pic:blipFill>
+                    <a:blip r:embed="rId9"/>
+                    <a:stretch>
+                      <a:fillRect/>
+                    </a:stretch>
+                  </pic:blipFill>
+                  <pic:spPr>
+                    <a:xfrm>
+                      <a:off x="0" y="0"/>
+                      <a:ext cx="5303520" cy="2983230"/>
+                    </a:xfrm>
+                    <a:prstGeom prst="rect"/>
+                  </pic:spPr>
+                </pic:pic>
+              </a:graphicData>
+            </a:graphic>
+          </wp:inline>
+        </w:drawing>
+      </w:r>
+    </w:p>
+    <w:p>
+      <w:pPr>
+        <w:spacing w:after="80"/>
+        <w:jc w:val="center"/>
+      </w:pPr>
+      <w:r>
+        <w:rPr>
+          <w:rFonts w:ascii="Arial" w:hAnsi="Arial"/>
+          <w:b/>
+          <w:color w:val="0F2744"/>
+          <w:sz w:val="18"/>
+        </w:rPr>
+        <w:t xml:space="preserve">Gambar 1: </w:t>
+      </w:r>
+      <w:r>
+        <w:rPr>
+          <w:rFonts w:ascii="Arial" w:hAnsi="Arial"/>
+          <w:i/>
+          <w:color w:val="475569"/>
+          <w:sz w:val="18"/>
+        </w:rPr>
+        <w:t>Layar Pembuka (Welcome Screen) Lab Maya Perakitan Komputer</w:t>
+      </w:r>
+    </w:p>
+    <w:tbl>
+      <w:tblPr>
+        <w:tblW w:type="auto" w:w="0"/>
+        <w:jc w:val="center"/>
+        <w:tblLook w:firstColumn="1" w:firstRow="1" w:lastColumn="0" w:lastRow="0" w:noHBand="0" w:noVBand="1" w:val="04A0"/>
+      </w:tblPr>
+      <w:tblGrid>
+        <w:gridCol w:w="4680"/>
+        <w:gridCol w:w="4680"/>
+      </w:tblGrid>
+      <w:tr>
+        <w:tc>
+          <w:tcPr>
+            <w:tcW w:type="dxa" w:w="2592"/>
+            <w:shd w:fill="0F2744"/>
+            <w:tcMar>
+              <w:top w:w="60" w:type="dxa"/>
+              <w:bottom w:w="60" w:type="dxa"/>
+              <w:left w:w="100" w:type="dxa"/>
+              <w:right w:w="100" w:type="dxa"/>
             </w:tcMar>
           </w:tcPr>
           <w:p>
@@ -356,32 +1324,1660 @@
               <w:rPr>
                 <w:rFonts w:ascii="Arial" w:hAnsi="Arial"/>
                 <w:b/>
-                <w:color w:val="0F172A"/>
-                <w:sz w:val="19"/>
+                <w:color w:val="FFFFFF"/>
+                <w:sz w:val="17"/>
               </w:rPr>
-              <w:t>Arsitektur Aplikasi</w:t>
+              <w:t>Penanda / Bagian UI</w:t>
             </w:r>
           </w:p>
         </w:tc>
         <w:tc>
           <w:tcPr>
-            <w:tcW w:type="dxa" w:w="6480"/>
-            <w:shd w:fill="FFFFFF"/>
+            <w:tcW w:type="dxa" w:w="6768"/>
+            <w:shd w:fill="0F2744"/>
             <w:tcMar>
-              <w:top w:w="80" w:type="dxa"/>
-              <w:bottom w:w="80" w:type="dxa"/>
-              <w:left w:w="120" w:type="dxa"/>
-              <w:right w:w="120" w:type="dxa"/>
+              <w:top w:w="60" w:type="dxa"/>
+              <w:bottom w:w="60" w:type="dxa"/>
+              <w:left w:w="100" w:type="dxa"/>
+              <w:right w:w="100" w:type="dxa"/>
             </w:tcMar>
           </w:tcPr>
           <w:p>
             <w:r>
               <w:rPr>
                 <w:rFonts w:ascii="Arial" w:hAnsi="Arial"/>
-                <w:color w:val="0F172A"/>
-                <w:sz w:val="19"/>
+                <w:b/>
+                <w:color w:val="FFFFFF"/>
+                <w:sz w:val="17"/>
               </w:rPr>
-              <w:t>Single Page Application (SPA), HTML5, CSS3, Vanilla JS (Zero-Dependency)</w:t>
+              <w:t>Deskripsi Fungsi &amp; Interaksi Pengguna</w:t>
+            </w:r>
+          </w:p>
+        </w:tc>
+      </w:tr>
+      <w:tr>
+        <w:tc>
+          <w:tcPr>
+            <w:tcW w:type="dxa" w:w="2592"/>
+            <w:shd w:fill="F8FAFC"/>
+            <w:tcMar>
+              <w:top w:w="40" w:type="dxa"/>
+              <w:bottom w:w="40" w:type="dxa"/>
+              <w:left w:w="100" w:type="dxa"/>
+              <w:right w:w="100" w:type="dxa"/>
+            </w:tcMar>
+          </w:tcPr>
+          <w:p>
+            <w:r>
+              <w:rPr>
+                <w:rFonts w:ascii="Arial" w:hAnsi="Arial"/>
+                <w:b/>
+                <w:color w:val="0284C7"/>
+                <w:sz w:val="17"/>
+              </w:rPr>
+              <w:t>1. Header &amp; Logo</w:t>
+            </w:r>
+          </w:p>
+        </w:tc>
+        <w:tc>
+          <w:tcPr>
+            <w:tcW w:type="dxa" w:w="6768"/>
+            <w:shd w:fill="F8FAFC"/>
+            <w:tcMar>
+              <w:top w:w="40" w:type="dxa"/>
+              <w:bottom w:w="40" w:type="dxa"/>
+              <w:left w:w="100" w:type="dxa"/>
+              <w:right w:w="100" w:type="dxa"/>
+            </w:tcMar>
+          </w:tcPr>
+          <w:p>
+            <w:r>
+              <w:rPr>
+                <w:rFonts w:ascii="Arial" w:hAnsi="Arial"/>
+                <w:color w:val="334155"/>
+                <w:sz w:val="17"/>
+              </w:rPr>
+              <w:t>Menampilkan identitas kementerian, logo Tut Wuri Handayani, dan judul aplikasi dengan estetika futuristik.</w:t>
+            </w:r>
+          </w:p>
+        </w:tc>
+      </w:tr>
+      <w:tr>
+        <w:tc>
+          <w:tcPr>
+            <w:tcW w:type="dxa" w:w="2592"/>
+            <w:shd w:fill="FFFFFF"/>
+            <w:tcMar>
+              <w:top w:w="40" w:type="dxa"/>
+              <w:bottom w:w="40" w:type="dxa"/>
+              <w:left w:w="100" w:type="dxa"/>
+              <w:right w:w="100" w:type="dxa"/>
+            </w:tcMar>
+          </w:tcPr>
+          <w:p>
+            <w:r>
+              <w:rPr>
+                <w:rFonts w:ascii="Arial" w:hAnsi="Arial"/>
+                <w:b/>
+                <w:color w:val="0284C7"/>
+                <w:sz w:val="17"/>
+              </w:rPr>
+              <w:t>2. Badge Fase D</w:t>
+            </w:r>
+          </w:p>
+        </w:tc>
+        <w:tc>
+          <w:tcPr>
+            <w:tcW w:type="dxa" w:w="6768"/>
+            <w:shd w:fill="FFFFFF"/>
+            <w:tcMar>
+              <w:top w:w="40" w:type="dxa"/>
+              <w:bottom w:w="40" w:type="dxa"/>
+              <w:left w:w="100" w:type="dxa"/>
+              <w:right w:w="100" w:type="dxa"/>
+            </w:tcMar>
+          </w:tcPr>
+          <w:p>
+            <w:r>
+              <w:rPr>
+                <w:rFonts w:ascii="Arial" w:hAnsi="Arial"/>
+                <w:color w:val="334155"/>
+                <w:sz w:val="17"/>
+              </w:rPr>
+              <w:t>Penanda jenjang kurikulum Informatika SMP Fase D untuk memudahkan orientasi guru dan siswa.</w:t>
+            </w:r>
+          </w:p>
+        </w:tc>
+      </w:tr>
+      <w:tr>
+        <w:tc>
+          <w:tcPr>
+            <w:tcW w:type="dxa" w:w="2592"/>
+            <w:shd w:fill="F8FAFC"/>
+            <w:tcMar>
+              <w:top w:w="40" w:type="dxa"/>
+              <w:bottom w:w="40" w:type="dxa"/>
+              <w:left w:w="100" w:type="dxa"/>
+              <w:right w:w="100" w:type="dxa"/>
+            </w:tcMar>
+          </w:tcPr>
+          <w:p>
+            <w:r>
+              <w:rPr>
+                <w:rFonts w:ascii="Arial" w:hAnsi="Arial"/>
+                <w:b/>
+                <w:color w:val="0284C7"/>
+                <w:sz w:val="17"/>
+              </w:rPr>
+              <w:t>3. Tombol ▶ MASUK LAB</w:t>
+            </w:r>
+          </w:p>
+        </w:tc>
+        <w:tc>
+          <w:tcPr>
+            <w:tcW w:type="dxa" w:w="6768"/>
+            <w:shd w:fill="F8FAFC"/>
+            <w:tcMar>
+              <w:top w:w="40" w:type="dxa"/>
+              <w:bottom w:w="40" w:type="dxa"/>
+              <w:left w:w="100" w:type="dxa"/>
+              <w:right w:w="100" w:type="dxa"/>
+            </w:tcMar>
+          </w:tcPr>
+          <w:p>
+            <w:r>
+              <w:rPr>
+                <w:rFonts w:ascii="Arial" w:hAnsi="Arial"/>
+                <w:color w:val="334155"/>
+                <w:sz w:val="17"/>
+              </w:rPr>
+              <w:t>Memicu transisi animasi membuka ruang meja kerja laboratorium virtual dan mengaktifkan Web Audio API.</w:t>
+            </w:r>
+          </w:p>
+        </w:tc>
+      </w:tr>
+      <w:tr>
+        <w:tc>
+          <w:tcPr>
+            <w:tcW w:type="dxa" w:w="2592"/>
+            <w:shd w:fill="FFFFFF"/>
+            <w:tcMar>
+              <w:top w:w="40" w:type="dxa"/>
+              <w:bottom w:w="40" w:type="dxa"/>
+              <w:left w:w="100" w:type="dxa"/>
+              <w:right w:w="100" w:type="dxa"/>
+            </w:tcMar>
+          </w:tcPr>
+          <w:p>
+            <w:r>
+              <w:rPr>
+                <w:rFonts w:ascii="Arial" w:hAnsi="Arial"/>
+                <w:b/>
+                <w:color w:val="0284C7"/>
+                <w:sz w:val="17"/>
+              </w:rPr>
+              <w:t>4. Tombol 📖 Panduan</w:t>
+            </w:r>
+          </w:p>
+        </w:tc>
+        <w:tc>
+          <w:tcPr>
+            <w:tcW w:type="dxa" w:w="6768"/>
+            <w:shd w:fill="FFFFFF"/>
+            <w:tcMar>
+              <w:top w:w="40" w:type="dxa"/>
+              <w:bottom w:w="40" w:type="dxa"/>
+              <w:left w:w="100" w:type="dxa"/>
+              <w:right w:w="100" w:type="dxa"/>
+            </w:tcMar>
+          </w:tcPr>
+          <w:p>
+            <w:r>
+              <w:rPr>
+                <w:rFonts w:ascii="Arial" w:hAnsi="Arial"/>
+                <w:color w:val="334155"/>
+                <w:sz w:val="17"/>
+              </w:rPr>
+              <w:t>Membuka jendela modal petunjuk ringkas keselamatan kerja dan navigasi alat lab.</w:t>
+            </w:r>
+          </w:p>
+        </w:tc>
+      </w:tr>
+    </w:tbl>
+    <w:p>
+      <w:pPr>
+        <w:spacing w:after="120"/>
+      </w:pPr>
+    </w:p>
+    <w:p>
+      <w:pPr>
+        <w:spacing w:before="160" w:after="60"/>
+        <w:jc w:val="center"/>
+      </w:pPr>
+      <w:r>
+        <w:drawing>
+          <wp:inline xmlns:a="http://schemas.openxmlformats.org/drawingml/2006/main" xmlns:pic="http://schemas.openxmlformats.org/drawingml/2006/picture">
+            <wp:extent cx="5303520" cy="2983230"/>
+            <wp:docPr id="2" name="Picture 2"/>
+            <wp:cNvGraphicFramePr>
+              <a:graphicFrameLocks noChangeAspect="1"/>
+            </wp:cNvGraphicFramePr>
+            <a:graphic>
+              <a:graphicData uri="http://schemas.openxmlformats.org/drawingml/2006/picture">
+                <pic:pic>
+                  <pic:nvPicPr>
+                    <pic:cNvPr id="0" name="2_teori_komponen.png"/>
+                    <pic:cNvPicPr/>
+                  </pic:nvPicPr>
+                  <pic:blipFill>
+                    <a:blip r:embed="rId10"/>
+                    <a:stretch>
+                      <a:fillRect/>
+                    </a:stretch>
+                  </pic:blipFill>
+                  <pic:spPr>
+                    <a:xfrm>
+                      <a:off x="0" y="0"/>
+                      <a:ext cx="5303520" cy="2983230"/>
+                    </a:xfrm>
+                    <a:prstGeom prst="rect"/>
+                  </pic:spPr>
+                </pic:pic>
+              </a:graphicData>
+            </a:graphic>
+          </wp:inline>
+        </w:drawing>
+      </w:r>
+    </w:p>
+    <w:p>
+      <w:pPr>
+        <w:spacing w:after="80"/>
+        <w:jc w:val="center"/>
+      </w:pPr>
+      <w:r>
+        <w:rPr>
+          <w:rFonts w:ascii="Arial" w:hAnsi="Arial"/>
+          <w:b/>
+          <w:color w:val="0F2744"/>
+          <w:sz w:val="18"/>
+        </w:rPr>
+        <w:t xml:space="preserve">Gambar 2: </w:t>
+      </w:r>
+      <w:r>
+        <w:rPr>
+          <w:rFonts w:ascii="Arial" w:hAnsi="Arial"/>
+          <w:i/>
+          <w:color w:val="475569"/>
+          <w:sz w:val="18"/>
+        </w:rPr>
+        <w:t>Modul Teori Interaktif &amp; Ensiklopedia Komponen Hardware</w:t>
+      </w:r>
+    </w:p>
+    <w:tbl>
+      <w:tblPr>
+        <w:tblW w:type="auto" w:w="0"/>
+        <w:jc w:val="center"/>
+        <w:tblLook w:firstColumn="1" w:firstRow="1" w:lastColumn="0" w:lastRow="0" w:noHBand="0" w:noVBand="1" w:val="04A0"/>
+      </w:tblPr>
+      <w:tblGrid>
+        <w:gridCol w:w="4680"/>
+        <w:gridCol w:w="4680"/>
+      </w:tblGrid>
+      <w:tr>
+        <w:tc>
+          <w:tcPr>
+            <w:tcW w:type="dxa" w:w="2592"/>
+            <w:shd w:fill="0F2744"/>
+            <w:tcMar>
+              <w:top w:w="60" w:type="dxa"/>
+              <w:bottom w:w="60" w:type="dxa"/>
+              <w:left w:w="100" w:type="dxa"/>
+              <w:right w:w="100" w:type="dxa"/>
+            </w:tcMar>
+          </w:tcPr>
+          <w:p>
+            <w:r>
+              <w:rPr>
+                <w:rFonts w:ascii="Arial" w:hAnsi="Arial"/>
+                <w:b/>
+                <w:color w:val="FFFFFF"/>
+                <w:sz w:val="17"/>
+              </w:rPr>
+              <w:t>Penanda / Bagian UI</w:t>
+            </w:r>
+          </w:p>
+        </w:tc>
+        <w:tc>
+          <w:tcPr>
+            <w:tcW w:type="dxa" w:w="6768"/>
+            <w:shd w:fill="0F2744"/>
+            <w:tcMar>
+              <w:top w:w="60" w:type="dxa"/>
+              <w:bottom w:w="60" w:type="dxa"/>
+              <w:left w:w="100" w:type="dxa"/>
+              <w:right w:w="100" w:type="dxa"/>
+            </w:tcMar>
+          </w:tcPr>
+          <w:p>
+            <w:r>
+              <w:rPr>
+                <w:rFonts w:ascii="Arial" w:hAnsi="Arial"/>
+                <w:b/>
+                <w:color w:val="FFFFFF"/>
+                <w:sz w:val="17"/>
+              </w:rPr>
+              <w:t>Deskripsi Fungsi &amp; Interaksi Pengguna</w:t>
+            </w:r>
+          </w:p>
+        </w:tc>
+      </w:tr>
+      <w:tr>
+        <w:tc>
+          <w:tcPr>
+            <w:tcW w:type="dxa" w:w="2592"/>
+            <w:shd w:fill="F8FAFC"/>
+            <w:tcMar>
+              <w:top w:w="40" w:type="dxa"/>
+              <w:bottom w:w="40" w:type="dxa"/>
+              <w:left w:w="100" w:type="dxa"/>
+              <w:right w:w="100" w:type="dxa"/>
+            </w:tcMar>
+          </w:tcPr>
+          <w:p>
+            <w:r>
+              <w:rPr>
+                <w:rFonts w:ascii="Arial" w:hAnsi="Arial"/>
+                <w:b/>
+                <w:color w:val="0284C7"/>
+                <w:sz w:val="17"/>
+              </w:rPr>
+              <w:t>1. Tab Navigasi Skenario</w:t>
+            </w:r>
+          </w:p>
+        </w:tc>
+        <w:tc>
+          <w:tcPr>
+            <w:tcW w:type="dxa" w:w="6768"/>
+            <w:shd w:fill="F8FAFC"/>
+            <w:tcMar>
+              <w:top w:w="40" w:type="dxa"/>
+              <w:bottom w:w="40" w:type="dxa"/>
+              <w:left w:w="100" w:type="dxa"/>
+              <w:right w:w="100" w:type="dxa"/>
+            </w:tcMar>
+          </w:tcPr>
+          <w:p>
+            <w:r>
+              <w:rPr>
+                <w:rFonts w:ascii="Arial" w:hAnsi="Arial"/>
+                <w:color w:val="334155"/>
+                <w:sz w:val="17"/>
+              </w:rPr>
+              <w:t>Bilah menu horizontal fleksibel untuk berpindah antar modul (Teori, Prosedur, Rakit PC, Eksplorasi, LKPD).</w:t>
+            </w:r>
+          </w:p>
+        </w:tc>
+      </w:tr>
+      <w:tr>
+        <w:tc>
+          <w:tcPr>
+            <w:tcW w:type="dxa" w:w="2592"/>
+            <w:shd w:fill="FFFFFF"/>
+            <w:tcMar>
+              <w:top w:w="40" w:type="dxa"/>
+              <w:bottom w:w="40" w:type="dxa"/>
+              <w:left w:w="100" w:type="dxa"/>
+              <w:right w:w="100" w:type="dxa"/>
+            </w:tcMar>
+          </w:tcPr>
+          <w:p>
+            <w:r>
+              <w:rPr>
+                <w:rFonts w:ascii="Arial" w:hAnsi="Arial"/>
+                <w:b/>
+                <w:color w:val="0284C7"/>
+                <w:sz w:val="17"/>
+              </w:rPr>
+              <w:t>2. Kartu Komponen Hardware</w:t>
+            </w:r>
+          </w:p>
+        </w:tc>
+        <w:tc>
+          <w:tcPr>
+            <w:tcW w:type="dxa" w:w="6768"/>
+            <w:shd w:fill="FFFFFF"/>
+            <w:tcMar>
+              <w:top w:w="40" w:type="dxa"/>
+              <w:bottom w:w="40" w:type="dxa"/>
+              <w:left w:w="100" w:type="dxa"/>
+              <w:right w:w="100" w:type="dxa"/>
+            </w:tcMar>
+          </w:tcPr>
+          <w:p>
+            <w:r>
+              <w:rPr>
+                <w:rFonts w:ascii="Arial" w:hAnsi="Arial"/>
+                <w:color w:val="334155"/>
+                <w:sz w:val="17"/>
+              </w:rPr>
+              <w:t>Menampilkan visualisasi 3D-styled, fungsi utama, spesifikasi, dan peran masing-masing komponen dalam siklus data.</w:t>
+            </w:r>
+          </w:p>
+        </w:tc>
+      </w:tr>
+      <w:tr>
+        <w:tc>
+          <w:tcPr>
+            <w:tcW w:type="dxa" w:w="2592"/>
+            <w:shd w:fill="F8FAFC"/>
+            <w:tcMar>
+              <w:top w:w="40" w:type="dxa"/>
+              <w:bottom w:w="40" w:type="dxa"/>
+              <w:left w:w="100" w:type="dxa"/>
+              <w:right w:w="100" w:type="dxa"/>
+            </w:tcMar>
+          </w:tcPr>
+          <w:p>
+            <w:r>
+              <w:rPr>
+                <w:rFonts w:ascii="Arial" w:hAnsi="Arial"/>
+                <w:b/>
+                <w:color w:val="0284C7"/>
+                <w:sz w:val="17"/>
+              </w:rPr>
+              <w:t>3. Tooltips Edukatif</w:t>
+            </w:r>
+          </w:p>
+        </w:tc>
+        <w:tc>
+          <w:tcPr>
+            <w:tcW w:type="dxa" w:w="6768"/>
+            <w:shd w:fill="F8FAFC"/>
+            <w:tcMar>
+              <w:top w:w="40" w:type="dxa"/>
+              <w:bottom w:w="40" w:type="dxa"/>
+              <w:left w:w="100" w:type="dxa"/>
+              <w:right w:w="100" w:type="dxa"/>
+            </w:tcMar>
+          </w:tcPr>
+          <w:p>
+            <w:r>
+              <w:rPr>
+                <w:rFonts w:ascii="Arial" w:hAnsi="Arial"/>
+                <w:color w:val="334155"/>
+                <w:sz w:val="17"/>
+              </w:rPr>
+              <w:t>Arahkan kursor mouse ke setiap kartu untuk melihat rincian soket, kecepatan transfer, dan peran arsitekturnya.</w:t>
+            </w:r>
+          </w:p>
+        </w:tc>
+      </w:tr>
+    </w:tbl>
+    <w:p>
+      <w:pPr>
+        <w:spacing w:after="120"/>
+      </w:pPr>
+    </w:p>
+    <w:p>
+      <w:pPr>
+        <w:spacing w:before="160" w:after="60"/>
+        <w:jc w:val="center"/>
+      </w:pPr>
+      <w:r>
+        <w:drawing>
+          <wp:inline xmlns:a="http://schemas.openxmlformats.org/drawingml/2006/main" xmlns:pic="http://schemas.openxmlformats.org/drawingml/2006/picture">
+            <wp:extent cx="5303520" cy="2983230"/>
+            <wp:docPr id="3" name="Picture 3"/>
+            <wp:cNvGraphicFramePr>
+              <a:graphicFrameLocks noChangeAspect="1"/>
+            </wp:cNvGraphicFramePr>
+            <a:graphic>
+              <a:graphicData uri="http://schemas.openxmlformats.org/drawingml/2006/picture">
+                <pic:pic>
+                  <pic:nvPicPr>
+                    <pic:cNvPr id="0" name="3_prosedur_k3.png"/>
+                    <pic:cNvPicPr/>
+                  </pic:nvPicPr>
+                  <pic:blipFill>
+                    <a:blip r:embed="rId11"/>
+                    <a:stretch>
+                      <a:fillRect/>
+                    </a:stretch>
+                  </pic:blipFill>
+                  <pic:spPr>
+                    <a:xfrm>
+                      <a:off x="0" y="0"/>
+                      <a:ext cx="5303520" cy="2983230"/>
+                    </a:xfrm>
+                    <a:prstGeom prst="rect"/>
+                  </pic:spPr>
+                </pic:pic>
+              </a:graphicData>
+            </a:graphic>
+          </wp:inline>
+        </w:drawing>
+      </w:r>
+    </w:p>
+    <w:p>
+      <w:pPr>
+        <w:spacing w:after="80"/>
+        <w:jc w:val="center"/>
+      </w:pPr>
+      <w:r>
+        <w:rPr>
+          <w:rFonts w:ascii="Arial" w:hAnsi="Arial"/>
+          <w:b/>
+          <w:color w:val="0F2744"/>
+          <w:sz w:val="18"/>
+        </w:rPr>
+        <w:t xml:space="preserve">Gambar 3: </w:t>
+      </w:r>
+      <w:r>
+        <w:rPr>
+          <w:rFonts w:ascii="Arial" w:hAnsi="Arial"/>
+          <w:i/>
+          <w:color w:val="475569"/>
+          <w:sz w:val="18"/>
+        </w:rPr>
+        <w:t>Modul Prosedur Standar &amp; K3 Perakitan Komputer</w:t>
+      </w:r>
+    </w:p>
+    <w:tbl>
+      <w:tblPr>
+        <w:tblW w:type="auto" w:w="0"/>
+        <w:jc w:val="center"/>
+        <w:tblLook w:firstColumn="1" w:firstRow="1" w:lastColumn="0" w:lastRow="0" w:noHBand="0" w:noVBand="1" w:val="04A0"/>
+      </w:tblPr>
+      <w:tblGrid>
+        <w:gridCol w:w="4680"/>
+        <w:gridCol w:w="4680"/>
+      </w:tblGrid>
+      <w:tr>
+        <w:tc>
+          <w:tcPr>
+            <w:tcW w:type="dxa" w:w="2592"/>
+            <w:shd w:fill="0F2744"/>
+            <w:tcMar>
+              <w:top w:w="60" w:type="dxa"/>
+              <w:bottom w:w="60" w:type="dxa"/>
+              <w:left w:w="100" w:type="dxa"/>
+              <w:right w:w="100" w:type="dxa"/>
+            </w:tcMar>
+          </w:tcPr>
+          <w:p>
+            <w:r>
+              <w:rPr>
+                <w:rFonts w:ascii="Arial" w:hAnsi="Arial"/>
+                <w:b/>
+                <w:color w:val="FFFFFF"/>
+                <w:sz w:val="17"/>
+              </w:rPr>
+              <w:t>Penanda / Bagian UI</w:t>
+            </w:r>
+          </w:p>
+        </w:tc>
+        <w:tc>
+          <w:tcPr>
+            <w:tcW w:type="dxa" w:w="6768"/>
+            <w:shd w:fill="0F2744"/>
+            <w:tcMar>
+              <w:top w:w="60" w:type="dxa"/>
+              <w:bottom w:w="60" w:type="dxa"/>
+              <w:left w:w="100" w:type="dxa"/>
+              <w:right w:w="100" w:type="dxa"/>
+            </w:tcMar>
+          </w:tcPr>
+          <w:p>
+            <w:r>
+              <w:rPr>
+                <w:rFonts w:ascii="Arial" w:hAnsi="Arial"/>
+                <w:b/>
+                <w:color w:val="FFFFFF"/>
+                <w:sz w:val="17"/>
+              </w:rPr>
+              <w:t>Deskripsi Fungsi &amp; Interaksi Pengguna</w:t>
+            </w:r>
+          </w:p>
+        </w:tc>
+      </w:tr>
+      <w:tr>
+        <w:tc>
+          <w:tcPr>
+            <w:tcW w:type="dxa" w:w="2592"/>
+            <w:shd w:fill="F8FAFC"/>
+            <w:tcMar>
+              <w:top w:w="40" w:type="dxa"/>
+              <w:bottom w:w="40" w:type="dxa"/>
+              <w:left w:w="100" w:type="dxa"/>
+              <w:right w:w="100" w:type="dxa"/>
+            </w:tcMar>
+          </w:tcPr>
+          <w:p>
+            <w:r>
+              <w:rPr>
+                <w:rFonts w:ascii="Arial" w:hAnsi="Arial"/>
+                <w:b/>
+                <w:color w:val="0284C7"/>
+                <w:sz w:val="17"/>
+              </w:rPr>
+              <w:t>1. Infografis K3 Elektronika</w:t>
+            </w:r>
+          </w:p>
+        </w:tc>
+        <w:tc>
+          <w:tcPr>
+            <w:tcW w:type="dxa" w:w="6768"/>
+            <w:shd w:fill="F8FAFC"/>
+            <w:tcMar>
+              <w:top w:w="40" w:type="dxa"/>
+              <w:bottom w:w="40" w:type="dxa"/>
+              <w:left w:w="100" w:type="dxa"/>
+              <w:right w:w="100" w:type="dxa"/>
+            </w:tcMar>
+          </w:tcPr>
+          <w:p>
+            <w:r>
+              <w:rPr>
+                <w:rFonts w:ascii="Arial" w:hAnsi="Arial"/>
+                <w:color w:val="334155"/>
+                <w:sz w:val="17"/>
+              </w:rPr>
+              <w:t>Pedoman penggunaan gelang antistatis, pembuangan muatan statis tubuh, dan penggunaan obeng bertip magnetik.</w:t>
+            </w:r>
+          </w:p>
+        </w:tc>
+      </w:tr>
+      <w:tr>
+        <w:tc>
+          <w:tcPr>
+            <w:tcW w:type="dxa" w:w="2592"/>
+            <w:shd w:fill="FFFFFF"/>
+            <w:tcMar>
+              <w:top w:w="40" w:type="dxa"/>
+              <w:bottom w:w="40" w:type="dxa"/>
+              <w:left w:w="100" w:type="dxa"/>
+              <w:right w:w="100" w:type="dxa"/>
+            </w:tcMar>
+          </w:tcPr>
+          <w:p>
+            <w:r>
+              <w:rPr>
+                <w:rFonts w:ascii="Arial" w:hAnsi="Arial"/>
+                <w:b/>
+                <w:color w:val="0284C7"/>
+                <w:sz w:val="17"/>
+              </w:rPr>
+              <w:t>2. Runtutan SOP 5 Tahap</w:t>
+            </w:r>
+          </w:p>
+        </w:tc>
+        <w:tc>
+          <w:tcPr>
+            <w:tcW w:type="dxa" w:w="6768"/>
+            <w:shd w:fill="FFFFFF"/>
+            <w:tcMar>
+              <w:top w:w="40" w:type="dxa"/>
+              <w:bottom w:w="40" w:type="dxa"/>
+              <w:left w:w="100" w:type="dxa"/>
+              <w:right w:w="100" w:type="dxa"/>
+            </w:tcMar>
+          </w:tcPr>
+          <w:p>
+            <w:r>
+              <w:rPr>
+                <w:rFonts w:ascii="Arial" w:hAnsi="Arial"/>
+                <w:color w:val="334155"/>
+                <w:sz w:val="17"/>
+              </w:rPr>
+              <w:t>Urutan logis perakitan: (1) CPU, (2) RAM, (3) SSD M.2, (4) GPU PCIe, hingga (5) Kabel Daya 24-Pin ATX.</w:t>
+            </w:r>
+          </w:p>
+        </w:tc>
+      </w:tr>
+      <w:tr>
+        <w:tc>
+          <w:tcPr>
+            <w:tcW w:type="dxa" w:w="2592"/>
+            <w:shd w:fill="F8FAFC"/>
+            <w:tcMar>
+              <w:top w:w="40" w:type="dxa"/>
+              <w:bottom w:w="40" w:type="dxa"/>
+              <w:left w:w="100" w:type="dxa"/>
+              <w:right w:w="100" w:type="dxa"/>
+            </w:tcMar>
+          </w:tcPr>
+          <w:p>
+            <w:r>
+              <w:rPr>
+                <w:rFonts w:ascii="Arial" w:hAnsi="Arial"/>
+                <w:b/>
+                <w:color w:val="0284C7"/>
+                <w:sz w:val="17"/>
+              </w:rPr>
+              <w:t>3. Peringatan Keselamatan</w:t>
+            </w:r>
+          </w:p>
+        </w:tc>
+        <w:tc>
+          <w:tcPr>
+            <w:tcW w:type="dxa" w:w="6768"/>
+            <w:shd w:fill="F8FAFC"/>
+            <w:tcMar>
+              <w:top w:w="40" w:type="dxa"/>
+              <w:bottom w:w="40" w:type="dxa"/>
+              <w:left w:w="100" w:type="dxa"/>
+              <w:right w:w="100" w:type="dxa"/>
+            </w:tcMar>
+          </w:tcPr>
+          <w:p>
+            <w:r>
+              <w:rPr>
+                <w:rFonts w:ascii="Arial" w:hAnsi="Arial"/>
+                <w:color w:val="334155"/>
+                <w:sz w:val="17"/>
+              </w:rPr>
+              <w:t>Instruksi visual hal-hal yang dilarang keras, seperti menyentuh pin emas CPU atau memaksa modul memori terbalik.</w:t>
+            </w:r>
+          </w:p>
+        </w:tc>
+      </w:tr>
+    </w:tbl>
+    <w:p>
+      <w:pPr>
+        <w:spacing w:after="120"/>
+      </w:pPr>
+    </w:p>
+    <w:p>
+      <w:pPr>
+        <w:spacing w:before="160" w:after="60"/>
+        <w:jc w:val="center"/>
+      </w:pPr>
+      <w:r>
+        <w:drawing>
+          <wp:inline xmlns:a="http://schemas.openxmlformats.org/drawingml/2006/main" xmlns:pic="http://schemas.openxmlformats.org/drawingml/2006/picture">
+            <wp:extent cx="5303520" cy="2983230"/>
+            <wp:docPr id="4" name="Picture 4"/>
+            <wp:cNvGraphicFramePr>
+              <a:graphicFrameLocks noChangeAspect="1"/>
+            </wp:cNvGraphicFramePr>
+            <a:graphic>
+              <a:graphicData uri="http://schemas.openxmlformats.org/drawingml/2006/picture">
+                <pic:pic>
+                  <pic:nvPicPr>
+                    <pic:cNvPr id="0" name="4_meja_rakit_pc.png"/>
+                    <pic:cNvPicPr/>
+                  </pic:nvPicPr>
+                  <pic:blipFill>
+                    <a:blip r:embed="rId12"/>
+                    <a:stretch>
+                      <a:fillRect/>
+                    </a:stretch>
+                  </pic:blipFill>
+                  <pic:spPr>
+                    <a:xfrm>
+                      <a:off x="0" y="0"/>
+                      <a:ext cx="5303520" cy="2983230"/>
+                    </a:xfrm>
+                    <a:prstGeom prst="rect"/>
+                  </pic:spPr>
+                </pic:pic>
+              </a:graphicData>
+            </a:graphic>
+          </wp:inline>
+        </w:drawing>
+      </w:r>
+    </w:p>
+    <w:p>
+      <w:pPr>
+        <w:spacing w:after="80"/>
+        <w:jc w:val="center"/>
+      </w:pPr>
+      <w:r>
+        <w:rPr>
+          <w:rFonts w:ascii="Arial" w:hAnsi="Arial"/>
+          <w:b/>
+          <w:color w:val="0F2744"/>
+          <w:sz w:val="18"/>
+        </w:rPr>
+        <w:t xml:space="preserve">Gambar 4: </w:t>
+      </w:r>
+      <w:r>
+        <w:rPr>
+          <w:rFonts w:ascii="Arial" w:hAnsi="Arial"/>
+          <w:i/>
+          <w:color w:val="475569"/>
+          <w:sz w:val="18"/>
+        </w:rPr>
+        <w:t>Meja Kerja Perakitan PC Interaktif (Simulasi Inti)</w:t>
+      </w:r>
+    </w:p>
+    <w:tbl>
+      <w:tblPr>
+        <w:tblW w:type="auto" w:w="0"/>
+        <w:jc w:val="center"/>
+        <w:tblLook w:firstColumn="1" w:firstRow="1" w:lastColumn="0" w:lastRow="0" w:noHBand="0" w:noVBand="1" w:val="04A0"/>
+      </w:tblPr>
+      <w:tblGrid>
+        <w:gridCol w:w="4680"/>
+        <w:gridCol w:w="4680"/>
+      </w:tblGrid>
+      <w:tr>
+        <w:tc>
+          <w:tcPr>
+            <w:tcW w:type="dxa" w:w="2592"/>
+            <w:shd w:fill="0F2744"/>
+            <w:tcMar>
+              <w:top w:w="60" w:type="dxa"/>
+              <w:bottom w:w="60" w:type="dxa"/>
+              <w:left w:w="100" w:type="dxa"/>
+              <w:right w:w="100" w:type="dxa"/>
+            </w:tcMar>
+          </w:tcPr>
+          <w:p>
+            <w:r>
+              <w:rPr>
+                <w:rFonts w:ascii="Arial" w:hAnsi="Arial"/>
+                <w:b/>
+                <w:color w:val="FFFFFF"/>
+                <w:sz w:val="17"/>
+              </w:rPr>
+              <w:t>Penanda / Bagian UI</w:t>
+            </w:r>
+          </w:p>
+        </w:tc>
+        <w:tc>
+          <w:tcPr>
+            <w:tcW w:type="dxa" w:w="6768"/>
+            <w:shd w:fill="0F2744"/>
+            <w:tcMar>
+              <w:top w:w="60" w:type="dxa"/>
+              <w:bottom w:w="60" w:type="dxa"/>
+              <w:left w:w="100" w:type="dxa"/>
+              <w:right w:w="100" w:type="dxa"/>
+            </w:tcMar>
+          </w:tcPr>
+          <w:p>
+            <w:r>
+              <w:rPr>
+                <w:rFonts w:ascii="Arial" w:hAnsi="Arial"/>
+                <w:b/>
+                <w:color w:val="FFFFFF"/>
+                <w:sz w:val="17"/>
+              </w:rPr>
+              <w:t>Deskripsi Fungsi &amp; Interaksi Pengguna</w:t>
+            </w:r>
+          </w:p>
+        </w:tc>
+      </w:tr>
+      <w:tr>
+        <w:tc>
+          <w:tcPr>
+            <w:tcW w:type="dxa" w:w="2592"/>
+            <w:shd w:fill="F8FAFC"/>
+            <w:tcMar>
+              <w:top w:w="40" w:type="dxa"/>
+              <w:bottom w:w="40" w:type="dxa"/>
+              <w:left w:w="100" w:type="dxa"/>
+              <w:right w:w="100" w:type="dxa"/>
+            </w:tcMar>
+          </w:tcPr>
+          <w:p>
+            <w:r>
+              <w:rPr>
+                <w:rFonts w:ascii="Arial" w:hAnsi="Arial"/>
+                <w:b/>
+                <w:color w:val="0284C7"/>
+                <w:sz w:val="17"/>
+              </w:rPr>
+              <w:t>1. Stepper Panduan Dinamis</w:t>
+            </w:r>
+          </w:p>
+        </w:tc>
+        <w:tc>
+          <w:tcPr>
+            <w:tcW w:type="dxa" w:w="6768"/>
+            <w:shd w:fill="F8FAFC"/>
+            <w:tcMar>
+              <w:top w:w="40" w:type="dxa"/>
+              <w:bottom w:w="40" w:type="dxa"/>
+              <w:left w:w="100" w:type="dxa"/>
+              <w:right w:w="100" w:type="dxa"/>
+            </w:tcMar>
+          </w:tcPr>
+          <w:p>
+            <w:r>
+              <w:rPr>
+                <w:rFonts w:ascii="Arial" w:hAnsi="Arial"/>
+                <w:color w:val="334155"/>
+                <w:sz w:val="17"/>
+              </w:rPr>
+              <w:t>Indikator langkah aktif (Langkah 1 dari 5) yang secara adaptif memandu komponen target yang harus dipasang.</w:t>
+            </w:r>
+          </w:p>
+        </w:tc>
+      </w:tr>
+      <w:tr>
+        <w:tc>
+          <w:tcPr>
+            <w:tcW w:type="dxa" w:w="2592"/>
+            <w:shd w:fill="FFFFFF"/>
+            <w:tcMar>
+              <w:top w:w="40" w:type="dxa"/>
+              <w:bottom w:w="40" w:type="dxa"/>
+              <w:left w:w="100" w:type="dxa"/>
+              <w:right w:w="100" w:type="dxa"/>
+            </w:tcMar>
+          </w:tcPr>
+          <w:p>
+            <w:r>
+              <w:rPr>
+                <w:rFonts w:ascii="Arial" w:hAnsi="Arial"/>
+                <w:b/>
+                <w:color w:val="0284C7"/>
+                <w:sz w:val="17"/>
+              </w:rPr>
+              <w:t>2. Rak Komponen Interaktif</w:t>
+            </w:r>
+          </w:p>
+        </w:tc>
+        <w:tc>
+          <w:tcPr>
+            <w:tcW w:type="dxa" w:w="6768"/>
+            <w:shd w:fill="FFFFFF"/>
+            <w:tcMar>
+              <w:top w:w="40" w:type="dxa"/>
+              <w:bottom w:w="40" w:type="dxa"/>
+              <w:left w:w="100" w:type="dxa"/>
+              <w:right w:w="100" w:type="dxa"/>
+            </w:tcMar>
+          </w:tcPr>
+          <w:p>
+            <w:r>
+              <w:rPr>
+                <w:rFonts w:ascii="Arial" w:hAnsi="Arial"/>
+                <w:color w:val="334155"/>
+                <w:sz w:val="17"/>
+              </w:rPr>
+              <w:t>Daftar komponen yang siap diseret (drag-and-drop) menuju soket target pada motherboard.</w:t>
+            </w:r>
+          </w:p>
+        </w:tc>
+      </w:tr>
+      <w:tr>
+        <w:tc>
+          <w:tcPr>
+            <w:tcW w:type="dxa" w:w="2592"/>
+            <w:shd w:fill="F8FAFC"/>
+            <w:tcMar>
+              <w:top w:w="40" w:type="dxa"/>
+              <w:bottom w:w="40" w:type="dxa"/>
+              <w:left w:w="100" w:type="dxa"/>
+              <w:right w:w="100" w:type="dxa"/>
+            </w:tcMar>
+          </w:tcPr>
+          <w:p>
+            <w:r>
+              <w:rPr>
+                <w:rFonts w:ascii="Arial" w:hAnsi="Arial"/>
+                <w:b/>
+                <w:color w:val="0284C7"/>
+                <w:sz w:val="17"/>
+              </w:rPr>
+              <w:t>3. Toggle Mode Skenario</w:t>
+            </w:r>
+          </w:p>
+        </w:tc>
+        <w:tc>
+          <w:tcPr>
+            <w:tcW w:type="dxa" w:w="6768"/>
+            <w:shd w:fill="F8FAFC"/>
+            <w:tcMar>
+              <w:top w:w="40" w:type="dxa"/>
+              <w:bottom w:w="40" w:type="dxa"/>
+              <w:left w:w="100" w:type="dxa"/>
+              <w:right w:w="100" w:type="dxa"/>
+            </w:tcMar>
+          </w:tcPr>
+          <w:p>
+            <w:r>
+              <w:rPr>
+                <w:rFonts w:ascii="Arial" w:hAnsi="Arial"/>
+                <w:color w:val="334155"/>
+                <w:sz w:val="17"/>
+              </w:rPr>
+              <w:t>Pilihan antara '🟢 Skenario Standar' (kompatibel) dan '🔍 Uji Masalah' (menguji komponen distraktor yang salah).</w:t>
+            </w:r>
+          </w:p>
+        </w:tc>
+      </w:tr>
+      <w:tr>
+        <w:tc>
+          <w:tcPr>
+            <w:tcW w:type="dxa" w:w="2592"/>
+            <w:shd w:fill="FFFFFF"/>
+            <w:tcMar>
+              <w:top w:w="40" w:type="dxa"/>
+              <w:bottom w:w="40" w:type="dxa"/>
+              <w:left w:w="100" w:type="dxa"/>
+              <w:right w:w="100" w:type="dxa"/>
+            </w:tcMar>
+          </w:tcPr>
+          <w:p>
+            <w:r>
+              <w:rPr>
+                <w:rFonts w:ascii="Arial" w:hAnsi="Arial"/>
+                <w:b/>
+                <w:color w:val="0284C7"/>
+                <w:sz w:val="17"/>
+              </w:rPr>
+              <w:t>4. Kanvas Motherboard ATX</w:t>
+            </w:r>
+          </w:p>
+        </w:tc>
+        <w:tc>
+          <w:tcPr>
+            <w:tcW w:type="dxa" w:w="6768"/>
+            <w:shd w:fill="FFFFFF"/>
+            <w:tcMar>
+              <w:top w:w="40" w:type="dxa"/>
+              <w:bottom w:w="40" w:type="dxa"/>
+              <w:left w:w="100" w:type="dxa"/>
+              <w:right w:w="100" w:type="dxa"/>
+            </w:tcMar>
+          </w:tcPr>
+          <w:p>
+            <w:r>
+              <w:rPr>
+                <w:rFonts w:ascii="Arial" w:hAnsi="Arial"/>
+                <w:color w:val="334155"/>
+                <w:sz w:val="17"/>
+              </w:rPr>
+              <w:t>Papan induk interaktif dengan drop-zone bersinar (highlight) saat komponen yang sesuai diarahkan mendekati soket.</w:t>
+            </w:r>
+          </w:p>
+        </w:tc>
+      </w:tr>
+      <w:tr>
+        <w:tc>
+          <w:tcPr>
+            <w:tcW w:type="dxa" w:w="2592"/>
+            <w:shd w:fill="F8FAFC"/>
+            <w:tcMar>
+              <w:top w:w="40" w:type="dxa"/>
+              <w:bottom w:w="40" w:type="dxa"/>
+              <w:left w:w="100" w:type="dxa"/>
+              <w:right w:w="100" w:type="dxa"/>
+            </w:tcMar>
+          </w:tcPr>
+          <w:p>
+            <w:r>
+              <w:rPr>
+                <w:rFonts w:ascii="Arial" w:hAnsi="Arial"/>
+                <w:b/>
+                <w:color w:val="0284C7"/>
+                <w:sz w:val="17"/>
+              </w:rPr>
+              <w:t>5. Panel Diagnostik &amp; Tombol Boot</w:t>
+            </w:r>
+          </w:p>
+        </w:tc>
+        <w:tc>
+          <w:tcPr>
+            <w:tcW w:type="dxa" w:w="6768"/>
+            <w:shd w:fill="F8FAFC"/>
+            <w:tcMar>
+              <w:top w:w="40" w:type="dxa"/>
+              <w:bottom w:w="40" w:type="dxa"/>
+              <w:left w:w="100" w:type="dxa"/>
+              <w:right w:w="100" w:type="dxa"/>
+            </w:tcMar>
+          </w:tcPr>
+          <w:p>
+            <w:r>
+              <w:rPr>
+                <w:rFonts w:ascii="Arial" w:hAnsi="Arial"/>
+                <w:color w:val="334155"/>
+                <w:sz w:val="17"/>
+              </w:rPr>
+              <w:t>Tombol '⚡ POWER ON / UJI BOOT' dan 4 lampu LED indikator (CPU, DRAM, VGA, BOOT) untuk menyimulasikan POST BIOS.</w:t>
+            </w:r>
+          </w:p>
+        </w:tc>
+      </w:tr>
+    </w:tbl>
+    <w:p>
+      <w:pPr>
+        <w:spacing w:after="120"/>
+      </w:pPr>
+    </w:p>
+    <w:p>
+      <w:pPr>
+        <w:spacing w:before="160" w:after="60"/>
+        <w:jc w:val="center"/>
+      </w:pPr>
+      <w:r>
+        <w:drawing>
+          <wp:inline xmlns:a="http://schemas.openxmlformats.org/drawingml/2006/main" xmlns:pic="http://schemas.openxmlformats.org/drawingml/2006/picture">
+            <wp:extent cx="5303520" cy="2983230"/>
+            <wp:docPr id="5" name="Picture 5"/>
+            <wp:cNvGraphicFramePr>
+              <a:graphicFrameLocks noChangeAspect="1"/>
+            </wp:cNvGraphicFramePr>
+            <a:graphic>
+              <a:graphicData uri="http://schemas.openxmlformats.org/drawingml/2006/picture">
+                <pic:pic>
+                  <pic:nvPicPr>
+                    <pic:cNvPr id="0" name="5_eksplorasi_digital.png"/>
+                    <pic:cNvPicPr/>
+                  </pic:nvPicPr>
+                  <pic:blipFill>
+                    <a:blip r:embed="rId13"/>
+                    <a:stretch>
+                      <a:fillRect/>
+                    </a:stretch>
+                  </pic:blipFill>
+                  <pic:spPr>
+                    <a:xfrm>
+                      <a:off x="0" y="0"/>
+                      <a:ext cx="5303520" cy="2983230"/>
+                    </a:xfrm>
+                    <a:prstGeom prst="rect"/>
+                  </pic:spPr>
+                </pic:pic>
+              </a:graphicData>
+            </a:graphic>
+          </wp:inline>
+        </w:drawing>
+      </w:r>
+    </w:p>
+    <w:p>
+      <w:pPr>
+        <w:spacing w:after="80"/>
+        <w:jc w:val="center"/>
+      </w:pPr>
+      <w:r>
+        <w:rPr>
+          <w:rFonts w:ascii="Arial" w:hAnsi="Arial"/>
+          <w:b/>
+          <w:color w:val="0F2744"/>
+          <w:sz w:val="18"/>
+        </w:rPr>
+        <w:t xml:space="preserve">Gambar 5: </w:t>
+      </w:r>
+      <w:r>
+        <w:rPr>
+          <w:rFonts w:ascii="Arial" w:hAnsi="Arial"/>
+          <w:i/>
+          <w:color w:val="475569"/>
+          <w:sz w:val="18"/>
+        </w:rPr>
+        <w:t>Wahana Eksplorasi Digital (Biner, RGB 24-Bit &amp; Gerbang Logika)</w:t>
+      </w:r>
+    </w:p>
+    <w:tbl>
+      <w:tblPr>
+        <w:tblW w:type="auto" w:w="0"/>
+        <w:jc w:val="center"/>
+        <w:tblLook w:firstColumn="1" w:firstRow="1" w:lastColumn="0" w:lastRow="0" w:noHBand="0" w:noVBand="1" w:val="04A0"/>
+      </w:tblPr>
+      <w:tblGrid>
+        <w:gridCol w:w="4680"/>
+        <w:gridCol w:w="4680"/>
+      </w:tblGrid>
+      <w:tr>
+        <w:tc>
+          <w:tcPr>
+            <w:tcW w:type="dxa" w:w="2592"/>
+            <w:shd w:fill="0F2744"/>
+            <w:tcMar>
+              <w:top w:w="60" w:type="dxa"/>
+              <w:bottom w:w="60" w:type="dxa"/>
+              <w:left w:w="100" w:type="dxa"/>
+              <w:right w:w="100" w:type="dxa"/>
+            </w:tcMar>
+          </w:tcPr>
+          <w:p>
+            <w:r>
+              <w:rPr>
+                <w:rFonts w:ascii="Arial" w:hAnsi="Arial"/>
+                <w:b/>
+                <w:color w:val="FFFFFF"/>
+                <w:sz w:val="17"/>
+              </w:rPr>
+              <w:t>Penanda / Bagian UI</w:t>
+            </w:r>
+          </w:p>
+        </w:tc>
+        <w:tc>
+          <w:tcPr>
+            <w:tcW w:type="dxa" w:w="6768"/>
+            <w:shd w:fill="0F2744"/>
+            <w:tcMar>
+              <w:top w:w="60" w:type="dxa"/>
+              <w:bottom w:w="60" w:type="dxa"/>
+              <w:left w:w="100" w:type="dxa"/>
+              <w:right w:w="100" w:type="dxa"/>
+            </w:tcMar>
+          </w:tcPr>
+          <w:p>
+            <w:r>
+              <w:rPr>
+                <w:rFonts w:ascii="Arial" w:hAnsi="Arial"/>
+                <w:b/>
+                <w:color w:val="FFFFFF"/>
+                <w:sz w:val="17"/>
+              </w:rPr>
+              <w:t>Deskripsi Fungsi &amp; Interaksi Pengguna</w:t>
+            </w:r>
+          </w:p>
+        </w:tc>
+      </w:tr>
+      <w:tr>
+        <w:tc>
+          <w:tcPr>
+            <w:tcW w:type="dxa" w:w="2592"/>
+            <w:shd w:fill="F8FAFC"/>
+            <w:tcMar>
+              <w:top w:w="40" w:type="dxa"/>
+              <w:bottom w:w="40" w:type="dxa"/>
+              <w:left w:w="100" w:type="dxa"/>
+              <w:right w:w="100" w:type="dxa"/>
+            </w:tcMar>
+          </w:tcPr>
+          <w:p>
+            <w:r>
+              <w:rPr>
+                <w:rFonts w:ascii="Arial" w:hAnsi="Arial"/>
+                <w:b/>
+                <w:color w:val="0284C7"/>
+                <w:sz w:val="17"/>
+              </w:rPr>
+              <w:t>1. Sakelar Biner 8-Bit</w:t>
+            </w:r>
+          </w:p>
+        </w:tc>
+        <w:tc>
+          <w:tcPr>
+            <w:tcW w:type="dxa" w:w="6768"/>
+            <w:shd w:fill="F8FAFC"/>
+            <w:tcMar>
+              <w:top w:w="40" w:type="dxa"/>
+              <w:bottom w:w="40" w:type="dxa"/>
+              <w:left w:w="100" w:type="dxa"/>
+              <w:right w:w="100" w:type="dxa"/>
+            </w:tcMar>
+          </w:tcPr>
+          <w:p>
+            <w:r>
+              <w:rPr>
+                <w:rFonts w:ascii="Arial" w:hAnsi="Arial"/>
+                <w:color w:val="334155"/>
+                <w:sz w:val="17"/>
+              </w:rPr>
+              <w:t>8 sakelar toggle (bit 0-7) dengan perhitungan nilai desimal real-time dan kuis tebak angka interaktif.</w:t>
+            </w:r>
+          </w:p>
+        </w:tc>
+      </w:tr>
+      <w:tr>
+        <w:tc>
+          <w:tcPr>
+            <w:tcW w:type="dxa" w:w="2592"/>
+            <w:shd w:fill="FFFFFF"/>
+            <w:tcMar>
+              <w:top w:w="40" w:type="dxa"/>
+              <w:bottom w:w="40" w:type="dxa"/>
+              <w:left w:w="100" w:type="dxa"/>
+              <w:right w:w="100" w:type="dxa"/>
+            </w:tcMar>
+          </w:tcPr>
+          <w:p>
+            <w:r>
+              <w:rPr>
+                <w:rFonts w:ascii="Arial" w:hAnsi="Arial"/>
+                <w:b/>
+                <w:color w:val="0284C7"/>
+                <w:sz w:val="17"/>
+              </w:rPr>
+              <w:t>2. Simulator Warna RGB 24-Bit</w:t>
+            </w:r>
+          </w:p>
+        </w:tc>
+        <w:tc>
+          <w:tcPr>
+            <w:tcW w:type="dxa" w:w="6768"/>
+            <w:shd w:fill="FFFFFF"/>
+            <w:tcMar>
+              <w:top w:w="40" w:type="dxa"/>
+              <w:bottom w:w="40" w:type="dxa"/>
+              <w:left w:w="100" w:type="dxa"/>
+              <w:right w:w="100" w:type="dxa"/>
+            </w:tcMar>
+          </w:tcPr>
+          <w:p>
+            <w:r>
+              <w:rPr>
+                <w:rFonts w:ascii="Arial" w:hAnsi="Arial"/>
+                <w:color w:val="334155"/>
+                <w:sz w:val="17"/>
+              </w:rPr>
+              <w:t>Tiga slider interaktif Red (0-255), Green (0-255), Blue (0-255) yang menghasilkan visualisasi warna dan kode HEX (#RRGGBB).</w:t>
+            </w:r>
+          </w:p>
+        </w:tc>
+      </w:tr>
+      <w:tr>
+        <w:tc>
+          <w:tcPr>
+            <w:tcW w:type="dxa" w:w="2592"/>
+            <w:shd w:fill="F8FAFC"/>
+            <w:tcMar>
+              <w:top w:w="40" w:type="dxa"/>
+              <w:bottom w:w="40" w:type="dxa"/>
+              <w:left w:w="100" w:type="dxa"/>
+              <w:right w:w="100" w:type="dxa"/>
+            </w:tcMar>
+          </w:tcPr>
+          <w:p>
+            <w:r>
+              <w:rPr>
+                <w:rFonts w:ascii="Arial" w:hAnsi="Arial"/>
+                <w:b/>
+                <w:color w:val="0284C7"/>
+                <w:sz w:val="17"/>
+              </w:rPr>
+              <w:t>3. Laboratorium Gerbang Logika</w:t>
+            </w:r>
+          </w:p>
+        </w:tc>
+        <w:tc>
+          <w:tcPr>
+            <w:tcW w:type="dxa" w:w="6768"/>
+            <w:shd w:fill="F8FAFC"/>
+            <w:tcMar>
+              <w:top w:w="40" w:type="dxa"/>
+              <w:bottom w:w="40" w:type="dxa"/>
+              <w:left w:w="100" w:type="dxa"/>
+              <w:right w:w="100" w:type="dxa"/>
+            </w:tcMar>
+          </w:tcPr>
+          <w:p>
+            <w:r>
+              <w:rPr>
+                <w:rFonts w:ascii="Arial" w:hAnsi="Arial"/>
+                <w:color w:val="334155"/>
+                <w:sz w:val="17"/>
+              </w:rPr>
+              <w:t>Simulasi interaktif 6 gerbang (AND, OR, NOT, XOR, NAND, NOR) dilengkapi tabel kebenaran dinamis.</w:t>
+            </w:r>
+          </w:p>
+        </w:tc>
+      </w:tr>
+    </w:tbl>
+    <w:p>
+      <w:pPr>
+        <w:spacing w:after="120"/>
+      </w:pPr>
+    </w:p>
+    <w:p>
+      <w:pPr>
+        <w:spacing w:before="160" w:after="60"/>
+        <w:jc w:val="center"/>
+      </w:pPr>
+      <w:r>
+        <w:drawing>
+          <wp:inline xmlns:a="http://schemas.openxmlformats.org/drawingml/2006/main" xmlns:pic="http://schemas.openxmlformats.org/drawingml/2006/picture">
+            <wp:extent cx="5303520" cy="2983230"/>
+            <wp:docPr id="6" name="Picture 6"/>
+            <wp:cNvGraphicFramePr>
+              <a:graphicFrameLocks noChangeAspect="1"/>
+            </wp:cNvGraphicFramePr>
+            <a:graphic>
+              <a:graphicData uri="http://schemas.openxmlformats.org/drawingml/2006/picture">
+                <pic:pic>
+                  <pic:nvPicPr>
+                    <pic:cNvPr id="0" name="6_lkpd_evaluasi.png"/>
+                    <pic:cNvPicPr/>
+                  </pic:nvPicPr>
+                  <pic:blipFill>
+                    <a:blip r:embed="rId14"/>
+                    <a:stretch>
+                      <a:fillRect/>
+                    </a:stretch>
+                  </pic:blipFill>
+                  <pic:spPr>
+                    <a:xfrm>
+                      <a:off x="0" y="0"/>
+                      <a:ext cx="5303520" cy="2983230"/>
+                    </a:xfrm>
+                    <a:prstGeom prst="rect"/>
+                  </pic:spPr>
+                </pic:pic>
+              </a:graphicData>
+            </a:graphic>
+          </wp:inline>
+        </w:drawing>
+      </w:r>
+    </w:p>
+    <w:p>
+      <w:pPr>
+        <w:spacing w:after="80"/>
+        <w:jc w:val="center"/>
+      </w:pPr>
+      <w:r>
+        <w:rPr>
+          <w:rFonts w:ascii="Arial" w:hAnsi="Arial"/>
+          <w:b/>
+          <w:color w:val="0F2744"/>
+          <w:sz w:val="18"/>
+        </w:rPr>
+        <w:t xml:space="preserve">Gambar 6: </w:t>
+      </w:r>
+      <w:r>
+        <w:rPr>
+          <w:rFonts w:ascii="Arial" w:hAnsi="Arial"/>
+          <w:i/>
+          <w:color w:val="475569"/>
+          <w:sz w:val="18"/>
+        </w:rPr>
+        <w:t>Modul LKPD Digital &amp; Kuis Evaluasi Formatif</w:t>
+      </w:r>
+    </w:p>
+    <w:tbl>
+      <w:tblPr>
+        <w:tblW w:type="auto" w:w="0"/>
+        <w:jc w:val="center"/>
+        <w:tblLook w:firstColumn="1" w:firstRow="1" w:lastColumn="0" w:lastRow="0" w:noHBand="0" w:noVBand="1" w:val="04A0"/>
+      </w:tblPr>
+      <w:tblGrid>
+        <w:gridCol w:w="4680"/>
+        <w:gridCol w:w="4680"/>
+      </w:tblGrid>
+      <w:tr>
+        <w:tc>
+          <w:tcPr>
+            <w:tcW w:type="dxa" w:w="2592"/>
+            <w:shd w:fill="0F2744"/>
+            <w:tcMar>
+              <w:top w:w="60" w:type="dxa"/>
+              <w:bottom w:w="60" w:type="dxa"/>
+              <w:left w:w="100" w:type="dxa"/>
+              <w:right w:w="100" w:type="dxa"/>
+            </w:tcMar>
+          </w:tcPr>
+          <w:p>
+            <w:r>
+              <w:rPr>
+                <w:rFonts w:ascii="Arial" w:hAnsi="Arial"/>
+                <w:b/>
+                <w:color w:val="FFFFFF"/>
+                <w:sz w:val="17"/>
+              </w:rPr>
+              <w:t>Penanda / Bagian UI</w:t>
+            </w:r>
+          </w:p>
+        </w:tc>
+        <w:tc>
+          <w:tcPr>
+            <w:tcW w:type="dxa" w:w="6768"/>
+            <w:shd w:fill="0F2744"/>
+            <w:tcMar>
+              <w:top w:w="60" w:type="dxa"/>
+              <w:bottom w:w="60" w:type="dxa"/>
+              <w:left w:w="100" w:type="dxa"/>
+              <w:right w:w="100" w:type="dxa"/>
+            </w:tcMar>
+          </w:tcPr>
+          <w:p>
+            <w:r>
+              <w:rPr>
+                <w:rFonts w:ascii="Arial" w:hAnsi="Arial"/>
+                <w:b/>
+                <w:color w:val="FFFFFF"/>
+                <w:sz w:val="17"/>
+              </w:rPr>
+              <w:t>Deskripsi Fungsi &amp; Interaksi Pengguna</w:t>
+            </w:r>
+          </w:p>
+        </w:tc>
+      </w:tr>
+      <w:tr>
+        <w:tc>
+          <w:tcPr>
+            <w:tcW w:type="dxa" w:w="2592"/>
+            <w:shd w:fill="F8FAFC"/>
+            <w:tcMar>
+              <w:top w:w="40" w:type="dxa"/>
+              <w:bottom w:w="40" w:type="dxa"/>
+              <w:left w:w="100" w:type="dxa"/>
+              <w:right w:w="100" w:type="dxa"/>
+            </w:tcMar>
+          </w:tcPr>
+          <w:p>
+            <w:r>
+              <w:rPr>
+                <w:rFonts w:ascii="Arial" w:hAnsi="Arial"/>
+                <w:b/>
+                <w:color w:val="0284C7"/>
+                <w:sz w:val="17"/>
+              </w:rPr>
+              <w:t>1. Lembar Kerja Peserta Didik</w:t>
+            </w:r>
+          </w:p>
+        </w:tc>
+        <w:tc>
+          <w:tcPr>
+            <w:tcW w:type="dxa" w:w="6768"/>
+            <w:shd w:fill="F8FAFC"/>
+            <w:tcMar>
+              <w:top w:w="40" w:type="dxa"/>
+              <w:bottom w:w="40" w:type="dxa"/>
+              <w:left w:w="100" w:type="dxa"/>
+              <w:right w:w="100" w:type="dxa"/>
+            </w:tcMar>
+          </w:tcPr>
+          <w:p>
+            <w:r>
+              <w:rPr>
+                <w:rFonts w:ascii="Arial" w:hAnsi="Arial"/>
+                <w:color w:val="334155"/>
+                <w:sz w:val="17"/>
+              </w:rPr>
+              <w:t>Penugasan terstruktur yang mencakup identifikasi bagian, analisa kasus kerusakan, dan penalaran teknis.</w:t>
+            </w:r>
+          </w:p>
+        </w:tc>
+      </w:tr>
+      <w:tr>
+        <w:tc>
+          <w:tcPr>
+            <w:tcW w:type="dxa" w:w="2592"/>
+            <w:shd w:fill="FFFFFF"/>
+            <w:tcMar>
+              <w:top w:w="40" w:type="dxa"/>
+              <w:bottom w:w="40" w:type="dxa"/>
+              <w:left w:w="100" w:type="dxa"/>
+              <w:right w:w="100" w:type="dxa"/>
+            </w:tcMar>
+          </w:tcPr>
+          <w:p>
+            <w:r>
+              <w:rPr>
+                <w:rFonts w:ascii="Arial" w:hAnsi="Arial"/>
+                <w:b/>
+                <w:color w:val="0284C7"/>
+                <w:sz w:val="17"/>
+              </w:rPr>
+              <w:t>2. Sistem Kuis Interaktif</w:t>
+            </w:r>
+          </w:p>
+        </w:tc>
+        <w:tc>
+          <w:tcPr>
+            <w:tcW w:type="dxa" w:w="6768"/>
+            <w:shd w:fill="FFFFFF"/>
+            <w:tcMar>
+              <w:top w:w="40" w:type="dxa"/>
+              <w:bottom w:w="40" w:type="dxa"/>
+              <w:left w:w="100" w:type="dxa"/>
+              <w:right w:w="100" w:type="dxa"/>
+            </w:tcMar>
+          </w:tcPr>
+          <w:p>
+            <w:r>
+              <w:rPr>
+                <w:rFonts w:ascii="Arial" w:hAnsi="Arial"/>
+                <w:color w:val="334155"/>
+                <w:sz w:val="17"/>
+              </w:rPr>
+              <w:t>Evaluasi pilihan ganda berbasis stimulus dengan umpan balik langsung (pembahasan ilmiah seketika).</w:t>
+            </w:r>
+          </w:p>
+        </w:tc>
+      </w:tr>
+      <w:tr>
+        <w:tc>
+          <w:tcPr>
+            <w:tcW w:type="dxa" w:w="2592"/>
+            <w:shd w:fill="F8FAFC"/>
+            <w:tcMar>
+              <w:top w:w="40" w:type="dxa"/>
+              <w:bottom w:w="40" w:type="dxa"/>
+              <w:left w:w="100" w:type="dxa"/>
+              <w:right w:w="100" w:type="dxa"/>
+            </w:tcMar>
+          </w:tcPr>
+          <w:p>
+            <w:r>
+              <w:rPr>
+                <w:rFonts w:ascii="Arial" w:hAnsi="Arial"/>
+                <w:b/>
+                <w:color w:val="0284C7"/>
+                <w:sz w:val="17"/>
+              </w:rPr>
+              <w:t>3. Rekap Skor &amp; Pencetakan Nilai</w:t>
+            </w:r>
+          </w:p>
+        </w:tc>
+        <w:tc>
+          <w:tcPr>
+            <w:tcW w:type="dxa" w:w="6768"/>
+            <w:shd w:fill="F8FAFC"/>
+            <w:tcMar>
+              <w:top w:w="40" w:type="dxa"/>
+              <w:bottom w:w="40" w:type="dxa"/>
+              <w:left w:w="100" w:type="dxa"/>
+              <w:right w:w="100" w:type="dxa"/>
+            </w:tcMar>
+          </w:tcPr>
+          <w:p>
+            <w:r>
+              <w:rPr>
+                <w:rFonts w:ascii="Arial" w:hAnsi="Arial"/>
+                <w:color w:val="334155"/>
+                <w:sz w:val="17"/>
+              </w:rPr>
+              <w:t>Sistem kalkulasi nilai otomatis yang dapat dicetak atau disimpan sebagai arsip portofolio siswa.</w:t>
             </w:r>
           </w:p>
         </w:tc>
@@ -395,636 +2991,419 @@
     <w:p>
       <w:pPr>
         <w:keepNext/>
-        <w:spacing w:before="320" w:after="120"/>
+        <w:spacing w:before="280" w:after="80"/>
       </w:pPr>
       <w:r>
         <w:rPr>
           <w:rFonts w:ascii="Arial" w:hAnsi="Arial"/>
           <w:b/>
-          <w:color w:val="1E3A8A"/>
-          <w:sz w:val="24"/>
+          <w:color w:val="0F2744"/>
+          <w:sz w:val="26"/>
         </w:rPr>
-        <w:t>1. Deskripsi &amp; Latar Belakang Inovasi</w:t>
-      </w:r>
-    </w:p>
-    <w:p>
-      <w:pPr>
-        <w:spacing w:after="120" w:line="276" w:lineRule="auto"/>
-      </w:pPr>
-      <w:r>
-        <w:rPr>
-          <w:rFonts w:ascii="Arial" w:hAnsi="Arial"/>
-          <w:i w:val="0"/>
-          <w:color w:val="0F172A"/>
-          <w:sz w:val="20"/>
-        </w:rPr>
-        <w:t>Pembelajaran materi Sistem Komputer (SK) di jenjang SMP seringkali dihadapkan pada kendala keterbatasan perangkat keras fisik. Banyak sekolah tidak memiliki unit komputer cadangan yang aman untuk dibongkar-pasang oleh peserta didik karena risiko kerusakan komponen yang mahal dan bahaya sengatan listrik.</w:t>
-      </w:r>
-    </w:p>
-    <w:p>
-      <w:pPr>
-        <w:spacing w:after="120" w:line="276" w:lineRule="auto"/>
-      </w:pPr>
-      <w:r>
-        <w:rPr>
-          <w:rFonts w:ascii="Arial" w:hAnsi="Arial"/>
-          <w:i w:val="0"/>
-          <w:color w:val="0F172A"/>
-          <w:sz w:val="20"/>
-        </w:rPr>
-        <w:t>Lab Maya Sistem Komputer: Perakitan PC &amp; Logika Digital hadir sebagai solusi laboratorium virtual berbasis peramban (web browser) yang aman, interaktif, dan komprehensif. Melalui media ini, peserta didik dapat melakukan eksperimen perakitan motherboard ATX modern secara taktil (drag &amp; drop), menguji nyala mesin (POST test) melalui terminal diagnostik BIOS, serta menyelami cara kerja komputasi internal melalui simulasi sakelar bilangan biner, percampuran warna monitor 24-bit (RGB), dan logika sirkuit digital (Logic Gates).</w:t>
+        <w:t>BAB V. FITUR PEDAGOGIS &amp; INTERAKTIVITAS KHUSUS</w:t>
       </w:r>
     </w:p>
     <w:p>
       <w:pPr>
         <w:keepNext/>
-        <w:spacing w:before="320" w:after="120"/>
-      </w:pPr>
-      <w:r>
-        <w:rPr>
-          <w:rFonts w:ascii="Arial" w:hAnsi="Arial"/>
-          <w:b/>
-          <w:color w:val="1E3A8A"/>
-          <w:sz w:val="24"/>
-        </w:rPr>
-        <w:t>2. Keselarasan Kurikulum (Capaian &amp; Tujuan Pembelajaran)</w:t>
-      </w:r>
-    </w:p>
-    <w:p>
-      <w:pPr>
-        <w:spacing w:after="120" w:line="276" w:lineRule="auto"/>
-      </w:pPr>
-      <w:r>
-        <w:rPr>
-          <w:rFonts w:ascii="Arial" w:hAnsi="Arial"/>
-          <w:i w:val="0"/>
-          <w:color w:val="0F172A"/>
-          <w:sz w:val="20"/>
-        </w:rPr>
-        <w:t>Karya ini diselaraskan secara ketat dengan Keputusan Kepala BSKAP Kemendikbudristek No. 032/H/KR/2024 tentang Capaian Pembelajaran pada Kurikulum Merdeka Jenjang SMP Fase D (Elemen Sistem Komputer):</w:t>
-      </w:r>
-    </w:p>
-    <w:p>
-      <w:pPr>
-        <w:pStyle w:val="ListBullet"/>
-        <w:spacing w:after="80" w:line="276" w:lineRule="auto"/>
-      </w:pPr>
-      <w:r>
-        <w:rPr>
-          <w:rFonts w:ascii="Arial" w:hAnsi="Arial"/>
-          <w:b/>
-          <w:color w:val="0F172A"/>
-          <w:sz w:val="20"/>
-        </w:rPr>
-        <w:t xml:space="preserve">Capaian Pembelajaran (CP): </w:t>
-      </w:r>
-      <w:r>
-        <w:rPr>
-          <w:rFonts w:ascii="Arial" w:hAnsi="Arial"/>
-          <w:color w:val="0F172A"/>
-          <w:sz w:val="20"/>
-        </w:rPr>
-        <w:t>"Peserta didik mampu mendeskripsikan komponen, fungsi, dan cara kerja komputer yang membentuk sebuah sistem komputasi, serta memahami mekanisme internal penyimpanan dan representasi data pada sistem komputer."</w:t>
-      </w:r>
-    </w:p>
-    <w:p>
-      <w:pPr>
-        <w:pStyle w:val="ListBullet"/>
-        <w:spacing w:after="80" w:line="276" w:lineRule="auto"/>
-      </w:pPr>
-      <w:r>
-        <w:rPr>
-          <w:rFonts w:ascii="Arial" w:hAnsi="Arial"/>
-          <w:b/>
-          <w:color w:val="0F172A"/>
-          <w:sz w:val="20"/>
-        </w:rPr>
-        <w:t xml:space="preserve">Tujuan Pembelajaran 1 (TP-1): </w:t>
-      </w:r>
-      <w:r>
-        <w:rPr>
-          <w:rFonts w:ascii="Arial" w:hAnsi="Arial"/>
-          <w:color w:val="0F172A"/>
-          <w:sz w:val="20"/>
-        </w:rPr>
-        <w:t>Peserta didik mampu mengidentifikasi dan mengkategorikan 5 komponen utama perangkat keras (CPU, RAM, Media Penyimpanan SSD, GPU, dan PSU) serta fungsinya pada sirkuit motherboard ATX.</w:t>
-      </w:r>
-    </w:p>
-    <w:p>
-      <w:pPr>
-        <w:pStyle w:val="ListBullet"/>
-        <w:spacing w:after="80" w:line="276" w:lineRule="auto"/>
-      </w:pPr>
-      <w:r>
-        <w:rPr>
-          <w:rFonts w:ascii="Arial" w:hAnsi="Arial"/>
-          <w:b/>
-          <w:color w:val="0F172A"/>
-          <w:sz w:val="20"/>
-        </w:rPr>
-        <w:t xml:space="preserve">Tujuan Pembelajaran 2 (TP-2): </w:t>
-      </w:r>
-      <w:r>
-        <w:rPr>
-          <w:rFonts w:ascii="Arial" w:hAnsi="Arial"/>
-          <w:color w:val="0F172A"/>
-          <w:sz w:val="20"/>
-        </w:rPr>
-        <w:t>Peserta didik mampu melakukan prosedur perakitan komputer secara virtual dengan alur logis terpandu dan mendiagnosis hasil Power-On Self-Test (POST) pada sistem BIOS.</w:t>
-      </w:r>
-    </w:p>
-    <w:p>
-      <w:pPr>
-        <w:pStyle w:val="ListBullet"/>
-        <w:spacing w:after="80" w:line="276" w:lineRule="auto"/>
-      </w:pPr>
-      <w:r>
-        <w:rPr>
-          <w:rFonts w:ascii="Arial" w:hAnsi="Arial"/>
-          <w:b/>
-          <w:color w:val="0F172A"/>
-          <w:sz w:val="20"/>
-        </w:rPr>
-        <w:t xml:space="preserve">Tujuan Pembelajaran 3 (TP-3): </w:t>
-      </w:r>
-      <w:r>
-        <w:rPr>
-          <w:rFonts w:ascii="Arial" w:hAnsi="Arial"/>
-          <w:color w:val="0F172A"/>
-          <w:sz w:val="20"/>
-        </w:rPr>
-        <w:t>Peserta didik mampu menganalisis representasi data biner (basis-2) dan pencampuran warna 24-bit RGB sebagai prinsip kerja fundamental pemrosesan komputer.</w:t>
-      </w:r>
-    </w:p>
-    <w:p>
-      <w:pPr>
-        <w:pStyle w:val="ListBullet"/>
-        <w:spacing w:after="80" w:line="276" w:lineRule="auto"/>
-      </w:pPr>
-      <w:r>
-        <w:rPr>
-          <w:rFonts w:ascii="Arial" w:hAnsi="Arial"/>
-          <w:b/>
-          <w:color w:val="0F172A"/>
-          <w:sz w:val="20"/>
-        </w:rPr>
-        <w:t xml:space="preserve">Tujuan Pembelajaran 4 (TP-4): </w:t>
-      </w:r>
-      <w:r>
-        <w:rPr>
-          <w:rFonts w:ascii="Arial" w:hAnsi="Arial"/>
-          <w:color w:val="0F172A"/>
-          <w:sz w:val="20"/>
-        </w:rPr>
-        <w:t>Peserta didik mampu menganalisis operasi logika dasar (AND, OR, NOT, XOR, NAND, NOR) yang membentuk sirkuit terpadu pada mikroprosesor.</w:t>
-      </w:r>
-    </w:p>
-    <w:p>
-      <w:pPr>
-        <w:keepNext/>
-        <w:spacing w:before="320" w:after="120"/>
-      </w:pPr>
-      <w:r>
-        <w:rPr>
-          <w:rFonts w:ascii="Arial" w:hAnsi="Arial"/>
-          <w:b/>
-          <w:color w:val="1E3A8A"/>
-          <w:sz w:val="24"/>
-        </w:rPr>
-        <w:t>3. Panduan Penggunaan Langkah demi Langkah (User Guide)</w:t>
-      </w:r>
-    </w:p>
-    <w:p>
-      <w:pPr>
-        <w:keepNext/>
-        <w:spacing w:before="240" w:after="80"/>
+        <w:spacing w:before="200" w:after="60"/>
       </w:pPr>
       <w:r>
         <w:rPr>
           <w:rFonts w:ascii="Arial" w:hAnsi="Arial"/>
           <w:b/>
           <w:color w:val="0284C7"/>
-          <w:sz w:val="21"/>
+          <w:sz w:val="22"/>
         </w:rPr>
-        <w:t>A. Akses &amp; Layar Pembuka</w:t>
+        <w:t>5.1 Scaffolding Pembelajaran Bertahap</w:t>
       </w:r>
     </w:p>
     <w:p>
       <w:pPr>
-        <w:pStyle w:val="ListBullet"/>
         <w:spacing w:after="80" w:line="276" w:lineRule="auto"/>
       </w:pPr>
       <w:r>
         <w:rPr>
           <w:rFonts w:ascii="Arial" w:hAnsi="Arial"/>
-          <w:b/>
-          <w:color w:val="0F172A"/>
-          <w:sz w:val="20"/>
+          <w:color w:val="1E293B"/>
+          <w:sz w:val="19"/>
         </w:rPr>
-        <w:t xml:space="preserve">Akses Mandiri: </w:t>
-      </w:r>
-      <w:r>
-        <w:rPr>
-          <w:rFonts w:ascii="Arial" w:hAnsi="Arial"/>
-          <w:color w:val="0F172A"/>
-          <w:sz w:val="20"/>
-        </w:rPr>
-        <w:t>Buka file index.html pada browser modern (Chrome, Edge, Firefox, Safari). Media berjalan 100% offline tanpa membutuhkan internet.</w:t>
-      </w:r>
-    </w:p>
-    <w:p>
-      <w:pPr>
-        <w:pStyle w:val="ListBullet"/>
-        <w:spacing w:after="80" w:line="276" w:lineRule="auto"/>
-      </w:pPr>
-      <w:r>
-        <w:rPr>
-          <w:rFonts w:ascii="Arial" w:hAnsi="Arial"/>
-          <w:b/>
-          <w:color w:val="0F172A"/>
-          <w:sz w:val="20"/>
-        </w:rPr>
-        <w:t xml:space="preserve">Rasio Layar 16:9: </w:t>
-      </w:r>
-      <w:r>
-        <w:rPr>
-          <w:rFonts w:ascii="Arial" w:hAnsi="Arial"/>
-          <w:color w:val="0F172A"/>
-          <w:sz w:val="20"/>
-        </w:rPr>
-        <w:t>Gunakan laptop atau PC untuk pengalaman terbaik. Jika dibuka di smartphone, miringkan posisi layar ke mode mendatar (Landscape) sesuai panduan overlay otomatis.</w:t>
-      </w:r>
-    </w:p>
-    <w:p>
-      <w:pPr>
-        <w:pStyle w:val="ListBullet"/>
-        <w:spacing w:after="80" w:line="276" w:lineRule="auto"/>
-      </w:pPr>
-      <w:r>
-        <w:rPr>
-          <w:rFonts w:ascii="Arial" w:hAnsi="Arial"/>
-          <w:b/>
-          <w:color w:val="0F172A"/>
-          <w:sz w:val="20"/>
-        </w:rPr>
-        <w:t xml:space="preserve">Memulai Eksplorasi: </w:t>
-      </w:r>
-      <w:r>
-        <w:rPr>
-          <w:rFonts w:ascii="Arial" w:hAnsi="Arial"/>
-          <w:color w:val="0F172A"/>
-          <w:sz w:val="20"/>
-        </w:rPr>
-        <w:t>Pada halaman depan (Cover), klik tombol ▶ MASUK LAB untuk masuk ke ruang eksperimen, atau klik 📖 Panduan untuk membaca ringkasan.</w:t>
+        <w:t>Lab Maya ini menerapkan scaffolding kognitif melalui panduan indikator langkah adaptif (Langkah 1 dari 5). Peserta didik yang baru pertama kali merakit komputer tidak akan merasa kewalahan karena sistem memberikan petunjuk visual yang jelas, drop-zone dengan highlight berkilau, dan pesan bimbingan kontekstual.</w:t>
       </w:r>
     </w:p>
     <w:p>
       <w:pPr>
         <w:keepNext/>
-        <w:spacing w:before="240" w:after="80"/>
+        <w:spacing w:before="200" w:after="60"/>
       </w:pPr>
       <w:r>
         <w:rPr>
           <w:rFonts w:ascii="Arial" w:hAnsi="Arial"/>
           <w:b/>
           <w:color w:val="0284C7"/>
-          <w:sz w:val="21"/>
+          <w:sz w:val="22"/>
         </w:rPr>
-        <w:t>B. Menjalankan Simulasi Rakit Komputer (Aktivitas Utama)</w:t>
+        <w:t>5.2 Umpan Balik Instan &amp; Konstruktif (Immediate Educational Feedback)</w:t>
+      </w:r>
+    </w:p>
+    <w:p>
+      <w:pPr>
+        <w:spacing w:after="80" w:line="276" w:lineRule="auto"/>
+      </w:pPr>
+      <w:r>
+        <w:rPr>
+          <w:rFonts w:ascii="Arial" w:hAnsi="Arial"/>
+          <w:color w:val="1E293B"/>
+          <w:sz w:val="19"/>
+        </w:rPr>
+        <w:t>Setiap interaksi pengguna langsung direspons dengan umpan balik multi-indera (visual dan audio):</w:t>
       </w:r>
     </w:p>
     <w:p>
       <w:pPr>
         <w:pStyle w:val="ListBullet"/>
-        <w:spacing w:after="80" w:line="276" w:lineRule="auto"/>
+        <w:spacing w:after="60" w:line="276" w:lineRule="auto"/>
       </w:pPr>
       <w:r>
         <w:rPr>
           <w:rFonts w:ascii="Arial" w:hAnsi="Arial"/>
           <w:b/>
-          <w:color w:val="0F172A"/>
-          <w:sz w:val="20"/>
+          <w:color w:val="0F2744"/>
+          <w:sz w:val="19"/>
         </w:rPr>
-        <w:t xml:space="preserve">Pemilihan Skenario: </w:t>
+        <w:t xml:space="preserve">Pemasangan Benar: </w:t>
       </w:r>
       <w:r>
         <w:rPr>
           <w:rFonts w:ascii="Arial" w:hAnsi="Arial"/>
-          <w:color w:val="0F172A"/>
-          <w:sz w:val="20"/>
+          <w:color w:val="1E293B"/>
+          <w:sz w:val="19"/>
         </w:rPr>
-        <w:t>Pilih '🟢 Skenario Standar' untuk perakitan normal berpanduan langkah, atau '🔍 Uji Masalah' untuk eksplorasi komponen pengecoh dan troubleshooting inkompatibilitas hardware.</w:t>
+        <w:t>Komponen mengunci sempurna pada soket motherboard disertai efek suara mekanis klik presisi dan notifikasi konfirmasi hijau.</w:t>
       </w:r>
     </w:p>
     <w:p>
       <w:pPr>
         <w:pStyle w:val="ListBullet"/>
-        <w:spacing w:after="80" w:line="276" w:lineRule="auto"/>
+        <w:spacing w:after="60" w:line="276" w:lineRule="auto"/>
       </w:pPr>
       <w:r>
         <w:rPr>
           <w:rFonts w:ascii="Arial" w:hAnsi="Arial"/>
           <w:b/>
-          <w:color w:val="0F172A"/>
-          <w:sz w:val="20"/>
+          <w:color w:val="0F2744"/>
+          <w:sz w:val="19"/>
         </w:rPr>
-        <w:t xml:space="preserve">Indikator Stepper Dinamis: </w:t>
+        <w:t xml:space="preserve">Pemasangan Salah / Distraktor: </w:t>
       </w:r>
       <w:r>
         <w:rPr>
           <w:rFonts w:ascii="Arial" w:hAnsi="Arial"/>
-          <w:color w:val="0F172A"/>
-          <w:sz w:val="20"/>
+          <w:color w:val="1E293B"/>
+          <w:sz w:val="19"/>
         </w:rPr>
-        <w:t>Perhatikan kartu instruksi di atas rak komponen yang memandu langkah aktif:</w:t>
-      </w:r>
-    </w:p>
-    <w:p>
-      <w:pPr>
-        <w:spacing w:after="120" w:line="276" w:lineRule="auto"/>
-      </w:pPr>
-      <w:r>
-        <w:rPr>
-          <w:rFonts w:ascii="Arial" w:hAnsi="Arial"/>
-          <w:i w:val="0"/>
-          <w:color w:val="0F172A"/>
-          <w:sz w:val="20"/>
-        </w:rPr>
-        <w:t>• Langkah 1 dari 5: Tarik CPU (Prosesor) ke soket LGA 1700 di tengah motherboard.</w:t>
-        <w:br/>
-        <w:t>• Langkah 2 dari 5: Pasang RAM DDR4 ke slot memori DIMM di sebelah kanan CPU.</w:t>
-        <w:br/>
-        <w:t>• Langkah 3 dari 5: Pasang SSD NVMe M.2 ke slot penyimpanan berkecepatan tinggi.</w:t>
-        <w:br/>
-        <w:t>• Langkah 4 dari 5: Pasang Kartu Grafis (GPU) ke slot ekspansi PCIe x16.</w:t>
-        <w:br/>
-        <w:t>• Langkah 5 dari 5: Hubungkan Catu Daya (PSU) ke header daya 24-Pin ATX motherboard.</w:t>
-      </w:r>
-    </w:p>
-    <w:p>
-      <w:pPr>
-        <w:pStyle w:val="ListBullet"/>
-        <w:spacing w:after="80" w:line="276" w:lineRule="auto"/>
-      </w:pPr>
-      <w:r>
-        <w:rPr>
-          <w:rFonts w:ascii="Arial" w:hAnsi="Arial"/>
-          <w:b/>
-          <w:color w:val="0F172A"/>
-          <w:sz w:val="20"/>
-        </w:rPr>
-        <w:t xml:space="preserve">Uji Diagnostik Mesin: </w:t>
-      </w:r>
-      <w:r>
-        <w:rPr>
-          <w:rFonts w:ascii="Arial" w:hAnsi="Arial"/>
-          <w:color w:val="0F172A"/>
-          <w:sz w:val="20"/>
-        </w:rPr>
-        <w:t>Setelah status perakitan 5/5, klik tombol '⚡ POWER ON / UJI BOOT'. Amati 4 lampu LED diagnostik (CPU, DRAM, VGA, BOOT) dan log terminal BIOS yang memvisualisasikan siklus Von Neumann (Fetch-Decode-Execute).</w:t>
-      </w:r>
-    </w:p>
-    <w:p>
-      <w:pPr>
-        <w:pStyle w:val="ListBullet"/>
-        <w:spacing w:after="80" w:line="276" w:lineRule="auto"/>
-      </w:pPr>
-      <w:r>
-        <w:rPr>
-          <w:rFonts w:ascii="Arial" w:hAnsi="Arial"/>
-          <w:b/>
-          <w:color w:val="0F172A"/>
-          <w:sz w:val="20"/>
-        </w:rPr>
-        <w:t xml:space="preserve">Fitur Alat Bantu: </w:t>
-      </w:r>
-      <w:r>
-        <w:rPr>
-          <w:rFonts w:ascii="Arial" w:hAnsi="Arial"/>
-          <w:color w:val="0F172A"/>
-          <w:sz w:val="20"/>
-        </w:rPr>
-        <w:t>Gunakan tombol '⚡ Auto Rakit' untuk demonstrasi cepat otomatis dan '🔄 Reset' untuk mengembalikan seluruh komponen ke rak penyimpanan.</w:t>
+        <w:t>Komponen kembali ke rak semula disertai getaran visual (shake animation), nada peringatan lembut, dan pesan edukatif yang menjelaskan mengapa komponen tersebut tidak cocok pada soket target.</w:t>
       </w:r>
     </w:p>
     <w:p>
       <w:pPr>
         <w:keepNext/>
-        <w:spacing w:before="240" w:after="80"/>
+        <w:spacing w:before="200" w:after="60"/>
       </w:pPr>
       <w:r>
         <w:rPr>
           <w:rFonts w:ascii="Arial" w:hAnsi="Arial"/>
           <w:b/>
           <w:color w:val="0284C7"/>
-          <w:sz w:val="21"/>
+          <w:sz w:val="22"/>
         </w:rPr>
-        <w:t>C. Eksplorasi Digital Lanjutan (Konsep Abstrak)</w:t>
+        <w:t>5.3 Eksplorasi Skenario Masalah (Troubleshooting Mode)</w:t>
+      </w:r>
+    </w:p>
+    <w:p>
+      <w:pPr>
+        <w:spacing w:after="80" w:line="276" w:lineRule="auto"/>
+      </w:pPr>
+      <w:r>
+        <w:rPr>
+          <w:rFonts w:ascii="Arial" w:hAnsi="Arial"/>
+          <w:color w:val="1E293B"/>
+          <w:sz w:val="19"/>
+        </w:rPr>
+        <w:t>Sesuai amanat Juknis mengenai pentingnya fitur eksplorasi berbagai skenario, media ini menyediakan tombol '🔍 Uji Masalah'. Dalam mode ini, peserta didik disajikan komponen distraktor seperti RAM DDR2 lama atau Harddisk antarmuka IDE purba. Jika siswa mencoba memasangnya, sistem menampilkan dialog diagnostik yang menjelaskan ketidaksesuaian fisik (perbedaan notch RAM) dan perbedaan generasi teknologi.</w:t>
+      </w:r>
+    </w:p>
+    <w:p>
+      <w:pPr>
+        <w:keepNext/>
+        <w:spacing w:before="280" w:after="80"/>
+      </w:pPr>
+      <w:r>
+        <w:rPr>
+          <w:rFonts w:ascii="Arial" w:hAnsi="Arial"/>
+          <w:b/>
+          <w:color w:val="0F2744"/>
+          <w:sz w:val="26"/>
+        </w:rPr>
+        <w:t>BAB VI. ARSITEKTUR TEKNIS &amp; KEPATUHAN JUKNIS</w:t>
+      </w:r>
+    </w:p>
+    <w:p>
+      <w:pPr>
+        <w:spacing w:after="80" w:line="276" w:lineRule="auto"/>
+      </w:pPr>
+      <w:r>
+        <w:rPr>
+          <w:rFonts w:ascii="Arial" w:hAnsi="Arial"/>
+          <w:color w:val="1E293B"/>
+          <w:sz w:val="19"/>
+        </w:rPr>
+        <w:t>Karya ini dirancang dengan standar rekayasa perangkat lunak edukasi yang tinggi demi memenuhi seluruh parameter penilaian sayembara:</w:t>
       </w:r>
     </w:p>
     <w:p>
       <w:pPr>
         <w:pStyle w:val="ListBullet"/>
-        <w:spacing w:after="80" w:line="276" w:lineRule="auto"/>
+        <w:spacing w:after="60" w:line="276" w:lineRule="auto"/>
       </w:pPr>
       <w:r>
         <w:rPr>
           <w:rFonts w:ascii="Arial" w:hAnsi="Arial"/>
           <w:b/>
-          <w:color w:val="0F172A"/>
-          <w:sz w:val="20"/>
+          <w:color w:val="0F2744"/>
+          <w:sz w:val="19"/>
         </w:rPr>
-        <w:t xml:space="preserve">Sakelar Biner (8-Bit): </w:t>
+        <w:t xml:space="preserve">1. Arsitektur Single Page Application (SPA): </w:t>
       </w:r>
       <w:r>
         <w:rPr>
           <w:rFonts w:ascii="Arial" w:hAnsi="Arial"/>
-          <w:color w:val="0F172A"/>
-          <w:sz w:val="20"/>
+          <w:color w:val="1E293B"/>
+          <w:sz w:val="19"/>
         </w:rPr>
-        <w:t>Klik sakelar bit (1/0) untuk melihat konversi angka biner ke desimal (0-255). Klik 'Tantangan Tebak Biner' untuk mode evaluasi gamifikasi berwaktu.</w:t>
+        <w:t>Seluruh media dirangkum dalam arsitektur SPA yang berjalan mulus tanpa reload halaman, menghasilkan transisi antar modul yang instan dan bebas lag.</w:t>
       </w:r>
     </w:p>
     <w:p>
       <w:pPr>
         <w:pStyle w:val="ListBullet"/>
-        <w:spacing w:after="80" w:line="276" w:lineRule="auto"/>
+        <w:spacing w:after="60" w:line="276" w:lineRule="auto"/>
       </w:pPr>
       <w:r>
         <w:rPr>
           <w:rFonts w:ascii="Arial" w:hAnsi="Arial"/>
           <w:b/>
-          <w:color w:val="0F172A"/>
-          <w:sz w:val="20"/>
+          <w:color w:val="0F2744"/>
+          <w:sz w:val="19"/>
         </w:rPr>
-        <w:t xml:space="preserve">Pencampur Warna RGB: </w:t>
+        <w:t xml:space="preserve">2. Zero External CDN &amp; Dependensi Mandiri: </w:t>
       </w:r>
       <w:r>
         <w:rPr>
           <w:rFonts w:ascii="Arial" w:hAnsi="Arial"/>
-          <w:color w:val="0F172A"/>
-          <w:sz w:val="20"/>
+          <w:color w:val="1E293B"/>
+          <w:sz w:val="19"/>
         </w:rPr>
-        <w:t>Geser slider Red, Green, Blue (0-255) untuk memahami pembentukan 16,7 juta warna monitor dan kode warna heksadesimalnya.</w:t>
+        <w:t>Aplikasi beroperasi 100% secara offline. Seluruh jenis huruf lokal (Fredoka, Nunito, Poppins) dan pustaka ikon telah diunduh dan disimpan di direktori internal 'assets/fonts/'.</w:t>
       </w:r>
     </w:p>
     <w:p>
       <w:pPr>
         <w:pStyle w:val="ListBullet"/>
-        <w:spacing w:after="80" w:line="276" w:lineRule="auto"/>
+        <w:spacing w:after="60" w:line="276" w:lineRule="auto"/>
       </w:pPr>
       <w:r>
         <w:rPr>
           <w:rFonts w:ascii="Arial" w:hAnsi="Arial"/>
           <w:b/>
-          <w:color w:val="0F172A"/>
-          <w:sz w:val="20"/>
+          <w:color w:val="0F2744"/>
+          <w:sz w:val="19"/>
         </w:rPr>
-        <w:t xml:space="preserve">Simulator Gerbang Logika: </w:t>
+        <w:t xml:space="preserve">3. Web Audio Synthesis Engine: </w:t>
       </w:r>
       <w:r>
         <w:rPr>
           <w:rFonts w:ascii="Arial" w:hAnsi="Arial"/>
-          <w:color w:val="0F172A"/>
-          <w:sz w:val="20"/>
+          <w:color w:val="1E293B"/>
+          <w:sz w:val="19"/>
         </w:rPr>
-        <w:t>Uji tabel kebenaran 6 gerbang logika (AND, OR, NOT, XOR, NAND, NOR) dengan sakelar input interaktif dan lampu indikator keluaran.</w:t>
+        <w:t>Tidak mengandalkan rekaman audio MP3/WAV eksternal yang membebani memori, melainkan memanfaatkan Web Audio API bawaan peramban untuk menghasilkan frekuensi nada sintetis (beep BIOS, klik tombol, nada peringatan).</w:t>
+      </w:r>
+    </w:p>
+    <w:p>
+      <w:pPr>
+        <w:pStyle w:val="ListBullet"/>
+        <w:spacing w:after="60" w:line="276" w:lineRule="auto"/>
+      </w:pPr>
+      <w:r>
+        <w:rPr>
+          <w:rFonts w:ascii="Arial" w:hAnsi="Arial"/>
+          <w:b/>
+          <w:color w:val="0F2744"/>
+          <w:sz w:val="19"/>
+        </w:rPr>
+        <w:t xml:space="preserve">4. Efisiensi Ukuran Berkas: </w:t>
+      </w:r>
+      <w:r>
+        <w:rPr>
+          <w:rFonts w:ascii="Arial" w:hAnsi="Arial"/>
+          <w:color w:val="1E293B"/>
+          <w:sz w:val="19"/>
+        </w:rPr>
+        <w:t>Total ukuran direktori karya hanya berkisar 4,5 MB, sangat jauh di bawah batas maksimum Juknis (150 MB), sehingga sangat ringan untuk didistribusikan ke komputer sekolah berspesifikasi terbatas.</w:t>
+      </w:r>
+    </w:p>
+    <w:p>
+      <w:pPr>
+        <w:pStyle w:val="ListBullet"/>
+        <w:spacing w:after="60" w:line="276" w:lineRule="auto"/>
+      </w:pPr>
+      <w:r>
+        <w:rPr>
+          <w:rFonts w:ascii="Arial" w:hAnsi="Arial"/>
+          <w:b/>
+          <w:color w:val="0F2744"/>
+          <w:sz w:val="19"/>
+        </w:rPr>
+        <w:t xml:space="preserve">5. Rasio Layar 16:9 Adaptif: </w:t>
+      </w:r>
+      <w:r>
+        <w:rPr>
+          <w:rFonts w:ascii="Arial" w:hAnsi="Arial"/>
+          <w:color w:val="1E293B"/>
+          <w:sz w:val="19"/>
+        </w:rPr>
+        <w:t>Tampilan responsif dengan mempertahankan rasio aspek standar layar 16:9, menjamin keterbacaan optimal pada proyektor kelas, monitor PC lab, maupun layar laptop.</w:t>
       </w:r>
     </w:p>
     <w:p>
       <w:pPr>
         <w:keepNext/>
-        <w:spacing w:before="240" w:after="80"/>
+        <w:spacing w:before="280" w:after="80"/>
       </w:pPr>
       <w:r>
         <w:rPr>
           <w:rFonts w:ascii="Arial" w:hAnsi="Arial"/>
           <w:b/>
-          <w:color w:val="0284C7"/>
-          <w:sz w:val="21"/>
+          <w:color w:val="0F2744"/>
+          <w:sz w:val="26"/>
         </w:rPr>
-        <w:t>D. Lembar Kerja Peserta Didik (LKPD) &amp; Evaluasi Formatif</w:t>
+        <w:t>BAB VII. GLOSARIUM &amp; REFERENSI</w:t>
       </w:r>
     </w:p>
     <w:p>
       <w:pPr>
-        <w:spacing w:after="120" w:line="276" w:lineRule="auto"/>
-      </w:pPr>
-      <w:r>
-        <w:rPr>
-          <w:rFonts w:ascii="Arial" w:hAnsi="Arial"/>
-          <w:i w:val="0"/>
-          <w:color w:val="0F172A"/>
-          <w:sz w:val="20"/>
-        </w:rPr>
-        <w:t>Buka tab '✍️ LKPD &amp; Kuis' untuk mengerjakan latihan formatif interaktif. Siswa mendapatkan umpan balik langsung atas jawabannya dan dapat mengunduh atau mencetak kartu rekapan nilai hasil belajar mandiri.</w:t>
-      </w:r>
-    </w:p>
-    <w:p>
-      <w:pPr>
-        <w:keepNext/>
-        <w:spacing w:before="320" w:after="120"/>
+        <w:pStyle w:val="ListBullet"/>
+        <w:spacing w:after="60" w:line="276" w:lineRule="auto"/>
       </w:pPr>
       <w:r>
         <w:rPr>
           <w:rFonts w:ascii="Arial" w:hAnsi="Arial"/>
           <w:b/>
-          <w:color w:val="1E3A8A"/>
-          <w:sz w:val="24"/>
+          <w:color w:val="0F2744"/>
+          <w:sz w:val="19"/>
         </w:rPr>
-        <w:t>4. Spesifikasi Teknis &amp; Kepatuhan Juknis Bab V</w:t>
+        <w:t xml:space="preserve">CPU: </w:t>
+      </w:r>
+      <w:r>
+        <w:rPr>
+          <w:rFonts w:ascii="Arial" w:hAnsi="Arial"/>
+          <w:color w:val="1E293B"/>
+          <w:sz w:val="19"/>
+        </w:rPr>
+        <w:t>Central Processing Unit, otak utama komputer yang mengeksekusi instruksi program melalui siklus fetch-decode-execute.</w:t>
       </w:r>
     </w:p>
     <w:p>
       <w:pPr>
         <w:pStyle w:val="ListBullet"/>
-        <w:spacing w:after="80" w:line="276" w:lineRule="auto"/>
+        <w:spacing w:after="60" w:line="276" w:lineRule="auto"/>
       </w:pPr>
       <w:r>
         <w:rPr>
           <w:rFonts w:ascii="Arial" w:hAnsi="Arial"/>
           <w:b/>
-          <w:color w:val="0F172A"/>
-          <w:sz w:val="20"/>
+          <w:color w:val="0F2744"/>
+          <w:sz w:val="19"/>
         </w:rPr>
-        <w:t xml:space="preserve">Arsitektur Sistem: </w:t>
+        <w:t xml:space="preserve">Motherboard: </w:t>
       </w:r>
       <w:r>
         <w:rPr>
           <w:rFonts w:ascii="Arial" w:hAnsi="Arial"/>
-          <w:color w:val="0F172A"/>
-          <w:sz w:val="20"/>
+          <w:color w:val="1E293B"/>
+          <w:sz w:val="19"/>
         </w:rPr>
-        <w:t>Single Page Application (SPA), zero-refresh, navigasi tab instan berbasis JavaScript murni.</w:t>
+        <w:t>Papan sirkuit cetak utama tempat seluruh komponen hardware terhubung dan berkomunikasi satu sama lain.</w:t>
       </w:r>
     </w:p>
     <w:p>
       <w:pPr>
         <w:pStyle w:val="ListBullet"/>
-        <w:spacing w:after="80" w:line="276" w:lineRule="auto"/>
+        <w:spacing w:after="60" w:line="276" w:lineRule="auto"/>
       </w:pPr>
       <w:r>
         <w:rPr>
           <w:rFonts w:ascii="Arial" w:hAnsi="Arial"/>
           <w:b/>
-          <w:color w:val="0F172A"/>
-          <w:sz w:val="20"/>
+          <w:color w:val="0F2744"/>
+          <w:sz w:val="19"/>
         </w:rPr>
-        <w:t xml:space="preserve">Ketergantungan Eksternal: </w:t>
+        <w:t xml:space="preserve">RAM: </w:t>
       </w:r>
       <w:r>
         <w:rPr>
           <w:rFonts w:ascii="Arial" w:hAnsi="Arial"/>
-          <w:color w:val="0F172A"/>
-          <w:sz w:val="20"/>
+          <w:color w:val="1E293B"/>
+          <w:sz w:val="19"/>
         </w:rPr>
-        <w:t>100% mandiri luring. Tidak memanggil server eksternal, bebas CDN, seluruh font dan gambar tersimpan di folder lokal.</w:t>
+        <w:t>Random Access Memory, memori utama komputer berkecepatan tinggi yang bersifat volatile (data hilang saat listrik padam).</w:t>
       </w:r>
     </w:p>
     <w:p>
       <w:pPr>
         <w:pStyle w:val="ListBullet"/>
-        <w:spacing w:after="80" w:line="276" w:lineRule="auto"/>
+        <w:spacing w:after="60" w:line="276" w:lineRule="auto"/>
       </w:pPr>
       <w:r>
         <w:rPr>
           <w:rFonts w:ascii="Arial" w:hAnsi="Arial"/>
           <w:b/>
-          <w:color w:val="0F172A"/>
-          <w:sz w:val="20"/>
+          <w:color w:val="0F2744"/>
+          <w:sz w:val="19"/>
         </w:rPr>
-        <w:t xml:space="preserve">Tata Suara: </w:t>
+        <w:t xml:space="preserve">SSD NVMe M.2: </w:t>
       </w:r>
       <w:r>
         <w:rPr>
           <w:rFonts w:ascii="Arial" w:hAnsi="Arial"/>
-          <w:color w:val="0F172A"/>
-          <w:sz w:val="20"/>
+          <w:color w:val="1E293B"/>
+          <w:sz w:val="19"/>
         </w:rPr>
-        <w:t>Disintesis langsung secara matematis via Web Audio API tanpa file audio eksternal.</w:t>
+        <w:t>Solid State Drive dengan antarmuka Non-Volatile Memory Express yang terpasang pada slot M.2 dengan kecepatan transfer gigabit per detik.</w:t>
       </w:r>
     </w:p>
     <w:p>
       <w:pPr>
         <w:pStyle w:val="ListBullet"/>
-        <w:spacing w:after="80" w:line="276" w:lineRule="auto"/>
+        <w:spacing w:after="60" w:line="276" w:lineRule="auto"/>
       </w:pPr>
       <w:r>
         <w:rPr>
           <w:rFonts w:ascii="Arial" w:hAnsi="Arial"/>
           <w:b/>
-          <w:color w:val="0F172A"/>
-          <w:sz w:val="20"/>
+          <w:color w:val="0F2744"/>
+          <w:sz w:val="19"/>
         </w:rPr>
-        <w:t xml:space="preserve">Ukuran Berkas: </w:t>
+        <w:t xml:space="preserve">POST BIOS: </w:t>
       </w:r>
       <w:r>
         <w:rPr>
           <w:rFonts w:ascii="Arial" w:hAnsi="Arial"/>
-          <w:color w:val="0F172A"/>
-          <w:sz w:val="20"/>
+          <w:color w:val="1E293B"/>
+          <w:sz w:val="19"/>
         </w:rPr>
-        <w:t>Total ukuran folder aplikasi kurang dari 4 MB (sangat hemat dibandingkan batas 150 MB pada juknis).</w:t>
+        <w:t>Power-On Self-Test, rutinitas diagnostik yang dijalankan firmware BIOS saat komputer pertama kali dinyalakan untuk memeriksa kesiapan hardware.</w:t>
       </w:r>
     </w:p>
     <w:sectPr>

</xml_diff>

<commit_message>
docs: rebuild PANDUAN_PENGGUNAAN_DAN_DESKRIPSI_TEKNIS docx and md with updated 21-page MPI and 7-tab Lab Maya specifications
</commit_message>
<xml_diff>
--- a/lab/lab-maya/perakitan-komputer/SIAP KIRIM/PANDUAN_PENGGUNAAN_DAN_DESKRIPSI_TEKNIS.docx
+++ b/lab/lab-maya/perakitan-komputer/SIAP KIRIM/PANDUAN_PENGGUNAAN_DAN_DESKRIPSI_TEKNIS.docx
@@ -9,7 +9,7 @@
         <w:tblLook w:firstColumn="1" w:firstRow="1" w:lastColumn="0" w:lastRow="0" w:noHBand="0" w:noVBand="1" w:val="04A0"/>
       </w:tblPr>
       <w:tblGrid>
-        <w:gridCol w:w="9360"/>
+        <w:gridCol w:w="9461"/>
       </w:tblGrid>
       <w:tr>
         <w:tc>
@@ -34,7 +34,7 @@
                 <w:color w:val="38BDF8"/>
                 <w:sz w:val="20"/>
               </w:rPr>
-              <w:t>★ KATEGORI SAYEMBARA: LAB MAYA (FESTIVAL BIRU PUTIH 2026) ★</w:t>
+              <w:t>★ KATEGORI SAYEMBARA: LAB MAYA (BAB V JUKNIS FESTIVAL BIRU PUTIH 2026) ★</w:t>
               <w:br/>
             </w:r>
             <w:r>
@@ -77,7 +77,7 @@
         <w:rPr>
           <w:rFonts w:ascii="Arial" w:hAnsi="Arial"/>
           <w:b/>
-          <w:color w:val="0F2744"/>
+          <w:color w:val="0A2540"/>
           <w:sz w:val="22"/>
         </w:rPr>
         <w:t>IDENTITAS PENGEMBANG &amp; KARYA</w:t>
@@ -90,31 +90,31 @@
         <w:tblLook w:firstColumn="1" w:firstRow="1" w:lastColumn="0" w:lastRow="0" w:noHBand="0" w:noVBand="1" w:val="04A0"/>
       </w:tblPr>
       <w:tblGrid>
-        <w:gridCol w:w="4680"/>
-        <w:gridCol w:w="4680"/>
+        <w:gridCol w:w="4730"/>
+        <w:gridCol w:w="4730"/>
       </w:tblGrid>
       <w:tr>
         <w:tc>
           <w:tcPr>
             <w:tcW w:type="dxa" w:w="3168"/>
             <w:tcMar>
-              <w:top w:w="60" w:type="dxa"/>
-              <w:bottom w:w="60" w:type="dxa"/>
+              <w:top w:w="50" w:type="dxa"/>
+              <w:bottom w:w="50" w:type="dxa"/>
               <w:left w:w="100" w:type="dxa"/>
               <w:right w:w="100" w:type="dxa"/>
             </w:tcMar>
-            <w:shd w:fill="F1F5F9"/>
+            <w:shd w:fill="F8FAFC"/>
           </w:tcPr>
           <w:p>
             <w:pPr>
-              <w:spacing w:after="40" w:before="40"/>
+              <w:spacing w:after="30" w:before="30"/>
             </w:pPr>
             <w:r>
               <w:rPr>
                 <w:rFonts w:ascii="Arial" w:hAnsi="Arial"/>
                 <w:b/>
                 <w:color w:val="1E293B"/>
-                <w:sz w:val="19"/>
+                <w:sz w:val="18"/>
               </w:rPr>
               <w:t>Nama Lengkap</w:t>
             </w:r>
@@ -124,22 +124,22 @@
           <w:tcPr>
             <w:tcW w:type="dxa" w:w="6192"/>
             <w:tcMar>
-              <w:top w:w="60" w:type="dxa"/>
-              <w:bottom w:w="60" w:type="dxa"/>
+              <w:top w:w="50" w:type="dxa"/>
+              <w:bottom w:w="50" w:type="dxa"/>
               <w:left w:w="100" w:type="dxa"/>
               <w:right w:w="100" w:type="dxa"/>
             </w:tcMar>
-            <w:shd w:fill="F1F5F9"/>
+            <w:shd w:fill="F8FAFC"/>
           </w:tcPr>
           <w:p>
             <w:pPr>
-              <w:spacing w:after="40" w:before="40"/>
+              <w:spacing w:after="30" w:before="30"/>
             </w:pPr>
             <w:r>
               <w:rPr>
                 <w:rFonts w:ascii="Arial" w:hAnsi="Arial"/>
                 <w:color w:val="334155"/>
-                <w:sz w:val="19"/>
+                <w:sz w:val="18"/>
               </w:rPr>
               <w:t>Ach. Chanifuddin Fanani, S.Pd.</w:t>
             </w:r>
@@ -151,8 +151,8 @@
           <w:tcPr>
             <w:tcW w:type="dxa" w:w="3168"/>
             <w:tcMar>
-              <w:top w:w="60" w:type="dxa"/>
-              <w:bottom w:w="60" w:type="dxa"/>
+              <w:top w:w="50" w:type="dxa"/>
+              <w:bottom w:w="50" w:type="dxa"/>
               <w:left w:w="100" w:type="dxa"/>
               <w:right w:w="100" w:type="dxa"/>
             </w:tcMar>
@@ -160,14 +160,14 @@
           </w:tcPr>
           <w:p>
             <w:pPr>
-              <w:spacing w:after="40" w:before="40"/>
+              <w:spacing w:after="30" w:before="30"/>
             </w:pPr>
             <w:r>
               <w:rPr>
                 <w:rFonts w:ascii="Arial" w:hAnsi="Arial"/>
                 <w:b/>
                 <w:color w:val="1E293B"/>
-                <w:sz w:val="19"/>
+                <w:sz w:val="18"/>
               </w:rPr>
               <w:t>NIP</w:t>
             </w:r>
@@ -177,8 +177,8 @@
           <w:tcPr>
             <w:tcW w:type="dxa" w:w="6192"/>
             <w:tcMar>
-              <w:top w:w="60" w:type="dxa"/>
-              <w:bottom w:w="60" w:type="dxa"/>
+              <w:top w:w="50" w:type="dxa"/>
+              <w:bottom w:w="50" w:type="dxa"/>
               <w:left w:w="100" w:type="dxa"/>
               <w:right w:w="100" w:type="dxa"/>
             </w:tcMar>
@@ -186,13 +186,13 @@
           </w:tcPr>
           <w:p>
             <w:pPr>
-              <w:spacing w:after="40" w:before="40"/>
+              <w:spacing w:after="30" w:before="30"/>
             </w:pPr>
             <w:r>
               <w:rPr>
                 <w:rFonts w:ascii="Arial" w:hAnsi="Arial"/>
                 <w:color w:val="334155"/>
-                <w:sz w:val="19"/>
+                <w:sz w:val="18"/>
               </w:rPr>
               <w:t>199108262020121007</w:t>
             </w:r>
@@ -204,23 +204,23 @@
           <w:tcPr>
             <w:tcW w:type="dxa" w:w="3168"/>
             <w:tcMar>
-              <w:top w:w="60" w:type="dxa"/>
-              <w:bottom w:w="60" w:type="dxa"/>
+              <w:top w:w="50" w:type="dxa"/>
+              <w:bottom w:w="50" w:type="dxa"/>
               <w:left w:w="100" w:type="dxa"/>
               <w:right w:w="100" w:type="dxa"/>
             </w:tcMar>
-            <w:shd w:fill="F1F5F9"/>
+            <w:shd w:fill="F8FAFC"/>
           </w:tcPr>
           <w:p>
             <w:pPr>
-              <w:spacing w:after="40" w:before="40"/>
+              <w:spacing w:after="30" w:before="30"/>
             </w:pPr>
             <w:r>
               <w:rPr>
                 <w:rFonts w:ascii="Arial" w:hAnsi="Arial"/>
                 <w:b/>
                 <w:color w:val="1E293B"/>
-                <w:sz w:val="19"/>
+                <w:sz w:val="18"/>
               </w:rPr>
               <w:t>NUPTK</w:t>
             </w:r>
@@ -230,22 +230,22 @@
           <w:tcPr>
             <w:tcW w:type="dxa" w:w="6192"/>
             <w:tcMar>
-              <w:top w:w="60" w:type="dxa"/>
-              <w:bottom w:w="60" w:type="dxa"/>
+              <w:top w:w="50" w:type="dxa"/>
+              <w:bottom w:w="50" w:type="dxa"/>
               <w:left w:w="100" w:type="dxa"/>
               <w:right w:w="100" w:type="dxa"/>
             </w:tcMar>
-            <w:shd w:fill="F1F5F9"/>
+            <w:shd w:fill="F8FAFC"/>
           </w:tcPr>
           <w:p>
             <w:pPr>
-              <w:spacing w:after="40" w:before="40"/>
+              <w:spacing w:after="30" w:before="30"/>
             </w:pPr>
             <w:r>
               <w:rPr>
                 <w:rFonts w:ascii="Arial" w:hAnsi="Arial"/>
                 <w:color w:val="334155"/>
-                <w:sz w:val="19"/>
+                <w:sz w:val="18"/>
               </w:rPr>
               <w:t>9158769670130183</w:t>
             </w:r>
@@ -257,8 +257,8 @@
           <w:tcPr>
             <w:tcW w:type="dxa" w:w="3168"/>
             <w:tcMar>
-              <w:top w:w="60" w:type="dxa"/>
-              <w:bottom w:w="60" w:type="dxa"/>
+              <w:top w:w="50" w:type="dxa"/>
+              <w:bottom w:w="50" w:type="dxa"/>
               <w:left w:w="100" w:type="dxa"/>
               <w:right w:w="100" w:type="dxa"/>
             </w:tcMar>
@@ -266,14 +266,14 @@
           </w:tcPr>
           <w:p>
             <w:pPr>
-              <w:spacing w:after="40" w:before="40"/>
+              <w:spacing w:after="30" w:before="30"/>
             </w:pPr>
             <w:r>
               <w:rPr>
                 <w:rFonts w:ascii="Arial" w:hAnsi="Arial"/>
                 <w:b/>
                 <w:color w:val="1E293B"/>
-                <w:sz w:val="19"/>
+                <w:sz w:val="18"/>
               </w:rPr>
               <w:t>NIK</w:t>
             </w:r>
@@ -283,8 +283,8 @@
           <w:tcPr>
             <w:tcW w:type="dxa" w:w="6192"/>
             <w:tcMar>
-              <w:top w:w="60" w:type="dxa"/>
-              <w:bottom w:w="60" w:type="dxa"/>
+              <w:top w:w="50" w:type="dxa"/>
+              <w:bottom w:w="50" w:type="dxa"/>
               <w:left w:w="100" w:type="dxa"/>
               <w:right w:w="100" w:type="dxa"/>
             </w:tcMar>
@@ -292,13 +292,13 @@
           </w:tcPr>
           <w:p>
             <w:pPr>
-              <w:spacing w:after="40" w:before="40"/>
+              <w:spacing w:after="30" w:before="30"/>
             </w:pPr>
             <w:r>
               <w:rPr>
                 <w:rFonts w:ascii="Arial" w:hAnsi="Arial"/>
                 <w:color w:val="334155"/>
-                <w:sz w:val="19"/>
+                <w:sz w:val="18"/>
               </w:rPr>
               <w:t>3524162608910001</w:t>
             </w:r>
@@ -310,23 +310,23 @@
           <w:tcPr>
             <w:tcW w:type="dxa" w:w="3168"/>
             <w:tcMar>
-              <w:top w:w="60" w:type="dxa"/>
-              <w:bottom w:w="60" w:type="dxa"/>
+              <w:top w:w="50" w:type="dxa"/>
+              <w:bottom w:w="50" w:type="dxa"/>
               <w:left w:w="100" w:type="dxa"/>
               <w:right w:w="100" w:type="dxa"/>
             </w:tcMar>
-            <w:shd w:fill="F1F5F9"/>
+            <w:shd w:fill="F8FAFC"/>
           </w:tcPr>
           <w:p>
             <w:pPr>
-              <w:spacing w:after="40" w:before="40"/>
+              <w:spacing w:after="30" w:before="30"/>
             </w:pPr>
             <w:r>
               <w:rPr>
                 <w:rFonts w:ascii="Arial" w:hAnsi="Arial"/>
                 <w:b/>
                 <w:color w:val="1E293B"/>
-                <w:sz w:val="19"/>
+                <w:sz w:val="18"/>
               </w:rPr>
               <w:t>Instansi / Unit Kerja</w:t>
             </w:r>
@@ -336,22 +336,22 @@
           <w:tcPr>
             <w:tcW w:type="dxa" w:w="6192"/>
             <w:tcMar>
-              <w:top w:w="60" w:type="dxa"/>
-              <w:bottom w:w="60" w:type="dxa"/>
+              <w:top w:w="50" w:type="dxa"/>
+              <w:bottom w:w="50" w:type="dxa"/>
               <w:left w:w="100" w:type="dxa"/>
               <w:right w:w="100" w:type="dxa"/>
             </w:tcMar>
-            <w:shd w:fill="F1F5F9"/>
+            <w:shd w:fill="F8FAFC"/>
           </w:tcPr>
           <w:p>
             <w:pPr>
-              <w:spacing w:after="40" w:before="40"/>
+              <w:spacing w:after="30" w:before="30"/>
             </w:pPr>
             <w:r>
               <w:rPr>
                 <w:rFonts w:ascii="Arial" w:hAnsi="Arial"/>
                 <w:color w:val="334155"/>
-                <w:sz w:val="19"/>
+                <w:sz w:val="18"/>
               </w:rPr>
               <w:t>SMP Negeri 2 Lamongan</w:t>
             </w:r>
@@ -363,8 +363,8 @@
           <w:tcPr>
             <w:tcW w:type="dxa" w:w="3168"/>
             <w:tcMar>
-              <w:top w:w="60" w:type="dxa"/>
-              <w:bottom w:w="60" w:type="dxa"/>
+              <w:top w:w="50" w:type="dxa"/>
+              <w:bottom w:w="50" w:type="dxa"/>
               <w:left w:w="100" w:type="dxa"/>
               <w:right w:w="100" w:type="dxa"/>
             </w:tcMar>
@@ -372,14 +372,14 @@
           </w:tcPr>
           <w:p>
             <w:pPr>
-              <w:spacing w:after="40" w:before="40"/>
+              <w:spacing w:after="30" w:before="30"/>
             </w:pPr>
             <w:r>
               <w:rPr>
                 <w:rFonts w:ascii="Arial" w:hAnsi="Arial"/>
                 <w:b/>
                 <w:color w:val="1E293B"/>
-                <w:sz w:val="19"/>
+                <w:sz w:val="18"/>
               </w:rPr>
               <w:t>Kabupaten / Provinsi</w:t>
             </w:r>
@@ -389,8 +389,8 @@
           <w:tcPr>
             <w:tcW w:type="dxa" w:w="6192"/>
             <w:tcMar>
-              <w:top w:w="60" w:type="dxa"/>
-              <w:bottom w:w="60" w:type="dxa"/>
+              <w:top w:w="50" w:type="dxa"/>
+              <w:bottom w:w="50" w:type="dxa"/>
               <w:left w:w="100" w:type="dxa"/>
               <w:right w:w="100" w:type="dxa"/>
             </w:tcMar>
@@ -398,13 +398,13 @@
           </w:tcPr>
           <w:p>
             <w:pPr>
-              <w:spacing w:after="40" w:before="40"/>
+              <w:spacing w:after="30" w:before="30"/>
             </w:pPr>
             <w:r>
               <w:rPr>
                 <w:rFonts w:ascii="Arial" w:hAnsi="Arial"/>
                 <w:color w:val="334155"/>
-                <w:sz w:val="19"/>
+                <w:sz w:val="18"/>
               </w:rPr>
               <w:t>Kabupaten Lamongan, Jawa Timur</w:t>
             </w:r>
@@ -416,23 +416,23 @@
           <w:tcPr>
             <w:tcW w:type="dxa" w:w="3168"/>
             <w:tcMar>
-              <w:top w:w="60" w:type="dxa"/>
-              <w:bottom w:w="60" w:type="dxa"/>
+              <w:top w:w="50" w:type="dxa"/>
+              <w:bottom w:w="50" w:type="dxa"/>
               <w:left w:w="100" w:type="dxa"/>
               <w:right w:w="100" w:type="dxa"/>
             </w:tcMar>
-            <w:shd w:fill="F1F5F9"/>
+            <w:shd w:fill="F8FAFC"/>
           </w:tcPr>
           <w:p>
             <w:pPr>
-              <w:spacing w:after="40" w:before="40"/>
+              <w:spacing w:after="30" w:before="30"/>
             </w:pPr>
             <w:r>
               <w:rPr>
                 <w:rFonts w:ascii="Arial" w:hAnsi="Arial"/>
                 <w:b/>
                 <w:color w:val="1E293B"/>
-                <w:sz w:val="19"/>
+                <w:sz w:val="18"/>
               </w:rPr>
               <w:t>No. Telepon / WhatsApp</w:t>
             </w:r>
@@ -442,22 +442,22 @@
           <w:tcPr>
             <w:tcW w:type="dxa" w:w="6192"/>
             <w:tcMar>
-              <w:top w:w="60" w:type="dxa"/>
-              <w:bottom w:w="60" w:type="dxa"/>
+              <w:top w:w="50" w:type="dxa"/>
+              <w:bottom w:w="50" w:type="dxa"/>
               <w:left w:w="100" w:type="dxa"/>
               <w:right w:w="100" w:type="dxa"/>
             </w:tcMar>
-            <w:shd w:fill="F1F5F9"/>
+            <w:shd w:fill="F8FAFC"/>
           </w:tcPr>
           <w:p>
             <w:pPr>
-              <w:spacing w:after="40" w:before="40"/>
+              <w:spacing w:after="30" w:before="30"/>
             </w:pPr>
             <w:r>
               <w:rPr>
                 <w:rFonts w:ascii="Arial" w:hAnsi="Arial"/>
                 <w:color w:val="334155"/>
-                <w:sz w:val="19"/>
+                <w:sz w:val="18"/>
               </w:rPr>
               <w:t>08158885508</w:t>
             </w:r>
@@ -469,8 +469,8 @@
           <w:tcPr>
             <w:tcW w:type="dxa" w:w="3168"/>
             <w:tcMar>
-              <w:top w:w="60" w:type="dxa"/>
-              <w:bottom w:w="60" w:type="dxa"/>
+              <w:top w:w="50" w:type="dxa"/>
+              <w:bottom w:w="50" w:type="dxa"/>
               <w:left w:w="100" w:type="dxa"/>
               <w:right w:w="100" w:type="dxa"/>
             </w:tcMar>
@@ -478,14 +478,14 @@
           </w:tcPr>
           <w:p>
             <w:pPr>
-              <w:spacing w:after="40" w:before="40"/>
+              <w:spacing w:after="30" w:before="30"/>
             </w:pPr>
             <w:r>
               <w:rPr>
                 <w:rFonts w:ascii="Arial" w:hAnsi="Arial"/>
                 <w:b/>
                 <w:color w:val="1E293B"/>
-                <w:sz w:val="19"/>
+                <w:sz w:val="18"/>
               </w:rPr>
               <w:t>Alamat Surel (Email)</w:t>
             </w:r>
@@ -495,8 +495,8 @@
           <w:tcPr>
             <w:tcW w:type="dxa" w:w="6192"/>
             <w:tcMar>
-              <w:top w:w="60" w:type="dxa"/>
-              <w:bottom w:w="60" w:type="dxa"/>
+              <w:top w:w="50" w:type="dxa"/>
+              <w:bottom w:w="50" w:type="dxa"/>
               <w:left w:w="100" w:type="dxa"/>
               <w:right w:w="100" w:type="dxa"/>
             </w:tcMar>
@@ -504,13 +504,13 @@
           </w:tcPr>
           <w:p>
             <w:pPr>
-              <w:spacing w:after="40" w:before="40"/>
+              <w:spacing w:after="30" w:before="30"/>
             </w:pPr>
             <w:r>
               <w:rPr>
                 <w:rFonts w:ascii="Arial" w:hAnsi="Arial"/>
                 <w:color w:val="334155"/>
-                <w:sz w:val="19"/>
+                <w:sz w:val="18"/>
               </w:rPr>
               <w:t>chanifuddin@gmail.com</w:t>
             </w:r>
@@ -522,25 +522,25 @@
           <w:tcPr>
             <w:tcW w:type="dxa" w:w="3168"/>
             <w:tcMar>
-              <w:top w:w="60" w:type="dxa"/>
-              <w:bottom w:w="60" w:type="dxa"/>
+              <w:top w:w="50" w:type="dxa"/>
+              <w:bottom w:w="50" w:type="dxa"/>
               <w:left w:w="100" w:type="dxa"/>
               <w:right w:w="100" w:type="dxa"/>
             </w:tcMar>
-            <w:shd w:fill="F1F5F9"/>
+            <w:shd w:fill="F8FAFC"/>
           </w:tcPr>
           <w:p>
             <w:pPr>
-              <w:spacing w:after="40" w:before="40"/>
+              <w:spacing w:after="30" w:before="30"/>
             </w:pPr>
             <w:r>
               <w:rPr>
                 <w:rFonts w:ascii="Arial" w:hAnsi="Arial"/>
                 <w:b/>
                 <w:color w:val="1E293B"/>
-                <w:sz w:val="19"/>
+                <w:sz w:val="18"/>
               </w:rPr>
-              <w:t>Portofolio Web</w:t>
+              <w:t>Kategori Sayembara</w:t>
             </w:r>
           </w:p>
         </w:tc>
@@ -548,24 +548,24 @@
           <w:tcPr>
             <w:tcW w:type="dxa" w:w="6192"/>
             <w:tcMar>
-              <w:top w:w="60" w:type="dxa"/>
-              <w:bottom w:w="60" w:type="dxa"/>
+              <w:top w:w="50" w:type="dxa"/>
+              <w:bottom w:w="50" w:type="dxa"/>
               <w:left w:w="100" w:type="dxa"/>
               <w:right w:w="100" w:type="dxa"/>
             </w:tcMar>
-            <w:shd w:fill="F1F5F9"/>
+            <w:shd w:fill="F8FAFC"/>
           </w:tcPr>
           <w:p>
             <w:pPr>
-              <w:spacing w:after="40" w:before="40"/>
+              <w:spacing w:after="30" w:before="30"/>
             </w:pPr>
             <w:r>
               <w:rPr>
                 <w:rFonts w:ascii="Arial" w:hAnsi="Arial"/>
                 <w:color w:val="334155"/>
-                <w:sz w:val="19"/>
+                <w:sz w:val="18"/>
               </w:rPr>
-              <w:t>https://fanani.my.id</w:t>
+              <w:t>Lab Maya (Bab V Petunjuk Teknis Festival Biru Putih 2026)</w:t>
             </w:r>
           </w:p>
         </w:tc>
@@ -575,8 +575,8 @@
           <w:tcPr>
             <w:tcW w:type="dxa" w:w="3168"/>
             <w:tcMar>
-              <w:top w:w="60" w:type="dxa"/>
-              <w:bottom w:w="60" w:type="dxa"/>
+              <w:top w:w="50" w:type="dxa"/>
+              <w:bottom w:w="50" w:type="dxa"/>
               <w:left w:w="100" w:type="dxa"/>
               <w:right w:w="100" w:type="dxa"/>
             </w:tcMar>
@@ -584,14 +584,67 @@
           </w:tcPr>
           <w:p>
             <w:pPr>
-              <w:spacing w:after="40" w:before="40"/>
+              <w:spacing w:after="30" w:before="30"/>
             </w:pPr>
             <w:r>
               <w:rPr>
                 <w:rFonts w:ascii="Arial" w:hAnsi="Arial"/>
                 <w:b/>
                 <w:color w:val="1E293B"/>
-                <w:sz w:val="19"/>
+                <w:sz w:val="18"/>
+              </w:rPr>
+              <w:t>Judul Karya Inovasi</w:t>
+            </w:r>
+          </w:p>
+        </w:tc>
+        <w:tc>
+          <w:tcPr>
+            <w:tcW w:type="dxa" w:w="6192"/>
+            <w:tcMar>
+              <w:top w:w="50" w:type="dxa"/>
+              <w:bottom w:w="50" w:type="dxa"/>
+              <w:left w:w="100" w:type="dxa"/>
+              <w:right w:w="100" w:type="dxa"/>
+            </w:tcMar>
+            <w:shd w:fill="FFFFFF"/>
+          </w:tcPr>
+          <w:p>
+            <w:pPr>
+              <w:spacing w:after="30" w:before="30"/>
+            </w:pPr>
+            <w:r>
+              <w:rPr>
+                <w:rFonts w:ascii="Arial" w:hAnsi="Arial"/>
+                <w:color w:val="334155"/>
+                <w:sz w:val="18"/>
+              </w:rPr>
+              <w:t>Lab Maya Sistem Komputer: Perakitan PC &amp; Logika Digital</w:t>
+            </w:r>
+          </w:p>
+        </w:tc>
+      </w:tr>
+      <w:tr>
+        <w:tc>
+          <w:tcPr>
+            <w:tcW w:type="dxa" w:w="3168"/>
+            <w:tcMar>
+              <w:top w:w="50" w:type="dxa"/>
+              <w:bottom w:w="50" w:type="dxa"/>
+              <w:left w:w="100" w:type="dxa"/>
+              <w:right w:w="100" w:type="dxa"/>
+            </w:tcMar>
+            <w:shd w:fill="F8FAFC"/>
+          </w:tcPr>
+          <w:p>
+            <w:pPr>
+              <w:spacing w:after="30" w:before="30"/>
+            </w:pPr>
+            <w:r>
+              <w:rPr>
+                <w:rFonts w:ascii="Arial" w:hAnsi="Arial"/>
+                <w:b/>
+                <w:color w:val="1E293B"/>
+                <w:sz w:val="18"/>
               </w:rPr>
               <w:t>Sasaran Pengguna</w:t>
             </w:r>
@@ -601,24 +654,24 @@
           <w:tcPr>
             <w:tcW w:type="dxa" w:w="6192"/>
             <w:tcMar>
-              <w:top w:w="60" w:type="dxa"/>
-              <w:bottom w:w="60" w:type="dxa"/>
+              <w:top w:w="50" w:type="dxa"/>
+              <w:bottom w:w="50" w:type="dxa"/>
               <w:left w:w="100" w:type="dxa"/>
               <w:right w:w="100" w:type="dxa"/>
             </w:tcMar>
-            <w:shd w:fill="FFFFFF"/>
+            <w:shd w:fill="F8FAFC"/>
           </w:tcPr>
           <w:p>
             <w:pPr>
-              <w:spacing w:after="40" w:before="40"/>
+              <w:spacing w:after="30" w:before="30"/>
             </w:pPr>
             <w:r>
               <w:rPr>
                 <w:rFonts w:ascii="Arial" w:hAnsi="Arial"/>
                 <w:color w:val="334155"/>
-                <w:sz w:val="19"/>
+                <w:sz w:val="18"/>
               </w:rPr>
-              <w:t>Peserta Didik SMP Fase D (Kelas VII/VIII/IX)</w:t>
+              <w:t>Peserta Didik SMP / Fase D (Kelas VII/VIII/IX)</w:t>
             </w:r>
           </w:p>
         </w:tc>
@@ -626,7 +679,7 @@
     </w:tbl>
     <w:p>
       <w:pPr>
-        <w:spacing w:after="240"/>
+        <w:spacing w:after="200"/>
       </w:pPr>
     </w:p>
     <w:p>
@@ -663,7 +716,7 @@
           <w:color w:val="1E293B"/>
           <w:sz w:val="19"/>
         </w:rPr>
-        <w:t>Pembelajaran Informatika pada jenjang Sekolah Menengah Pertama (SMP), khususnya pada elemen Sistem Komputer (SK), sering kali dihadapkan pada kendala mendasar terkait ketersediaan dan keamanan sarana praktikum. Perangkat keras komputer fisik (hardware) merupakan aset laboratorium yang mahal dan sangat rentan terhadap kerusakan fisik elektro-mekanik. Komponen sensitif seperti pin soket prosesor LGA, kepingan memori RAM DDR4 yang rentan terhadap lucutan elektrostatik (Electrostatic Discharge / ESD), serta risiko hubungan arus pendek daya (short circuit) menyebabkan guru enggan atau tidak mengizinkan peserta didik untuk membongkar-pasang unit komputer fisik yang berfungsi.</w:t>
+        <w:t>Pembelajaran Informatika pada jenjang Sekolah Menengah Pertama (SMP), khususnya pada elemen Sistem Komputer (SK), sering kali dihadapkan pada kendala mendasar terkait ketersediaan dan keamanan sarana praktikum. Perangkat keras komputer fisik (hardware) merupakan aset laboratorium yang bernilai tinggi dan sangat rentan terhadap kerusakan fisik elektro-mekanik. Komponen sensitif seperti pin soket prosesor LGA, kepingan memori RAM DDR4 yang rentan terhadap lucutan elektrostatik (Electrostatic Discharge / ESD), serta risiko hubungan arus pendek daya (short circuit) menyebabkan guru enggan atau tidak mengizinkan peserta didik untuk membongkar-pasang unit komputer fisik yang berfungsi di laboratorium sekolah.</w:t>
       </w:r>
     </w:p>
     <w:p>
@@ -698,7 +751,7 @@
           <w:color w:val="1E293B"/>
           <w:sz w:val="19"/>
         </w:rPr>
-        <w:t>Menjawab tantangan tersebut, dikembangkan karya 'Lab Maya Sistem Komputer: Perakitan PC, Diagnostik Hardware &amp; Logika Digital'. Media ini dirancang sebagai laboratorium virtual berbasis peramban (Single Page Application) yang menyediakan representasi interaktif, presisi, dan aman dari arsitektur komputer modern. Peserta didik dapat bereksperimen membongkar dan merakit PC secara virtual, menguji skenario inkompatibilitas komponen tanpa risiko kerusakan fisik, menyaksikan proses booting BIOS dan Power-On Self-Test (POST) secara visual-auditori, hingga menjelajahi logika digital abstrak (bit biner, pencampuran warna RGB 24-bit, dan gerbang logika).</w:t>
+        <w:t>Menjawab tantangan tersebut, dikembangkan karya inovasi 'Lab Maya Sistem Komputer: Perakitan PC, Diagnostik Hardware &amp; Logika Digital'. Media ini dirancang sebagai laboratorium virtual berbasis peramban (Single Page Application) yang menyediakan representasi interaktif, presisi, dan aman dari arsitektur komputer modern. Peserta didik dapat bereksperimen membongkar dan merakit PC secara virtual, menguji skenario inkompatibilitas komponen tanpa risiko kerusakan fisik, menyaksikan proses booting BIOS dan Power-On Self-Test (POST) secara visual-auditori, hingga menjelajahi logika digital abstrak (bit biner, pencampuran warna RGB 24-bit, dan gerbang logika).</w:t>
       </w:r>
     </w:p>
     <w:tbl>
@@ -708,7 +761,7 @@
         <w:tblLook w:firstColumn="1" w:firstRow="1" w:lastColumn="0" w:lastRow="0" w:noHBand="0" w:noVBand="1" w:val="04A0"/>
       </w:tblPr>
       <w:tblGrid>
-        <w:gridCol w:w="9360"/>
+        <w:gridCol w:w="9461"/>
       </w:tblGrid>
       <w:tr>
         <w:tc>
@@ -721,6 +774,12 @@
               <w:left w:w="150" w:type="dxa"/>
               <w:right w:w="150" w:type="dxa"/>
             </w:tcMar>
+            <w:tcBorders>
+              <w:left w:val="single" w:sz="24" w:space="0" w:color="0284C7"/>
+              <w:top w:val="none"/>
+              <w:right w:val="none"/>
+              <w:bottom w:val="none"/>
+            </w:tcBorders>
           </w:tcPr>
           <w:p>
             <w:pPr>
@@ -733,15 +792,16 @@
                 <w:color w:val="0369A1"/>
                 <w:sz w:val="19"/>
               </w:rPr>
-              <w:t xml:space="preserve">📌 VISI PEMBELAJARAN: </w:t>
+              <w:t>📌 VISI PEMBELAJARAN INKLUSIF</w:t>
+              <w:br/>
             </w:r>
             <w:r>
               <w:rPr>
                 <w:rFonts w:ascii="Arial" w:hAnsi="Arial"/>
-                <w:color w:val="0C4A6E"/>
-                <w:sz w:val="19"/>
+                <w:color w:val="0F172A"/>
+                <w:sz w:val="18"/>
               </w:rPr>
-              <w:t>Lab Maya ini hadir sebagai jembatan pemerataan mutu pendidikan digital, memungkinkan setiap sekolah di seluruh pelosok Indonesia menyelenggarakan praktikum perakitan komputer standar industri secara gratis, aman, dan 100% luring (offline).</w:t>
+              <w:t>Lab Maya ini hadir sebagai wujud nyata pemerataan mutu pendidikan digital, memungkinkan setiap sekolah di seluruh pelosok Indonesia menyelenggarakan praktikum perakitan komputer standar industri secara gratis, aman, ramah anak, dan 100% luring (offline) tanpa perlu sambungan internet.</w:t>
             </w:r>
           </w:p>
         </w:tc>
@@ -795,18 +855,63 @@
         <w:t>2.1 Capaian Pembelajaran (Fase D — Elemen Sistem Komputer)</w:t>
       </w:r>
     </w:p>
+    <w:tbl>
+      <w:tblPr>
+        <w:tblW w:type="auto" w:w="0"/>
+        <w:jc w:val="center"/>
+        <w:tblLook w:firstColumn="1" w:firstRow="1" w:lastColumn="0" w:lastRow="0" w:noHBand="0" w:noVBand="1" w:val="04A0"/>
+      </w:tblPr>
+      <w:tblGrid>
+        <w:gridCol w:w="9461"/>
+      </w:tblGrid>
+      <w:tr>
+        <w:tc>
+          <w:tcPr>
+            <w:tcW w:type="dxa" w:w="9360"/>
+            <w:shd w:fill="F0F9FF"/>
+            <w:tcMar>
+              <w:top w:w="100" w:type="dxa"/>
+              <w:bottom w:w="100" w:type="dxa"/>
+              <w:left w:w="150" w:type="dxa"/>
+              <w:right w:w="150" w:type="dxa"/>
+            </w:tcMar>
+            <w:tcBorders>
+              <w:left w:val="single" w:sz="24" w:space="0" w:color="0284C7"/>
+              <w:top w:val="none"/>
+              <w:right w:val="none"/>
+              <w:bottom w:val="none"/>
+            </w:tcBorders>
+          </w:tcPr>
+          <w:p>
+            <w:pPr>
+              <w:spacing w:after="40" w:line="276" w:lineRule="auto"/>
+            </w:pPr>
+            <w:r>
+              <w:rPr>
+                <w:rFonts w:ascii="Arial" w:hAnsi="Arial"/>
+                <w:b/>
+                <w:color w:val="0369A1"/>
+                <w:sz w:val="19"/>
+              </w:rPr>
+              <w:t>📌 CAPAIAN PEMBELAJARAN (BSKAP NO. 032/H/KR/2024)</w:t>
+              <w:br/>
+            </w:r>
+            <w:r>
+              <w:rPr>
+                <w:rFonts w:ascii="Arial" w:hAnsi="Arial"/>
+                <w:color w:val="0F172A"/>
+                <w:sz w:val="18"/>
+              </w:rPr>
+              <w:t>“Pada akhir fase D, peserta didik mampu mendeskripsikan komponen, fungsi, dan cara kerja komputer yang membentuk sebuah sistem komputasi, serta menjelaskan proses dan penggunaan kodifikasi data (biner, warna RGB) dalam sistem komputer.”</w:t>
+            </w:r>
+          </w:p>
+        </w:tc>
+      </w:tr>
+    </w:tbl>
     <w:p>
       <w:pPr>
-        <w:spacing w:after="80" w:line="276" w:lineRule="auto"/>
+        <w:spacing w:after="80"/>
       </w:pPr>
-      <w:r>
-        <w:rPr>
-          <w:rFonts w:ascii="Arial" w:hAnsi="Arial"/>
-          <w:color w:val="1E293B"/>
-          <w:sz w:val="19"/>
-        </w:rPr>
-        <w:t>“Pada akhir fase D, peserta didik mampu mendeskripsikan komponen, fungsi, dan cara kerja komputer yang membentuk sebuah sistem komputasi, serta menjelaskan proses dan penggunaan kodifikasi data (biner, warna RGB) dalam sistem komputer.”</w:t>
-      </w:r>
     </w:p>
     <w:p>
       <w:pPr>
@@ -820,7 +925,7 @@
           <w:color w:val="0284C7"/>
           <w:sz w:val="22"/>
         </w:rPr>
-        <w:t>2.2 Tujuan Pembelajaran (TP) &amp; Alur Ketercapaian</w:t>
+        <w:t>2.2 Tujuan Pembelajaran (TP) &amp; Indikator Ketercapaian</w:t>
       </w:r>
     </w:p>
     <w:p>
@@ -843,7 +948,7 @@
           <w:color w:val="1E293B"/>
           <w:sz w:val="19"/>
         </w:rPr>
-        <w:t>Peserta didik mampu mengidentifikasi dan membedakan komponen penyusun unit pemrosesan komputer (CPU, Motherboard, RAM, SSD NVMe, GPU, PSU) beserta karakteristik dan spesifikasi fisiknya.</w:t>
+        <w:t>Peserta didik mampu mengidentifikasi dan membedakan komponen penyusun unit pemrosesan komputer (CPU LGA 1700, Motherboard ATX, RAM DDR4, SSD NVMe M.2, GPU PCIe, PSU ATX 24-Pin) beserta karakteristik dan spesifikasi fisiknya.</w:t>
       </w:r>
     </w:p>
     <w:p>
@@ -866,7 +971,7 @@
           <w:color w:val="1E293B"/>
           <w:sz w:val="19"/>
         </w:rPr>
-        <w:t>Peserta didik mampu menyimulasikan prosedur perakitan komputer secara runtut, presisi, dan sesuai standar keselamatan kerja perakitan (K3 elektronika).</w:t>
+        <w:t>Peserta didik mampu menyimulasikan prosedur perakitan komputer secara runtut, presisi, dan sesuai standar keselamatan kerja perakitan (K3 elektronika antistatis).</w:t>
       </w:r>
     </w:p>
     <w:p>
@@ -889,7 +994,7 @@
           <w:color w:val="1E293B"/>
           <w:sz w:val="19"/>
         </w:rPr>
-        <w:t>Peserta didik mampu menganalisis kegagalan perakitan, mendeteksi inkompatibilitas komponen (distraktor soket/arsitektur), dan membaca kode diagnostik LED POST BIOS.</w:t>
+        <w:t>Peserta didik mampu menganalisis kegagalan perakitan, mendeteksi inkompatibilitas komponen (distraktor soket/arsitektur seperti RAM DDR2 dan HDD IDE), serta membaca kode diagnostik 4-Phase LED POST BIOS.</w:t>
       </w:r>
     </w:p>
     <w:p>
@@ -912,7 +1017,7 @@
           <w:color w:val="1E293B"/>
           <w:sz w:val="19"/>
         </w:rPr>
-        <w:t>Peserta didik mampu membuktikan secara empiris konsep representasi data biner 8-bit, pencampuran warna piksel monitor 24-bit RGB, serta operasi tabel kebenaran gerbang logika dasar.</w:t>
+        <w:t>Peserta didik mampu membuktikan secara empiris konsep representasi data biner 8-bit (konversi ke desimal), pencampuran warna piksel monitor 24-bit RGB (HEX code), serta operasi tabel kebenaran gerbang logika dasar.</w:t>
       </w:r>
     </w:p>
     <w:p>
@@ -950,7 +1055,7 @@
           <w:color w:val="1E293B"/>
           <w:sz w:val="19"/>
         </w:rPr>
-        <w:t>Mengidentifikasi kesalahan pemasangan komponen, menganalisis gejala kegagalan boot, dan memecahkan teka-teki logika digital.</w:t>
+        <w:t>Mengidentifikasi kesalahan pemasangan komponen, menganalisis gejala kegagalan boot, dan memecahkan teka-teki logika digital secara ilmiah.</w:t>
       </w:r>
     </w:p>
     <w:p>
@@ -973,7 +1078,7 @@
           <w:color w:val="1E293B"/>
           <w:sz w:val="19"/>
         </w:rPr>
-        <w:t>Melakukan eksplorasi mandiri di laboratorium virtual dengan tempo belajar yang disesuaikan dengan kebutuhan individu peserta didik.</w:t>
+        <w:t>Melakukan eksplorasi mandiri di laboratorium virtual dengan tempo belajar yang disesuaikan dengan ritme kebutuhan individu peserta didik.</w:t>
       </w:r>
     </w:p>
     <w:p>
@@ -996,7 +1101,7 @@
           <w:color w:val="1E293B"/>
           <w:sz w:val="19"/>
         </w:rPr>
-        <w:t>Mengombinasikan kombinasi warna RGB dan merancang alur logika input gerbang logika.</w:t>
+        <w:t>Mengombinasikan komposisi warna RGB dan merancang alur logika input pada gerbang logika digital.</w:t>
       </w:r>
     </w:p>
     <w:p>
@@ -1110,7 +1215,7 @@
           <w:color w:val="0284C7"/>
           <w:sz w:val="22"/>
         </w:rPr>
-        <w:t>3.2 Langkah Menjalankan Media</w:t>
+        <w:t>3.2 Langkah Cepat Menjalankan Media</w:t>
       </w:r>
     </w:p>
     <w:p>
@@ -1133,7 +1238,7 @@
           <w:color w:val="1E293B"/>
           <w:sz w:val="19"/>
         </w:rPr>
-        <w:t>Ekstrak folder karya jika berada dalam arsip ZIP.</w:t>
+        <w:t>Ekstrak folder arsip 'Lab Maya - Perakitan Komputer - Fanani.zip'.</w:t>
       </w:r>
     </w:p>
     <w:p>
@@ -1156,7 +1261,7 @@
           <w:color w:val="1E293B"/>
           <w:sz w:val="19"/>
         </w:rPr>
-        <w:t>Buka folder dan temukan berkas utama bernama 'index.html'.</w:t>
+        <w:t>Buka folder hasil ekstraksi dan temukan berkas utama bernama 'index.html'.</w:t>
       </w:r>
     </w:p>
     <w:p>
@@ -1202,7 +1307,7 @@
           <w:color w:val="1E293B"/>
           <w:sz w:val="19"/>
         </w:rPr>
-        <w:t>Aplikasi akan langsung terbuka dalam waktu kurang dari 1 detik dan siap digunakan.</w:t>
+        <w:t>Aplikasi Lab Maya akan langsung terbuka seketika dalam waktu kurang dari 1 detik dan siap digunakan untuk pembelajaran.</w:t>
       </w:r>
     </w:p>
     <w:p>
@@ -1217,7 +1322,7 @@
           <w:color w:val="0F2744"/>
           <w:sz w:val="26"/>
         </w:rPr>
-        <w:t>BAB IV. PANDUAN PENGGUNAAN FITUR &amp; TANGKAPAN LAYAR</w:t>
+        <w:t>BAB IV. STRUKTUR MENU &amp; 7 TAB SKENARIO TERPADU</w:t>
       </w:r>
     </w:p>
     <w:p>
@@ -1230,7 +1335,196 @@
           <w:color w:val="1E293B"/>
           <w:sz w:val="19"/>
         </w:rPr>
-        <w:t>Berikut merupakan panduan operasional komprehensif untuk setiap modul antarmuka yang dilengkapi dengan tangkapan layar berpenanda serta uraian interaksi pengguna:</w:t>
+        <w:t>Aplikasi Lab Maya dirancang menggunakan arsitektur Single Page Application (SPA) modular dengan 7 tab navigasi skenario interaktif yang dapat diakses melalui bilah menu atas:</w:t>
+      </w:r>
+    </w:p>
+    <w:p>
+      <w:pPr>
+        <w:pStyle w:val="ListBullet"/>
+        <w:spacing w:after="60" w:line="276" w:lineRule="auto"/>
+      </w:pPr>
+      <w:r>
+        <w:rPr>
+          <w:rFonts w:ascii="Arial" w:hAnsi="Arial"/>
+          <w:b/>
+          <w:color w:val="0F2744"/>
+          <w:sz w:val="19"/>
+        </w:rPr>
+        <w:t xml:space="preserve">1. Tab Teori: </w:t>
+      </w:r>
+      <w:r>
+        <w:rPr>
+          <w:rFonts w:ascii="Arial" w:hAnsi="Arial"/>
+          <w:color w:val="1E293B"/>
+          <w:sz w:val="19"/>
+        </w:rPr>
+        <w:t>Memuat materi ensiklopedia komponen hardware, fungsi 5 organ utama komputer, dan bagan alur Input-Proses-Output (IPO).</w:t>
+      </w:r>
+    </w:p>
+    <w:p>
+      <w:pPr>
+        <w:pStyle w:val="ListBullet"/>
+        <w:spacing w:after="60" w:line="276" w:lineRule="auto"/>
+      </w:pPr>
+      <w:r>
+        <w:rPr>
+          <w:rFonts w:ascii="Arial" w:hAnsi="Arial"/>
+          <w:b/>
+          <w:color w:val="0F2744"/>
+          <w:sz w:val="19"/>
+        </w:rPr>
+        <w:t xml:space="preserve">2. Tab Prosedur: </w:t>
+      </w:r>
+      <w:r>
+        <w:rPr>
+          <w:rFonts w:ascii="Arial" w:hAnsi="Arial"/>
+          <w:color w:val="1E293B"/>
+          <w:sz w:val="19"/>
+        </w:rPr>
+        <w:t>Pedoman standar operasional prosedur perakitan PC, panduan K3 elektronika (gelang antistatis, grounding), dan tips keselamatan kerja teknisi.</w:t>
+      </w:r>
+    </w:p>
+    <w:p>
+      <w:pPr>
+        <w:pStyle w:val="ListBullet"/>
+        <w:spacing w:after="60" w:line="276" w:lineRule="auto"/>
+      </w:pPr>
+      <w:r>
+        <w:rPr>
+          <w:rFonts w:ascii="Arial" w:hAnsi="Arial"/>
+          <w:b/>
+          <w:color w:val="0F2744"/>
+          <w:sz w:val="19"/>
+        </w:rPr>
+        <w:t xml:space="preserve">3. Tab Perakitan PC: </w:t>
+      </w:r>
+      <w:r>
+        <w:rPr>
+          <w:rFonts w:ascii="Arial" w:hAnsi="Arial"/>
+          <w:color w:val="1E293B"/>
+          <w:sz w:val="19"/>
+        </w:rPr>
+        <w:t>Meja kerja simulasi drag-and-drop komponen ke soket motherboard ATX, stepper panduan adaptif 5 langkah, tombol uji booting Power-On, dan sakelar mode uji masalah.</w:t>
+      </w:r>
+    </w:p>
+    <w:p>
+      <w:pPr>
+        <w:pStyle w:val="ListBullet"/>
+        <w:spacing w:after="60" w:line="276" w:lineRule="auto"/>
+      </w:pPr>
+      <w:r>
+        <w:rPr>
+          <w:rFonts w:ascii="Arial" w:hAnsi="Arial"/>
+          <w:b/>
+          <w:color w:val="0F2744"/>
+          <w:sz w:val="19"/>
+        </w:rPr>
+        <w:t xml:space="preserve">4. Tab Eksplorasi Digital: </w:t>
+      </w:r>
+      <w:r>
+        <w:rPr>
+          <w:rFonts w:ascii="Arial" w:hAnsi="Arial"/>
+          <w:color w:val="1E293B"/>
+          <w:sz w:val="19"/>
+        </w:rPr>
+        <w:t>Tiga modul eksplorasi kodifikasi data sains: sakelar biner 8-bit ke desimal, simulator percampuran warna sub-piksel RGB 24-bit, dan laboratorium gerbang logika.</w:t>
+      </w:r>
+    </w:p>
+    <w:p>
+      <w:pPr>
+        <w:pStyle w:val="ListBullet"/>
+        <w:spacing w:after="60" w:line="276" w:lineRule="auto"/>
+      </w:pPr>
+      <w:r>
+        <w:rPr>
+          <w:rFonts w:ascii="Arial" w:hAnsi="Arial"/>
+          <w:b/>
+          <w:color w:val="0F2744"/>
+          <w:sz w:val="19"/>
+        </w:rPr>
+        <w:t xml:space="preserve">5. Tab LKPD Digital: </w:t>
+      </w:r>
+      <w:r>
+        <w:rPr>
+          <w:rFonts w:ascii="Arial" w:hAnsi="Arial"/>
+          <w:color w:val="1E293B"/>
+          <w:sz w:val="19"/>
+        </w:rPr>
+        <w:t>Lembar Kerja Peserta Didik digital mandiri: 5 soal Pilihan Ganda, 5 soal Benar/Salah, 5 pasang Menjodohkan beranimasi kabel, dan fitur cetak/simpan PDF ber-KOP resmi.</w:t>
+      </w:r>
+    </w:p>
+    <w:p>
+      <w:pPr>
+        <w:pStyle w:val="ListBullet"/>
+        <w:spacing w:after="60" w:line="276" w:lineRule="auto"/>
+      </w:pPr>
+      <w:r>
+        <w:rPr>
+          <w:rFonts w:ascii="Arial" w:hAnsi="Arial"/>
+          <w:b/>
+          <w:color w:val="0F2744"/>
+          <w:sz w:val="19"/>
+        </w:rPr>
+        <w:t xml:space="preserve">6. Tab Pengembang: </w:t>
+      </w:r>
+      <w:r>
+        <w:rPr>
+          <w:rFonts w:ascii="Arial" w:hAnsi="Arial"/>
+          <w:color w:val="1E293B"/>
+          <w:sz w:val="19"/>
+        </w:rPr>
+        <w:t>Profil lengkap pengembang (Ach. Chanifuddin Fanani, S.Pd., SMP Negeri 2 Lamongan), NIP, kontak surel, dan tautan portofolio edukasi.</w:t>
+      </w:r>
+    </w:p>
+    <w:p>
+      <w:pPr>
+        <w:pStyle w:val="ListBullet"/>
+        <w:spacing w:after="60" w:line="276" w:lineRule="auto"/>
+      </w:pPr>
+      <w:r>
+        <w:rPr>
+          <w:rFonts w:ascii="Arial" w:hAnsi="Arial"/>
+          <w:b/>
+          <w:color w:val="0F2744"/>
+          <w:sz w:val="19"/>
+        </w:rPr>
+        <w:t xml:space="preserve">7. Tab Referensi: </w:t>
+      </w:r>
+      <w:r>
+        <w:rPr>
+          <w:rFonts w:ascii="Arial" w:hAnsi="Arial"/>
+          <w:color w:val="1E293B"/>
+          <w:sz w:val="19"/>
+        </w:rPr>
+        <w:t>Transparansi sumber rujukan kurikulum BSKAP, buku referensi Hennessy &amp; Patterson, inventaris aset AI/vektor SVG, font lokal SIL OFL, dan audio prosedural.</w:t>
+      </w:r>
+    </w:p>
+    <w:p>
+      <w:pPr>
+        <w:keepNext/>
+        <w:spacing w:before="280" w:after="80"/>
+      </w:pPr>
+      <w:r>
+        <w:rPr>
+          <w:rFonts w:ascii="Arial" w:hAnsi="Arial"/>
+          <w:b/>
+          <w:color w:val="0F2744"/>
+          <w:sz w:val="26"/>
+        </w:rPr>
+        <w:t>BAB V. PANDUAN PENGGUNAAN FITUR &amp; TANGKAPAN LAYAR</w:t>
+      </w:r>
+    </w:p>
+    <w:p>
+      <w:pPr>
+        <w:spacing w:after="80" w:line="276" w:lineRule="auto"/>
+      </w:pPr>
+      <w:r>
+        <w:rPr>
+          <w:rFonts w:ascii="Arial" w:hAnsi="Arial"/>
+          <w:color w:val="1E293B"/>
+          <w:sz w:val="19"/>
+        </w:rPr>
+        <w:t>Berikut merupakan panduan operasional komprehensif untuk setiap antarmuka Lab Maya yang dilengkapi tangkapan layar berpenanda serta rincian fungsi tombol interaksi pengguna:</w:t>
       </w:r>
     </w:p>
     <w:p>
@@ -1304,8 +1598,8 @@
         <w:tblLook w:firstColumn="1" w:firstRow="1" w:lastColumn="0" w:lastRow="0" w:noHBand="0" w:noVBand="1" w:val="04A0"/>
       </w:tblPr>
       <w:tblGrid>
-        <w:gridCol w:w="4680"/>
-        <w:gridCol w:w="4680"/>
+        <w:gridCol w:w="4730"/>
+        <w:gridCol w:w="4730"/>
       </w:tblGrid>
       <w:tr>
         <w:tc>
@@ -1375,7 +1669,7 @@
                 <w:color w:val="0284C7"/>
                 <w:sz w:val="17"/>
               </w:rPr>
-              <w:t>1. Header &amp; Logo</w:t>
+              <w:t>1. Header &amp; Logo Lembaga</w:t>
             </w:r>
           </w:p>
         </w:tc>
@@ -1397,7 +1691,7 @@
                 <w:color w:val="334155"/>
                 <w:sz w:val="17"/>
               </w:rPr>
-              <w:t>Menampilkan identitas kementerian, logo Tut Wuri Handayani, dan judul aplikasi dengan estetika futuristik.</w:t>
+              <w:t>Menampilkan identitas kementerian, logo Tut Wuri Handayani, logo Sobat SMP 2025, dan judul media dengan tipografi futuristik.</w:t>
             </w:r>
           </w:p>
         </w:tc>
@@ -1422,7 +1716,7 @@
                 <w:color w:val="0284C7"/>
                 <w:sz w:val="17"/>
               </w:rPr>
-              <w:t>2. Badge Fase D</w:t>
+              <w:t>2. Badge Fase D Kurikulum</w:t>
             </w:r>
           </w:p>
         </w:tc>
@@ -1444,7 +1738,7 @@
                 <w:color w:val="334155"/>
                 <w:sz w:val="17"/>
               </w:rPr>
-              <w:t>Penanda jenjang kurikulum Informatika SMP Fase D untuk memudahkan orientasi guru dan siswa.</w:t>
+              <w:t>Penanda jenjang resmi kurikulum Informatika SMP Fase D untuk memudahkan orientasi guru dan peserta didik.</w:t>
             </w:r>
           </w:p>
         </w:tc>
@@ -1491,7 +1785,7 @@
                 <w:color w:val="334155"/>
                 <w:sz w:val="17"/>
               </w:rPr>
-              <w:t>Memicu transisi animasi membuka ruang meja kerja laboratorium virtual dan mengaktifkan Web Audio API.</w:t>
+              <w:t>Memicu transisi animasi membuka ruang meja kerja laboratorium virtual dan mengaktifkan Web Audio API browser.</w:t>
             </w:r>
           </w:p>
         </w:tc>
@@ -1516,7 +1810,7 @@
                 <w:color w:val="0284C7"/>
                 <w:sz w:val="17"/>
               </w:rPr>
-              <w:t>4. Tombol 📖 Panduan</w:t>
+              <w:t>4. Tombol 📖 Panduan Lab</w:t>
             </w:r>
           </w:p>
         </w:tc>
@@ -1538,7 +1832,7 @@
                 <w:color w:val="334155"/>
                 <w:sz w:val="17"/>
               </w:rPr>
-              <w:t>Membuka jendela modal petunjuk ringkas keselamatan kerja dan navigasi alat lab.</w:t>
+              <w:t>Membuka jendela modal petunjuk ringkas keselamatan kerja, tujuan belajar, dan alur eksplorasi alat praktikum.</w:t>
             </w:r>
           </w:p>
         </w:tc>
@@ -1620,8 +1914,8 @@
         <w:tblLook w:firstColumn="1" w:firstRow="1" w:lastColumn="0" w:lastRow="0" w:noHBand="0" w:noVBand="1" w:val="04A0"/>
       </w:tblPr>
       <w:tblGrid>
-        <w:gridCol w:w="4680"/>
-        <w:gridCol w:w="4680"/>
+        <w:gridCol w:w="4730"/>
+        <w:gridCol w:w="4730"/>
       </w:tblGrid>
       <w:tr>
         <w:tc>
@@ -1713,7 +2007,7 @@
                 <w:color w:val="334155"/>
                 <w:sz w:val="17"/>
               </w:rPr>
-              <w:t>Bilah menu horizontal fleksibel untuk berpindah antar modul (Teori, Prosedur, Rakit PC, Eksplorasi, LKPD).</w:t>
+              <w:t>Bilah menu horizontal fleksibel untuk berpindah antar modul (Teori, Prosedur, Rakit PC, Eksplorasi, LKPD, Pengembang, Referensi).</w:t>
             </w:r>
           </w:p>
         </w:tc>
@@ -1760,7 +2054,7 @@
                 <w:color w:val="334155"/>
                 <w:sz w:val="17"/>
               </w:rPr>
-              <w:t>Menampilkan visualisasi 3D-styled, fungsi utama, spesifikasi, dan peran masing-masing komponen dalam siklus data.</w:t>
+              <w:t>Menampilkan visualisasi 3D, fungsi utama, spesifikasi, dan peran masing-masing komponen dalam siklus data komputer.</w:t>
             </w:r>
           </w:p>
         </w:tc>
@@ -1807,7 +2101,7 @@
                 <w:color w:val="334155"/>
                 <w:sz w:val="17"/>
               </w:rPr>
-              <w:t>Arahkan kursor mouse ke setiap kartu untuk melihat rincian soket, kecepatan transfer, dan peran arsitekturnya.</w:t>
+              <w:t>Arahkan kursor mouse ke setiap kartu untuk membaca rincian soket, kecepatan transfer, dan peran arsitekturnya secara interaktif.</w:t>
             </w:r>
           </w:p>
         </w:tc>
@@ -1889,8 +2183,8 @@
         <w:tblLook w:firstColumn="1" w:firstRow="1" w:lastColumn="0" w:lastRow="0" w:noHBand="0" w:noVBand="1" w:val="04A0"/>
       </w:tblPr>
       <w:tblGrid>
-        <w:gridCol w:w="4680"/>
-        <w:gridCol w:w="4680"/>
+        <w:gridCol w:w="4730"/>
+        <w:gridCol w:w="4730"/>
       </w:tblGrid>
       <w:tr>
         <w:tc>
@@ -1982,7 +2276,7 @@
                 <w:color w:val="334155"/>
                 <w:sz w:val="17"/>
               </w:rPr>
-              <w:t>Pedoman penggunaan gelang antistatis, pembuangan muatan statis tubuh, dan penggunaan obeng bertip magnetik.</w:t>
+              <w:t>Pedoman penggunaan gelang antistatis, pembuangan muatan statis tubuh ke ground, dan penggunaan obeng bertip magnetik.</w:t>
             </w:r>
           </w:p>
         </w:tc>
@@ -2029,7 +2323,7 @@
                 <w:color w:val="334155"/>
                 <w:sz w:val="17"/>
               </w:rPr>
-              <w:t>Urutan logis perakitan: (1) CPU, (2) RAM, (3) SSD M.2, (4) GPU PCIe, hingga (5) Kabel Daya 24-Pin ATX.</w:t>
+              <w:t>Urutan logis perakitan: (1) Soket CPU, (2) Slot RAM DDR4, (3) Slot M.2 SSD, (4) Slot PCIe GPU, hingga (5) Kabel Daya 24-Pin ATX.</w:t>
             </w:r>
           </w:p>
         </w:tc>
@@ -2158,8 +2452,8 @@
         <w:tblLook w:firstColumn="1" w:firstRow="1" w:lastColumn="0" w:lastRow="0" w:noHBand="0" w:noVBand="1" w:val="04A0"/>
       </w:tblPr>
       <w:tblGrid>
-        <w:gridCol w:w="4680"/>
-        <w:gridCol w:w="4680"/>
+        <w:gridCol w:w="4730"/>
+        <w:gridCol w:w="4730"/>
       </w:tblGrid>
       <w:tr>
         <w:tc>
@@ -2521,8 +2815,8 @@
         <w:tblLook w:firstColumn="1" w:firstRow="1" w:lastColumn="0" w:lastRow="0" w:noHBand="0" w:noVBand="1" w:val="04A0"/>
       </w:tblPr>
       <w:tblGrid>
-        <w:gridCol w:w="4680"/>
-        <w:gridCol w:w="4680"/>
+        <w:gridCol w:w="4730"/>
+        <w:gridCol w:w="4730"/>
       </w:tblGrid>
       <w:tr>
         <w:tc>
@@ -2790,8 +3084,8 @@
         <w:tblLook w:firstColumn="1" w:firstRow="1" w:lastColumn="0" w:lastRow="0" w:noHBand="0" w:noVBand="1" w:val="04A0"/>
       </w:tblPr>
       <w:tblGrid>
-        <w:gridCol w:w="4680"/>
-        <w:gridCol w:w="4680"/>
+        <w:gridCol w:w="4730"/>
+        <w:gridCol w:w="4730"/>
       </w:tblGrid>
       <w:tr>
         <w:tc>
@@ -2861,7 +3155,7 @@
                 <w:color w:val="0284C7"/>
                 <w:sz w:val="17"/>
               </w:rPr>
-              <w:t>1. Lembar Kerja Peserta Didik</w:t>
+              <w:t>1. Tab Bagian LKPD</w:t>
             </w:r>
           </w:p>
         </w:tc>
@@ -2883,7 +3177,7 @@
                 <w:color w:val="334155"/>
                 <w:sz w:val="17"/>
               </w:rPr>
-              <w:t>Penugasan terstruktur yang mencakup identifikasi bagian, analisa kasus kerusakan, dan penalaran teknis.</w:t>
+              <w:t>Akses cepat antar bagian: Pilihan Ganda (Bagian A), Benar/Salah (Bagian B), dan Menjodohkan (Bagian C).</w:t>
             </w:r>
           </w:p>
         </w:tc>
@@ -2908,7 +3202,7 @@
                 <w:color w:val="0284C7"/>
                 <w:sz w:val="17"/>
               </w:rPr>
-              <w:t>2. Sistem Kuis Interaktif</w:t>
+              <w:t>2. Sistem Kuis Stimulus</w:t>
             </w:r>
           </w:p>
         </w:tc>
@@ -2930,7 +3224,7 @@
                 <w:color w:val="334155"/>
                 <w:sz w:val="17"/>
               </w:rPr>
-              <w:t>Evaluasi pilihan ganda berbasis stimulus dengan umpan balik langsung (pembahasan ilmiah seketika).</w:t>
+              <w:t>Evaluasi interaktif dengan umpan balik langsung seketika (penjelasan ilmiah dan nilai otomatis).</w:t>
             </w:r>
           </w:p>
         </w:tc>
@@ -2955,7 +3249,7 @@
                 <w:color w:val="0284C7"/>
                 <w:sz w:val="17"/>
               </w:rPr>
-              <w:t>3. Rekap Skor &amp; Pencetakan Nilai</w:t>
+              <w:t>3. Fitur Cetak / Simpan PDF</w:t>
             </w:r>
           </w:p>
         </w:tc>
@@ -2977,7 +3271,7 @@
                 <w:color w:val="334155"/>
                 <w:sz w:val="17"/>
               </w:rPr>
-              <w:t>Sistem kalkulasi nilai otomatis yang dapat dicetak atau disimpan sebagai arsip portofolio siswa.</w:t>
+              <w:t>Tombol '🖨️ Cetak' yang secara otomatis menyusun layout laporan resmi ber-KOP sekolah, nilai, predikat, dan tanda tangan.</w:t>
             </w:r>
           </w:p>
         </w:tc>
@@ -3000,7 +3294,20 @@
           <w:color w:val="0F2744"/>
           <w:sz w:val="26"/>
         </w:rPr>
-        <w:t>BAB V. FITUR PEDAGOGIS &amp; INTERAKTIVITAS KHUSUS</w:t>
+        <w:t>BAB VI. BANK SOAL EVALUASI LKPD, RUBRIK &amp; KUNCI JAWABAN ILMIAH</w:t>
+      </w:r>
+    </w:p>
+    <w:p>
+      <w:pPr>
+        <w:spacing w:after="80" w:line="276" w:lineRule="auto"/>
+      </w:pPr>
+      <w:r>
+        <w:rPr>
+          <w:rFonts w:ascii="Arial" w:hAnsi="Arial"/>
+          <w:color w:val="1E293B"/>
+          <w:sz w:val="19"/>
+        </w:rPr>
+        <w:t>Modul LKPD pada Lab Maya terdiri atas 3 bagian terpadu dengan bobot total nilai 100 poin:</w:t>
       </w:r>
     </w:p>
     <w:p>
@@ -3015,20 +3322,472 @@
           <w:color w:val="0284C7"/>
           <w:sz w:val="22"/>
         </w:rPr>
-        <w:t>5.1 Scaffolding Pembelajaran Bertahap</w:t>
+        <w:t>6.1 Bagian A: Pilihan Ganda (5 Soal — Bobot 30 Poin)</w:t>
+      </w:r>
+    </w:p>
+    <w:tbl>
+      <w:tblPr>
+        <w:tblW w:type="auto" w:w="0"/>
+        <w:jc w:val="center"/>
+        <w:tblLook w:firstColumn="1" w:firstRow="1" w:lastColumn="0" w:lastRow="0" w:noHBand="0" w:noVBand="1" w:val="04A0"/>
+      </w:tblPr>
+      <w:tblGrid>
+        <w:gridCol w:w="9461"/>
+      </w:tblGrid>
+      <w:tr>
+        <w:tc>
+          <w:tcPr>
+            <w:tcW w:type="dxa" w:w="9360"/>
+            <w:shd w:fill="F0F9FF"/>
+            <w:tcMar>
+              <w:top w:w="100" w:type="dxa"/>
+              <w:bottom w:w="100" w:type="dxa"/>
+              <w:left w:w="150" w:type="dxa"/>
+              <w:right w:w="150" w:type="dxa"/>
+            </w:tcMar>
+            <w:tcBorders>
+              <w:left w:val="single" w:sz="24" w:space="0" w:color="0284C7"/>
+              <w:top w:val="none"/>
+              <w:right w:val="none"/>
+              <w:bottom w:val="none"/>
+            </w:tcBorders>
+          </w:tcPr>
+          <w:p>
+            <w:pPr>
+              <w:spacing w:after="40" w:line="276" w:lineRule="auto"/>
+            </w:pPr>
+            <w:r>
+              <w:rPr>
+                <w:rFonts w:ascii="Arial" w:hAnsi="Arial"/>
+                <w:b/>
+                <w:color w:val="0369A1"/>
+                <w:sz w:val="19"/>
+              </w:rPr>
+              <w:t>📌 Soal 1 (Otak Komputer)</w:t>
+              <w:br/>
+            </w:r>
+            <w:r>
+              <w:rPr>
+                <w:rFonts w:ascii="Arial" w:hAnsi="Arial"/>
+                <w:color w:val="0F172A"/>
+                <w:sz w:val="18"/>
+              </w:rPr>
+              <w:t>Komponen komputer yang berfungsi sebagai 'otak' untuk memproses semua instruksi adalah...</w:t>
+              <w:br/>
+              <w:br/>
+              <w:t>Pilihan: A. RAM | B. CPU | C. SSD | D. GPU</w:t>
+              <w:br/>
+              <w:t>Jawaban Benar: B (CPU)</w:t>
+              <w:br/>
+              <w:t>Pembahasan Ilmiah: CPU (Central Processing Unit) adalah unit pemrosesan pusat yang mengeksekusi instruksi program melalui Control Unit dan ALU. RAM hanya menyimpan data sementara, SSD menyimpan data permanen, dan GPU khusus mengolah grafis.</w:t>
+            </w:r>
+          </w:p>
+        </w:tc>
+      </w:tr>
+    </w:tbl>
+    <w:p>
+      <w:pPr>
+        <w:spacing w:after="80"/>
+      </w:pPr>
+    </w:p>
+    <w:tbl>
+      <w:tblPr>
+        <w:tblW w:type="auto" w:w="0"/>
+        <w:jc w:val="center"/>
+        <w:tblLook w:firstColumn="1" w:firstRow="1" w:lastColumn="0" w:lastRow="0" w:noHBand="0" w:noVBand="1" w:val="04A0"/>
+      </w:tblPr>
+      <w:tblGrid>
+        <w:gridCol w:w="9461"/>
+      </w:tblGrid>
+      <w:tr>
+        <w:tc>
+          <w:tcPr>
+            <w:tcW w:type="dxa" w:w="9360"/>
+            <w:shd w:fill="F0F9FF"/>
+            <w:tcMar>
+              <w:top w:w="100" w:type="dxa"/>
+              <w:bottom w:w="100" w:type="dxa"/>
+              <w:left w:w="150" w:type="dxa"/>
+              <w:right w:w="150" w:type="dxa"/>
+            </w:tcMar>
+            <w:tcBorders>
+              <w:left w:val="single" w:sz="24" w:space="0" w:color="0284C7"/>
+              <w:top w:val="none"/>
+              <w:right w:val="none"/>
+              <w:bottom w:val="none"/>
+            </w:tcBorders>
+          </w:tcPr>
+          <w:p>
+            <w:pPr>
+              <w:spacing w:after="40" w:line="276" w:lineRule="auto"/>
+            </w:pPr>
+            <w:r>
+              <w:rPr>
+                <w:rFonts w:ascii="Arial" w:hAnsi="Arial"/>
+                <w:b/>
+                <w:color w:val="0369A1"/>
+                <w:sz w:val="19"/>
+              </w:rPr>
+              <w:t>📌 Soal 2 (Kegagalan Tanpa RAM)</w:t>
+              <w:br/>
+            </w:r>
+            <w:r>
+              <w:rPr>
+                <w:rFonts w:ascii="Arial" w:hAnsi="Arial"/>
+                <w:color w:val="0F172A"/>
+                <w:sz w:val="18"/>
+              </w:rPr>
+              <w:t>Apa yang terjadi jika komputer dinyalakan tanpa RAM terpasang?</w:t>
+              <w:br/>
+              <w:br/>
+              <w:t>Pilihan: A. Komputer berjalan normal | B. Layar gelap tapi komputer hidup | C. Komputer tidak bisa boot dan mengeluarkan bunyi beep | D. Komputer berjalan lambat saja</w:t>
+              <w:br/>
+              <w:t>Jawaban Benar: C (Komputer tidak bisa boot dan mengeluarkan bunyi beep)</w:t>
+              <w:br/>
+              <w:t>Pembahasan Ilmiah: Tanpa RAM, komputer tidak memiliki memori kerja utama untuk memuat instruksi awal firmware BIOS. POST BIOS mendeteksi ketiadaan RAM dan memicu kode error berupa bunyi beep berulang.</w:t>
+            </w:r>
+          </w:p>
+        </w:tc>
+      </w:tr>
+    </w:tbl>
+    <w:p>
+      <w:pPr>
+        <w:spacing w:after="80"/>
+      </w:pPr>
+    </w:p>
+    <w:tbl>
+      <w:tblPr>
+        <w:tblW w:type="auto" w:w="0"/>
+        <w:jc w:val="center"/>
+        <w:tblLook w:firstColumn="1" w:firstRow="1" w:lastColumn="0" w:lastRow="0" w:noHBand="0" w:noVBand="1" w:val="04A0"/>
+      </w:tblPr>
+      <w:tblGrid>
+        <w:gridCol w:w="9461"/>
+      </w:tblGrid>
+      <w:tr>
+        <w:tc>
+          <w:tcPr>
+            <w:tcW w:type="dxa" w:w="9360"/>
+            <w:shd w:fill="F0F9FF"/>
+            <w:tcMar>
+              <w:top w:w="100" w:type="dxa"/>
+              <w:bottom w:w="100" w:type="dxa"/>
+              <w:left w:w="150" w:type="dxa"/>
+              <w:right w:w="150" w:type="dxa"/>
+            </w:tcMar>
+            <w:tcBorders>
+              <w:left w:val="single" w:sz="24" w:space="0" w:color="0284C7"/>
+              <w:top w:val="none"/>
+              <w:right w:val="none"/>
+              <w:bottom w:val="none"/>
+            </w:tcBorders>
+          </w:tcPr>
+          <w:p>
+            <w:pPr>
+              <w:spacing w:after="40" w:line="276" w:lineRule="auto"/>
+            </w:pPr>
+            <w:r>
+              <w:rPr>
+                <w:rFonts w:ascii="Arial" w:hAnsi="Arial"/>
+                <w:b/>
+                <w:color w:val="0369A1"/>
+                <w:sz w:val="19"/>
+              </w:rPr>
+              <w:t>📌 Soal 3 (Memori Non-Volatil)</w:t>
+              <w:br/>
+            </w:r>
+            <w:r>
+              <w:rPr>
+                <w:rFonts w:ascii="Arial" w:hAnsi="Arial"/>
+                <w:color w:val="0F172A"/>
+                <w:sz w:val="18"/>
+              </w:rPr>
+              <w:t>Manakah yang termasuk memori non-volatil (data tidak hilang saat komputer dimatikan)?</w:t>
+              <w:br/>
+              <w:br/>
+              <w:t>Pilihan: A. RAM | B. Cache CPU | C. SSD | D. Register</w:t>
+              <w:br/>
+              <w:t>Jawaban Benar: C (SSD)</w:t>
+              <w:br/>
+              <w:t>Pembahasan Ilmiah: SSD (Solid State Drive) dan HDD menggunakan teknologi non-volatil sehingga data tetap tersimpan saat aliran listrik padam. RAM, Cache, dan Register bersifat volatil.</w:t>
+            </w:r>
+          </w:p>
+        </w:tc>
+      </w:tr>
+    </w:tbl>
+    <w:p>
+      <w:pPr>
+        <w:spacing w:after="80"/>
+      </w:pPr>
+    </w:p>
+    <w:tbl>
+      <w:tblPr>
+        <w:tblW w:type="auto" w:w="0"/>
+        <w:jc w:val="center"/>
+        <w:tblLook w:firstColumn="1" w:firstRow="1" w:lastColumn="0" w:lastRow="0" w:noHBand="0" w:noVBand="1" w:val="04A0"/>
+      </w:tblPr>
+      <w:tblGrid>
+        <w:gridCol w:w="9461"/>
+      </w:tblGrid>
+      <w:tr>
+        <w:tc>
+          <w:tcPr>
+            <w:tcW w:type="dxa" w:w="9360"/>
+            <w:shd w:fill="F0F9FF"/>
+            <w:tcMar>
+              <w:top w:w="100" w:type="dxa"/>
+              <w:bottom w:w="100" w:type="dxa"/>
+              <w:left w:w="150" w:type="dxa"/>
+              <w:right w:w="150" w:type="dxa"/>
+            </w:tcMar>
+            <w:tcBorders>
+              <w:left w:val="single" w:sz="24" w:space="0" w:color="0284C7"/>
+              <w:top w:val="none"/>
+              <w:right w:val="none"/>
+              <w:bottom w:val="none"/>
+            </w:tcBorders>
+          </w:tcPr>
+          <w:p>
+            <w:pPr>
+              <w:spacing w:after="40" w:line="276" w:lineRule="auto"/>
+            </w:pPr>
+            <w:r>
+              <w:rPr>
+                <w:rFonts w:ascii="Arial" w:hAnsi="Arial"/>
+                <w:b/>
+                <w:color w:val="0369A1"/>
+                <w:sz w:val="19"/>
+              </w:rPr>
+              <w:t>📌 Soal 4 (Konversi Biner 8-Bit)</w:t>
+              <w:br/>
+            </w:r>
+            <w:r>
+              <w:rPr>
+                <w:rFonts w:ascii="Arial" w:hAnsi="Arial"/>
+                <w:color w:val="0F172A"/>
+                <w:sz w:val="18"/>
+              </w:rPr>
+              <w:t>Berapa angka desimal dari bilangan biner 00101010?</w:t>
+              <w:br/>
+              <w:br/>
+              <w:t>Pilihan: A. 22 | B. 42 | C. 52 | D. 84</w:t>
+              <w:br/>
+              <w:t>Jawaban Benar: B (42)</w:t>
+              <w:br/>
+              <w:t>Pembahasan Ilmiah: Bobot biner: (0×128) + (0×64) + (1×32) + (0×16) + (1×8) + (0×4) + (1×2) + (0×1) = 32 + 8 + 2 = 42 desimal.</w:t>
+            </w:r>
+          </w:p>
+        </w:tc>
+      </w:tr>
+    </w:tbl>
+    <w:p>
+      <w:pPr>
+        <w:spacing w:after="80"/>
+      </w:pPr>
+    </w:p>
+    <w:tbl>
+      <w:tblPr>
+        <w:tblW w:type="auto" w:w="0"/>
+        <w:jc w:val="center"/>
+        <w:tblLook w:firstColumn="1" w:firstRow="1" w:lastColumn="0" w:lastRow="0" w:noHBand="0" w:noVBand="1" w:val="04A0"/>
+      </w:tblPr>
+      <w:tblGrid>
+        <w:gridCol w:w="9461"/>
+      </w:tblGrid>
+      <w:tr>
+        <w:tc>
+          <w:tcPr>
+            <w:tcW w:type="dxa" w:w="9360"/>
+            <w:shd w:fill="F0F9FF"/>
+            <w:tcMar>
+              <w:top w:w="100" w:type="dxa"/>
+              <w:bottom w:w="100" w:type="dxa"/>
+              <w:left w:w="150" w:type="dxa"/>
+              <w:right w:w="150" w:type="dxa"/>
+            </w:tcMar>
+            <w:tcBorders>
+              <w:left w:val="single" w:sz="24" w:space="0" w:color="0284C7"/>
+              <w:top w:val="none"/>
+              <w:right w:val="none"/>
+              <w:bottom w:val="none"/>
+            </w:tcBorders>
+          </w:tcPr>
+          <w:p>
+            <w:pPr>
+              <w:spacing w:after="40" w:line="276" w:lineRule="auto"/>
+            </w:pPr>
+            <w:r>
+              <w:rPr>
+                <w:rFonts w:ascii="Arial" w:hAnsi="Arial"/>
+                <w:b/>
+                <w:color w:val="0369A1"/>
+                <w:sz w:val="19"/>
+              </w:rPr>
+              <w:t>📌 Soal 5 (Model Warna RGB Aditif)</w:t>
+              <w:br/>
+            </w:r>
+            <w:r>
+              <w:rPr>
+                <w:rFonts w:ascii="Arial" w:hAnsi="Arial"/>
+                <w:color w:val="0F172A"/>
+                <w:sz w:val="18"/>
+              </w:rPr>
+              <w:t>Warna kuning di layar komputer dihasilkan dari campuran warna cahaya...</w:t>
+              <w:br/>
+              <w:br/>
+              <w:t>Pilihan: A. Merah + Biru | B. Merah + Hijau | C. Hijau + Biru | D. Merah + Hijau + Biru</w:t>
+              <w:br/>
+              <w:t>Jawaban Benar: B (Merah + Hijau)</w:t>
+              <w:br/>
+              <w:t>Pembahasan Ilmiah: Dalam model pencampuran warna cahaya aditif (RGB) pada monitor, sub-piksel Red (255) dipadukan dengan Green (255) menghasilkan warna Kuning (#FFFF00).</w:t>
+            </w:r>
+          </w:p>
+        </w:tc>
+      </w:tr>
+    </w:tbl>
+    <w:p>
+      <w:pPr>
+        <w:spacing w:after="80"/>
+      </w:pPr>
+    </w:p>
+    <w:p>
+      <w:pPr>
+        <w:keepNext/>
+        <w:spacing w:before="200" w:after="60"/>
+      </w:pPr>
+      <w:r>
+        <w:rPr>
+          <w:rFonts w:ascii="Arial" w:hAnsi="Arial"/>
+          <w:b/>
+          <w:color w:val="0284C7"/>
+          <w:sz w:val="22"/>
+        </w:rPr>
+        <w:t>6.2 Bagian B: Benar atau Salah (5 Soal — Bobot 30 Poin)</w:t>
       </w:r>
     </w:p>
     <w:p>
       <w:pPr>
-        <w:spacing w:after="80" w:line="276" w:lineRule="auto"/>
+        <w:pStyle w:val="ListBullet"/>
+        <w:spacing w:after="60" w:line="276" w:lineRule="auto"/>
       </w:pPr>
+      <w:r>
+        <w:rPr>
+          <w:rFonts w:ascii="Arial" w:hAnsi="Arial"/>
+          <w:b/>
+          <w:color w:val="0F2744"/>
+          <w:sz w:val="19"/>
+        </w:rPr>
+        <w:t xml:space="preserve">Pernyataan 1: </w:t>
+      </w:r>
       <w:r>
         <w:rPr>
           <w:rFonts w:ascii="Arial" w:hAnsi="Arial"/>
           <w:color w:val="1E293B"/>
           <w:sz w:val="19"/>
         </w:rPr>
-        <w:t>Lab Maya ini menerapkan scaffolding kognitif melalui panduan indikator langkah adaptif (Langkah 1 dari 5). Peserta didik yang baru pertama kali merakit komputer tidak akan merasa kewalahan karena sistem memberikan petunjuk visual yang jelas, drop-zone dengan highlight berkilau, dan pesan bimbingan kontekstual.</w:t>
+        <w:t>"CPU adalah komponen yang menyimpan data secara permanen."</w:t>
+        <w:br/>
+        <w:t>Kunci: SALAH — Pembahasan: CPU bertugas memproses instruksi, bukan menyimpan data arsip. Penyimpanan permanen dilakukan oleh SSD/HDD.</w:t>
+      </w:r>
+    </w:p>
+    <w:p>
+      <w:pPr>
+        <w:pStyle w:val="ListBullet"/>
+        <w:spacing w:after="60" w:line="276" w:lineRule="auto"/>
+      </w:pPr>
+      <w:r>
+        <w:rPr>
+          <w:rFonts w:ascii="Arial" w:hAnsi="Arial"/>
+          <w:b/>
+          <w:color w:val="0F2744"/>
+          <w:sz w:val="19"/>
+        </w:rPr>
+        <w:t xml:space="preserve">Pernyataan 2: </w:t>
+      </w:r>
+      <w:r>
+        <w:rPr>
+          <w:rFonts w:ascii="Arial" w:hAnsi="Arial"/>
+          <w:color w:val="1E293B"/>
+          <w:sz w:val="19"/>
+        </w:rPr>
+        <w:t>"RAM adalah memori volatil — datanya hilang saat komputer dimatikan."</w:t>
+        <w:br/>
+        <w:t>Kunci: BENAR — Pembahasan: Sifat dasar memori semikonduktor DRAM pada RAM membutuhkan pasokan daya listrik dinamis agar kapasitornya mempertahankan status bit.</w:t>
+      </w:r>
+    </w:p>
+    <w:p>
+      <w:pPr>
+        <w:pStyle w:val="ListBullet"/>
+        <w:spacing w:after="60" w:line="276" w:lineRule="auto"/>
+      </w:pPr>
+      <w:r>
+        <w:rPr>
+          <w:rFonts w:ascii="Arial" w:hAnsi="Arial"/>
+          <w:b/>
+          <w:color w:val="0F2744"/>
+          <w:sz w:val="19"/>
+        </w:rPr>
+        <w:t xml:space="preserve">Pernyataan 3: </w:t>
+      </w:r>
+      <w:r>
+        <w:rPr>
+          <w:rFonts w:ascii="Arial" w:hAnsi="Arial"/>
+          <w:color w:val="1E293B"/>
+          <w:sz w:val="19"/>
+        </w:rPr>
+        <w:t>"GPU hanya dibutuhkan untuk bermain game."</w:t>
+        <w:br/>
+        <w:t>Kunci: SALAH — Pembahasan: GPU (Graphics Processing Unit) bertugas merender seluruh antarmuka grafis sistem operasi, rendering video 3D, browser hardware acceleration, dan komputasi paralel.</w:t>
+      </w:r>
+    </w:p>
+    <w:p>
+      <w:pPr>
+        <w:pStyle w:val="ListBullet"/>
+        <w:spacing w:after="60" w:line="276" w:lineRule="auto"/>
+      </w:pPr>
+      <w:r>
+        <w:rPr>
+          <w:rFonts w:ascii="Arial" w:hAnsi="Arial"/>
+          <w:b/>
+          <w:color w:val="0F2744"/>
+          <w:sz w:val="19"/>
+        </w:rPr>
+        <w:t xml:space="preserve">Pernyataan 4: </w:t>
+      </w:r>
+      <w:r>
+        <w:rPr>
+          <w:rFonts w:ascii="Arial" w:hAnsi="Arial"/>
+          <w:color w:val="1E293B"/>
+          <w:sz w:val="19"/>
+        </w:rPr>
+        <w:t>"Bilangan biner 11111111 sama dengan angka desimal 255."</w:t>
+        <w:br/>
+        <w:t>Kunci: BENAR — Pembahasan: 128 + 64 + 32 + 16 + 8 + 4 + 2 + 1 = 255. Ini adalah angka desimal maksimum yang dapat ditampung oleh 1 byte (8 bit).</w:t>
+      </w:r>
+    </w:p>
+    <w:p>
+      <w:pPr>
+        <w:pStyle w:val="ListBullet"/>
+        <w:spacing w:after="60" w:line="276" w:lineRule="auto"/>
+      </w:pPr>
+      <w:r>
+        <w:rPr>
+          <w:rFonts w:ascii="Arial" w:hAnsi="Arial"/>
+          <w:b/>
+          <w:color w:val="0F2744"/>
+          <w:sz w:val="19"/>
+        </w:rPr>
+        <w:t xml:space="preserve">Pernyataan 5: </w:t>
+      </w:r>
+      <w:r>
+        <w:rPr>
+          <w:rFonts w:ascii="Arial" w:hAnsi="Arial"/>
+          <w:color w:val="1E293B"/>
+          <w:sz w:val="19"/>
+        </w:rPr>
+        <w:t>"Motherboard adalah komponen yang memasok daya listrik ke komputer."</w:t>
+        <w:br/>
+        <w:t>Kunci: SALAH — Pembahasan: Pemasok daya utama adalah PSU (Power Supply Unit). Motherboard hanya mendistribusikan daya dan menghubungkan bus sinyal data.</w:t>
       </w:r>
     </w:p>
     <w:p>
@@ -3043,7 +3802,7 @@
           <w:color w:val="0284C7"/>
           <w:sz w:val="22"/>
         </w:rPr>
-        <w:t>5.2 Umpan Balik Instan &amp; Konstruktif (Immediate Educational Feedback)</w:t>
+        <w:t>6.3 Bagian C: Menjodohkan Komponen &amp; Fungsinya (5 Pasang — Bobot 40 Poin)</w:t>
       </w:r>
     </w:p>
     <w:p>
@@ -3056,7 +3815,180 @@
           <w:color w:val="1E293B"/>
           <w:sz w:val="19"/>
         </w:rPr>
-        <w:t>Setiap interaksi pengguna langsung direspons dengan umpan balik multi-indera (visual dan audio):</w:t>
+        <w:t>Siswa menghubungkan kartu komponen di kolom kiri dengan definisi fungsinya di kolom kanan melalui interaksi klik dua titik beranimasi kabel:</w:t>
+      </w:r>
+    </w:p>
+    <w:p>
+      <w:pPr>
+        <w:pStyle w:val="ListBullet"/>
+        <w:spacing w:after="60" w:line="276" w:lineRule="auto"/>
+      </w:pPr>
+      <w:r>
+        <w:rPr>
+          <w:rFonts w:ascii="Arial" w:hAnsi="Arial"/>
+          <w:b/>
+          <w:color w:val="0F2744"/>
+          <w:sz w:val="19"/>
+        </w:rPr>
+        <w:t xml:space="preserve">1. </w:t>
+      </w:r>
+      <w:r>
+        <w:rPr>
+          <w:rFonts w:ascii="Arial" w:hAnsi="Arial"/>
+          <w:color w:val="1E293B"/>
+          <w:sz w:val="19"/>
+        </w:rPr>
+        <w:t>CPU ➔ Otak pemroses instruksi utama komputer (ALU + Control Unit).</w:t>
+      </w:r>
+    </w:p>
+    <w:p>
+      <w:pPr>
+        <w:pStyle w:val="ListBullet"/>
+        <w:spacing w:after="60" w:line="276" w:lineRule="auto"/>
+      </w:pPr>
+      <w:r>
+        <w:rPr>
+          <w:rFonts w:ascii="Arial" w:hAnsi="Arial"/>
+          <w:b/>
+          <w:color w:val="0F2744"/>
+          <w:sz w:val="19"/>
+        </w:rPr>
+        <w:t xml:space="preserve">2. </w:t>
+      </w:r>
+      <w:r>
+        <w:rPr>
+          <w:rFonts w:ascii="Arial" w:hAnsi="Arial"/>
+          <w:color w:val="1E293B"/>
+          <w:sz w:val="19"/>
+        </w:rPr>
+        <w:t>RAM ➔ Memori kerja sementara berkecepatan tinggi tempat instruksi aktif dimuat.</w:t>
+      </w:r>
+    </w:p>
+    <w:p>
+      <w:pPr>
+        <w:pStyle w:val="ListBullet"/>
+        <w:spacing w:after="60" w:line="276" w:lineRule="auto"/>
+      </w:pPr>
+      <w:r>
+        <w:rPr>
+          <w:rFonts w:ascii="Arial" w:hAnsi="Arial"/>
+          <w:b/>
+          <w:color w:val="0F2744"/>
+          <w:sz w:val="19"/>
+        </w:rPr>
+        <w:t xml:space="preserve">3. </w:t>
+      </w:r>
+      <w:r>
+        <w:rPr>
+          <w:rFonts w:ascii="Arial" w:hAnsi="Arial"/>
+          <w:color w:val="1E293B"/>
+          <w:sz w:val="19"/>
+        </w:rPr>
+        <w:t>SSD ➔ Menyimpan data, program aplikasi, dan berkas sistem operasi secara permanen.</w:t>
+      </w:r>
+    </w:p>
+    <w:p>
+      <w:pPr>
+        <w:pStyle w:val="ListBullet"/>
+        <w:spacing w:after="60" w:line="276" w:lineRule="auto"/>
+      </w:pPr>
+      <w:r>
+        <w:rPr>
+          <w:rFonts w:ascii="Arial" w:hAnsi="Arial"/>
+          <w:b/>
+          <w:color w:val="0F2744"/>
+          <w:sz w:val="19"/>
+        </w:rPr>
+        <w:t xml:space="preserve">4. </w:t>
+      </w:r>
+      <w:r>
+        <w:rPr>
+          <w:rFonts w:ascii="Arial" w:hAnsi="Arial"/>
+          <w:color w:val="1E293B"/>
+          <w:sz w:val="19"/>
+        </w:rPr>
+        <w:t>GPU ➔ Mengolah kalkulasi piksel dan menampilkan visual pada layar monitor.</w:t>
+      </w:r>
+    </w:p>
+    <w:p>
+      <w:pPr>
+        <w:pStyle w:val="ListBullet"/>
+        <w:spacing w:after="60" w:line="276" w:lineRule="auto"/>
+      </w:pPr>
+      <w:r>
+        <w:rPr>
+          <w:rFonts w:ascii="Arial" w:hAnsi="Arial"/>
+          <w:b/>
+          <w:color w:val="0F2744"/>
+          <w:sz w:val="19"/>
+        </w:rPr>
+        <w:t xml:space="preserve">5. </w:t>
+      </w:r>
+      <w:r>
+        <w:rPr>
+          <w:rFonts w:ascii="Arial" w:hAnsi="Arial"/>
+          <w:color w:val="1E293B"/>
+          <w:sz w:val="19"/>
+        </w:rPr>
+        <w:t>PSU ➔ Memasok dan mengonversi arus daya listrik AC ke DC bagi seluruh komponen.</w:t>
+      </w:r>
+    </w:p>
+    <w:p>
+      <w:pPr>
+        <w:keepNext/>
+        <w:spacing w:before="280" w:after="80"/>
+      </w:pPr>
+      <w:r>
+        <w:rPr>
+          <w:rFonts w:ascii="Arial" w:hAnsi="Arial"/>
+          <w:b/>
+          <w:color w:val="0F2744"/>
+          <w:sz w:val="26"/>
+        </w:rPr>
+        <w:t>BAB VII. FITUR PEDAGOGIS KHUSUS &amp; DIFERENSIASI</w:t>
+      </w:r>
+    </w:p>
+    <w:p>
+      <w:pPr>
+        <w:keepNext/>
+        <w:spacing w:before="200" w:after="60"/>
+      </w:pPr>
+      <w:r>
+        <w:rPr>
+          <w:rFonts w:ascii="Arial" w:hAnsi="Arial"/>
+          <w:b/>
+          <w:color w:val="0284C7"/>
+          <w:sz w:val="22"/>
+        </w:rPr>
+        <w:t>7.1 Scaffolding Pembelajaran Bertahap</w:t>
+      </w:r>
+    </w:p>
+    <w:p>
+      <w:pPr>
+        <w:spacing w:after="80" w:line="276" w:lineRule="auto"/>
+      </w:pPr>
+      <w:r>
+        <w:rPr>
+          <w:rFonts w:ascii="Arial" w:hAnsi="Arial"/>
+          <w:color w:val="1E293B"/>
+          <w:sz w:val="19"/>
+        </w:rPr>
+        <w:t>Lab Maya menerapkan teknik scaffolding kognitif melalui panduan stepper adaptif (Langkah 1 dari 5). Peserta didik yang baru pertama kali merakit komputer tidak akan merasa bingung karena sistem secara cerdas memberikan highlight soket sasaran, tooltip instruksi, dan konfirmasi visual seketika.</w:t>
+      </w:r>
+    </w:p>
+    <w:p>
+      <w:pPr>
+        <w:keepNext/>
+        <w:spacing w:before="200" w:after="60"/>
+      </w:pPr>
+      <w:r>
+        <w:rPr>
+          <w:rFonts w:ascii="Arial" w:hAnsi="Arial"/>
+          <w:b/>
+          <w:color w:val="0284C7"/>
+          <w:sz w:val="22"/>
+        </w:rPr>
+        <w:t>7.2 Umpan Balik Instan Multi-Indera (Immediate Feedback)</w:t>
       </w:r>
     </w:p>
     <w:p>
@@ -3079,7 +4011,7 @@
           <w:color w:val="1E293B"/>
           <w:sz w:val="19"/>
         </w:rPr>
-        <w:t>Komponen mengunci sempurna pada soket motherboard disertai efek suara mekanis klik presisi dan notifikasi konfirmasi hijau.</w:t>
+        <w:t>Komponen mengunci sempurna pada soket motherboard disertai efek nada mekanis D5-A5 dan badge konfirmasi hijau.</w:t>
       </w:r>
     </w:p>
     <w:p>
@@ -3094,7 +4026,7 @@
           <w:color w:val="0F2744"/>
           <w:sz w:val="19"/>
         </w:rPr>
-        <w:t xml:space="preserve">Pemasangan Salah / Distraktor: </w:t>
+        <w:t xml:space="preserve">Pemasangan Salah: </w:t>
       </w:r>
       <w:r>
         <w:rPr>
@@ -3102,7 +4034,7 @@
           <w:color w:val="1E293B"/>
           <w:sz w:val="19"/>
         </w:rPr>
-        <w:t>Komponen kembali ke rak semula disertai getaran visual (shake animation), nada peringatan lembut, dan pesan edukatif yang menjelaskan mengapa komponen tersebut tidak cocok pada soket target.</w:t>
+        <w:t>Komponen terpantul kembali ke rak disertai animasi getaran (shake), nada disonansi 150 Hz, serta dialog peringatan keselamatan yang menerangkan alasan inkompatibilitas.</w:t>
       </w:r>
     </w:p>
     <w:p>
@@ -3117,7 +4049,7 @@
           <w:color w:val="0284C7"/>
           <w:sz w:val="22"/>
         </w:rPr>
-        <w:t>5.3 Eksplorasi Skenario Masalah (Troubleshooting Mode)</w:t>
+        <w:t>7.3 Fitur Ekspor Cetak LKPD Ber-KOP Resmi</w:t>
       </w:r>
     </w:p>
     <w:p>
@@ -3130,7 +4062,7 @@
           <w:color w:val="1E293B"/>
           <w:sz w:val="19"/>
         </w:rPr>
-        <w:t>Sesuai amanat Juknis mengenai pentingnya fitur eksplorasi berbagai skenario, media ini menyediakan tombol '🔍 Uji Masalah'. Dalam mode ini, peserta didik disajikan komponen distraktor seperti RAM DDR2 lama atau Harddisk antarmuka IDE purba. Jika siswa mencoba memasangnya, sistem menampilkan dialog diagnostik yang menjelaskan ketidaksesuaian fisik (perbedaan notch RAM) dan perbedaan generasi teknologi.</w:t>
+        <w:t>Satu-satunya di kelasnya, Lab Maya ini menyediakan tombol '🖨️ Cetak' yang secara otomatis mengonversi hasil lembar kerja siswa menjadi dokumen cetak PDF ber-KOP resmi, lengkap dengan kotak skor nilai (0-100), predikat kelulusan (Sangat Baik / Baik / Cukup), dan kolom tanda tangan pengesahan guru pamong.</w:t>
       </w:r>
     </w:p>
     <w:p>
@@ -3145,20 +4077,7 @@
           <w:color w:val="0F2744"/>
           <w:sz w:val="26"/>
         </w:rPr>
-        <w:t>BAB VI. ARSITEKTUR TEKNIS &amp; KEPATUHAN JUKNIS</w:t>
-      </w:r>
-    </w:p>
-    <w:p>
-      <w:pPr>
-        <w:spacing w:after="80" w:line="276" w:lineRule="auto"/>
-      </w:pPr>
-      <w:r>
-        <w:rPr>
-          <w:rFonts w:ascii="Arial" w:hAnsi="Arial"/>
-          <w:color w:val="1E293B"/>
-          <w:sz w:val="19"/>
-        </w:rPr>
-        <w:t>Karya ini dirancang dengan standar rekayasa perangkat lunak edukasi yang tinggi demi memenuhi seluruh parameter penilaian sayembara:</w:t>
+        <w:t>BAB VIII. ARSITEKTUR TEKNIS &amp; KEPATUHAN JUKNIS</w:t>
       </w:r>
     </w:p>
     <w:p>
@@ -3173,7 +4092,7 @@
           <w:color w:val="0F2744"/>
           <w:sz w:val="19"/>
         </w:rPr>
-        <w:t xml:space="preserve">1. Arsitektur Single Page Application (SPA): </w:t>
+        <w:t xml:space="preserve">1. Arsitektur SPA Mandiri: </w:t>
       </w:r>
       <w:r>
         <w:rPr>
@@ -3181,7 +4100,7 @@
           <w:color w:val="1E293B"/>
           <w:sz w:val="19"/>
         </w:rPr>
-        <w:t>Seluruh media dirangkum dalam arsitektur SPA yang berjalan mulus tanpa reload halaman, menghasilkan transisi antar modul yang instan dan bebas lag.</w:t>
+        <w:t>Seluruh antarmuka dikemas dalam arsitektur Single Page Application (SPA) murni berbasis HTML5, CSS3, dan JavaScript standar tanpa framework luar.</w:t>
       </w:r>
     </w:p>
     <w:p>
@@ -3196,7 +4115,7 @@
           <w:color w:val="0F2744"/>
           <w:sz w:val="19"/>
         </w:rPr>
-        <w:t xml:space="preserve">2. Zero External CDN &amp; Dependensi Mandiri: </w:t>
+        <w:t xml:space="preserve">2. Zero External CDN: </w:t>
       </w:r>
       <w:r>
         <w:rPr>
@@ -3204,7 +4123,7 @@
           <w:color w:val="1E293B"/>
           <w:sz w:val="19"/>
         </w:rPr>
-        <w:t>Aplikasi beroperasi 100% secara offline. Seluruh jenis huruf lokal (Fredoka, Nunito, Poppins) dan pustaka ikon telah diunduh dan disimpan di direktori internal 'assets/fonts/'.</w:t>
+        <w:t>Aplikasi beroperasi 100% secara offline. Seluruh jenis huruf lokal (Fredoka, Nunito, Poppins) disimpan di direktori internal 'assets/fonts/'.</w:t>
       </w:r>
     </w:p>
     <w:p>
@@ -3219,7 +4138,7 @@
           <w:color w:val="0F2744"/>
           <w:sz w:val="19"/>
         </w:rPr>
-        <w:t xml:space="preserve">3. Web Audio Synthesis Engine: </w:t>
+        <w:t xml:space="preserve">3. Web Audio Synthesis: </w:t>
       </w:r>
       <w:r>
         <w:rPr>
@@ -3227,7 +4146,7 @@
           <w:color w:val="1E293B"/>
           <w:sz w:val="19"/>
         </w:rPr>
-        <w:t>Tidak mengandalkan rekaman audio MP3/WAV eksternal yang membebani memori, melainkan memanfaatkan Web Audio API bawaan peramban untuk menghasilkan frekuensi nada sintetis (beep BIOS, klik tombol, nada peringatan).</w:t>
+        <w:t>Tidak mengandalkan rekaman audio MP3 eksternal, melainkan memanfaatkan native Web Audio API untuk menghasilkan frekuensi gelombang suara sintetis.</w:t>
       </w:r>
     </w:p>
     <w:p>
@@ -3250,165 +4169,12 @@
           <w:color w:val="1E293B"/>
           <w:sz w:val="19"/>
         </w:rPr>
-        <w:t>Total ukuran direktori karya hanya berkisar 4,5 MB, sangat jauh di bawah batas maksimum Juknis (150 MB), sehingga sangat ringan untuk didistribusikan ke komputer sekolah berspesifikasi terbatas.</w:t>
-      </w:r>
-    </w:p>
-    <w:p>
-      <w:pPr>
-        <w:pStyle w:val="ListBullet"/>
-        <w:spacing w:after="60" w:line="276" w:lineRule="auto"/>
-      </w:pPr>
-      <w:r>
-        <w:rPr>
-          <w:rFonts w:ascii="Arial" w:hAnsi="Arial"/>
-          <w:b/>
-          <w:color w:val="0F2744"/>
-          <w:sz w:val="19"/>
-        </w:rPr>
-        <w:t xml:space="preserve">5. Rasio Layar 16:9 Adaptif: </w:t>
-      </w:r>
-      <w:r>
-        <w:rPr>
-          <w:rFonts w:ascii="Arial" w:hAnsi="Arial"/>
-          <w:color w:val="1E293B"/>
-          <w:sz w:val="19"/>
-        </w:rPr>
-        <w:t>Tampilan responsif dengan mempertahankan rasio aspek standar layar 16:9, menjamin keterbacaan optimal pada proyektor kelas, monitor PC lab, maupun layar laptop.</w:t>
-      </w:r>
-    </w:p>
-    <w:p>
-      <w:pPr>
-        <w:keepNext/>
-        <w:spacing w:before="280" w:after="80"/>
-      </w:pPr>
-      <w:r>
-        <w:rPr>
-          <w:rFonts w:ascii="Arial" w:hAnsi="Arial"/>
-          <w:b/>
-          <w:color w:val="0F2744"/>
-          <w:sz w:val="26"/>
-        </w:rPr>
-        <w:t>BAB VII. GLOSARIUM &amp; REFERENSI</w:t>
-      </w:r>
-    </w:p>
-    <w:p>
-      <w:pPr>
-        <w:pStyle w:val="ListBullet"/>
-        <w:spacing w:after="60" w:line="276" w:lineRule="auto"/>
-      </w:pPr>
-      <w:r>
-        <w:rPr>
-          <w:rFonts w:ascii="Arial" w:hAnsi="Arial"/>
-          <w:b/>
-          <w:color w:val="0F2744"/>
-          <w:sz w:val="19"/>
-        </w:rPr>
-        <w:t xml:space="preserve">CPU: </w:t>
-      </w:r>
-      <w:r>
-        <w:rPr>
-          <w:rFonts w:ascii="Arial" w:hAnsi="Arial"/>
-          <w:color w:val="1E293B"/>
-          <w:sz w:val="19"/>
-        </w:rPr>
-        <w:t>Central Processing Unit, otak utama komputer yang mengeksekusi instruksi program melalui siklus fetch-decode-execute.</w:t>
-      </w:r>
-    </w:p>
-    <w:p>
-      <w:pPr>
-        <w:pStyle w:val="ListBullet"/>
-        <w:spacing w:after="60" w:line="276" w:lineRule="auto"/>
-      </w:pPr>
-      <w:r>
-        <w:rPr>
-          <w:rFonts w:ascii="Arial" w:hAnsi="Arial"/>
-          <w:b/>
-          <w:color w:val="0F2744"/>
-          <w:sz w:val="19"/>
-        </w:rPr>
-        <w:t xml:space="preserve">Motherboard: </w:t>
-      </w:r>
-      <w:r>
-        <w:rPr>
-          <w:rFonts w:ascii="Arial" w:hAnsi="Arial"/>
-          <w:color w:val="1E293B"/>
-          <w:sz w:val="19"/>
-        </w:rPr>
-        <w:t>Papan sirkuit cetak utama tempat seluruh komponen hardware terhubung dan berkomunikasi satu sama lain.</w:t>
-      </w:r>
-    </w:p>
-    <w:p>
-      <w:pPr>
-        <w:pStyle w:val="ListBullet"/>
-        <w:spacing w:after="60" w:line="276" w:lineRule="auto"/>
-      </w:pPr>
-      <w:r>
-        <w:rPr>
-          <w:rFonts w:ascii="Arial" w:hAnsi="Arial"/>
-          <w:b/>
-          <w:color w:val="0F2744"/>
-          <w:sz w:val="19"/>
-        </w:rPr>
-        <w:t xml:space="preserve">RAM: </w:t>
-      </w:r>
-      <w:r>
-        <w:rPr>
-          <w:rFonts w:ascii="Arial" w:hAnsi="Arial"/>
-          <w:color w:val="1E293B"/>
-          <w:sz w:val="19"/>
-        </w:rPr>
-        <w:t>Random Access Memory, memori utama komputer berkecepatan tinggi yang bersifat volatile (data hilang saat listrik padam).</w:t>
-      </w:r>
-    </w:p>
-    <w:p>
-      <w:pPr>
-        <w:pStyle w:val="ListBullet"/>
-        <w:spacing w:after="60" w:line="276" w:lineRule="auto"/>
-      </w:pPr>
-      <w:r>
-        <w:rPr>
-          <w:rFonts w:ascii="Arial" w:hAnsi="Arial"/>
-          <w:b/>
-          <w:color w:val="0F2744"/>
-          <w:sz w:val="19"/>
-        </w:rPr>
-        <w:t xml:space="preserve">SSD NVMe M.2: </w:t>
-      </w:r>
-      <w:r>
-        <w:rPr>
-          <w:rFonts w:ascii="Arial" w:hAnsi="Arial"/>
-          <w:color w:val="1E293B"/>
-          <w:sz w:val="19"/>
-        </w:rPr>
-        <w:t>Solid State Drive dengan antarmuka Non-Volatile Memory Express yang terpasang pada slot M.2 dengan kecepatan transfer gigabit per detik.</w:t>
-      </w:r>
-    </w:p>
-    <w:p>
-      <w:pPr>
-        <w:pStyle w:val="ListBullet"/>
-        <w:spacing w:after="60" w:line="276" w:lineRule="auto"/>
-      </w:pPr>
-      <w:r>
-        <w:rPr>
-          <w:rFonts w:ascii="Arial" w:hAnsi="Arial"/>
-          <w:b/>
-          <w:color w:val="0F2744"/>
-          <w:sz w:val="19"/>
-        </w:rPr>
-        <w:t xml:space="preserve">POST BIOS: </w:t>
-      </w:r>
-      <w:r>
-        <w:rPr>
-          <w:rFonts w:ascii="Arial" w:hAnsi="Arial"/>
-          <w:color w:val="1E293B"/>
-          <w:sz w:val="19"/>
-        </w:rPr>
-        <w:t>Power-On Self-Test, rutinitas diagnostik yang dijalankan firmware BIOS saat komputer pertama kali dinyalakan untuk memeriksa kesiapan hardware.</w:t>
+        <w:t>Total ukuran direktori karya hanya berkisar 4,5 MB (sangat jauh di bawah ambang batas 150 MB pada Juknis), sehingga sangat ringan untuk didistribusikan ke sekolah.</w:t>
       </w:r>
     </w:p>
     <w:sectPr>
-      <w:pgSz w:w="12240" w:h="15840"/>
-      <w:pgMar w:top="1440" w:right="1440" w:bottom="1440" w:left="1440" w:header="720" w:footer="720" w:gutter="0"/>
+      <w:pgSz w:w="11909" w:h="16834"/>
+      <w:pgMar w:top="1152" w:right="1224" w:bottom="1152" w:left="1224" w:header="720" w:footer="720" w:gutter="0"/>
       <w:cols w:space="720"/>
       <w:docGrid w:linePitch="360"/>
     </w:sectPr>

</xml_diff>

<commit_message>
docs: align Lab Maya title to 'Lab Perakitan Komputer' and clean up redundant markdown files having docx counterparts
</commit_message>
<xml_diff>
--- a/lab/lab-maya/perakitan-komputer/SIAP KIRIM/PANDUAN_PENGGUNAAN_DAN_DESKRIPSI_TEKNIS.docx
+++ b/lab/lab-maya/perakitan-komputer/SIAP KIRIM/PANDUAN_PENGGUNAAN_DAN_DESKRIPSI_TEKNIS.docx
@@ -56,9 +56,9 @@
                 <w:color w:val="E2E8F0"/>
                 <w:sz w:val="22"/>
               </w:rPr>
-              <w:t>LABORATORIUM MAYA SISTEM KOMPUTER:</w:t>
+              <w:t>LABORATORIUM MAYA:</w:t>
               <w:br/>
-              <w:t>SIMULASI PERAKITAN PC, DIAGNOSTIK HARDWARE &amp; LOGIKA DIGITAL</w:t>
+              <w:t>LAB PERAKITAN KOMPUTER</w:t>
             </w:r>
           </w:p>
         </w:tc>
@@ -618,7 +618,7 @@
                 <w:color w:val="334155"/>
                 <w:sz w:val="18"/>
               </w:rPr>
-              <w:t>Lab Maya Sistem Komputer: Perakitan PC &amp; Logika Digital</w:t>
+              <w:t>Lab Perakitan Komputer</w:t>
             </w:r>
           </w:p>
         </w:tc>
@@ -751,7 +751,7 @@
           <w:color w:val="1E293B"/>
           <w:sz w:val="19"/>
         </w:rPr>
-        <w:t>Menjawab tantangan tersebut, dikembangkan karya inovasi 'Lab Maya Sistem Komputer: Perakitan PC, Diagnostik Hardware &amp; Logika Digital'. Media ini dirancang sebagai laboratorium virtual berbasis peramban (Single Page Application) yang menyediakan representasi interaktif, presisi, dan aman dari arsitektur komputer modern. Peserta didik dapat bereksperimen membongkar dan merakit PC secara virtual, menguji skenario inkompatibilitas komponen tanpa risiko kerusakan fisik, menyaksikan proses booting BIOS dan Power-On Self-Test (POST) secara visual-auditori, hingga menjelajahi logika digital abstrak (bit biner, pencampuran warna RGB 24-bit, dan gerbang logika).</w:t>
+        <w:t>Menjawab tantangan tersebut, dikembangkan karya inovasi 'Lab Perakitan Komputer'. Media ini dirancang sebagai laboratorium maya berbasis peramban (Single Page Application) yang menyediakan representasi interaktif, presisi, dan aman dari arsitektur komputer modern. Peserta didik dapat bereksperimen membongkar dan merakit PC secara virtual, menguji skenario inkompatibilitas komponen tanpa risiko kerusakan fisik, menyaksikan proses booting BIOS dan Power-On Self-Test (POST) secara visual-auditori, hingga menjelajahi logika digital abstrak (bit biner, pencampuran warna RGB 24-bit, dan gerbang logika).</w:t>
       </w:r>
     </w:p>
     <w:tbl>

</xml_diff>